<commit_message>
Kafka-Appell: Testauswertung + Rechtschreibtraining (Schnipsel mit Sätzen), Kafka nach AVIVA, Arbeitsblatt nach Muster der Mentorin
Co-Authored-By: Claude Opus 5.5 <noreply@anthropic.com>
Claude-Session: https://claude.ai/code/session_01Kzh1oWiqhC6W8oSNq8mKnj
</commit_message>
<xml_diff>
--- a/Deutsch_11/Kafka_Appell/Arbeitsblatt_Kafkas_Appell.docx
+++ b/Deutsch_11/Kafka_Appell/Arbeitsblatt_Kafkas_Appell.docx
@@ -4,23 +4,7 @@
   <w:body>
     <w:p>
       <w:pPr>
-        <w:spacing w:after="20" w:before="0"/>
-      </w:pPr>
-      <w:r>
-        <w:rPr>
-          <w:rFonts w:ascii="Calibri" w:cs="Calibri" w:eastAsia="Calibri" w:hAnsi="Calibri"/>
-          <w:b/>
-          <w:bCs/>
-          <w:color w:val="5B6B8C"/>
-          <w:sz w:val="17"/>
-          <w:szCs w:val="17"/>
-        </w:rPr>
-        <w:t xml:space="preserve">FRANZ KAFKA: „BRIEF AN DEN VATER“ (1919)</w:t>
-      </w:r>
-    </w:p>
-    <w:p>
-      <w:pPr>
-        <w:spacing w:after="140" w:before="0"/>
+        <w:spacing w:after="60" w:before="0"/>
       </w:pPr>
       <w:r>
         <w:rPr>
@@ -28,10 +12,80 @@
           <w:b/>
           <w:bCs/>
           <w:color w:val="1E2761"/>
-          <w:sz w:val="40"/>
-          <w:szCs w:val="40"/>
-        </w:rPr>
-        <w:t xml:space="preserve">Worum bittet Kafka?</w:t>
+          <w:sz w:val="32"/>
+          <w:szCs w:val="32"/>
+        </w:rPr>
+        <w:t xml:space="preserve">Arbeitsblatt: Die Ebene des Appells in Kafkas „Brief an den Vater“</w:t>
+      </w:r>
+    </w:p>
+    <w:p>
+      <w:pPr>
+        <w:spacing w:after="30" w:before="0"/>
+      </w:pPr>
+      <w:r>
+        <w:rPr>
+          <w:rFonts w:ascii="Calibri" w:cs="Calibri" w:eastAsia="Calibri" w:hAnsi="Calibri"/>
+          <w:b/>
+          <w:bCs/>
+          <w:color w:val="000000"/>
+          <w:sz w:val="20"/>
+          <w:szCs w:val="20"/>
+        </w:rPr>
+        <w:t xml:space="preserve">Thema: </w:t>
+      </w:r>
+      <w:r>
+        <w:rPr>
+          <w:rFonts w:ascii="Calibri" w:cs="Calibri" w:eastAsia="Calibri" w:hAnsi="Calibri"/>
+          <w:color w:val="000000"/>
+          <w:sz w:val="20"/>
+          <w:szCs w:val="20"/>
+        </w:rPr>
+        <w:t xml:space="preserve">Das Vier-Ohren-Modell nach Friedemann Schulz von Thun mit Fokus auf den </w:t>
+      </w:r>
+      <w:r>
+        <w:rPr>
+          <w:rFonts w:ascii="Calibri" w:cs="Calibri" w:eastAsia="Calibri" w:hAnsi="Calibri"/>
+          <w:b/>
+          <w:bCs/>
+          <w:color w:val="000000"/>
+          <w:sz w:val="20"/>
+          <w:szCs w:val="20"/>
+        </w:rPr>
+        <w:t xml:space="preserve">Appell</w:t>
+      </w:r>
+      <w:r>
+        <w:rPr>
+          <w:rFonts w:ascii="Calibri" w:cs="Calibri" w:eastAsia="Calibri" w:hAnsi="Calibri"/>
+          <w:color w:val="000000"/>
+          <w:sz w:val="20"/>
+          <w:szCs w:val="20"/>
+        </w:rPr>
+        <w:t xml:space="preserve"> (Wozu will ich dich bringen?)</w:t>
+      </w:r>
+    </w:p>
+    <w:p>
+      <w:pPr>
+        <w:spacing w:after="160" w:before="0"/>
+      </w:pPr>
+      <w:r>
+        <w:rPr>
+          <w:rFonts w:ascii="Calibri" w:cs="Calibri" w:eastAsia="Calibri" w:hAnsi="Calibri"/>
+          <w:b/>
+          <w:bCs/>
+          <w:color w:val="000000"/>
+          <w:sz w:val="20"/>
+          <w:szCs w:val="20"/>
+        </w:rPr>
+        <w:t xml:space="preserve">Ziel: </w:t>
+      </w:r>
+      <w:r>
+        <w:rPr>
+          <w:rFonts w:ascii="Calibri" w:cs="Calibri" w:eastAsia="Calibri" w:hAnsi="Calibri"/>
+          <w:color w:val="000000"/>
+          <w:sz w:val="20"/>
+          <w:szCs w:val="20"/>
+        </w:rPr>
+        <w:t xml:space="preserve">Analyse der offenen und verdeckten Appelle, die Franz Kafka an seinen Vater richtet.</w:t>
       </w:r>
     </w:p>
     <w:tbl>
@@ -73,7 +127,7 @@
           </w:tcPr>
           <w:p>
             <w:pPr>
-              <w:spacing w:after="40" w:before="0"/>
+              <w:spacing w:after="50" w:before="0"/>
             </w:pPr>
             <w:r>
               <w:rPr>
@@ -84,21 +138,51 @@
                 <w:sz w:val="22"/>
                 <w:szCs w:val="22"/>
               </w:rPr>
-              <w:t xml:space="preserve">Kontext</w:t>
-            </w:r>
-          </w:p>
-          <w:p>
-            <w:pPr>
-              <w:spacing w:after="0" w:before="0" w:line="300"/>
+              <w:t xml:space="preserve">Kontext-Box (Brücke zur Biografie)</w:t>
+            </w:r>
+          </w:p>
+          <w:p>
+            <w:pPr>
+              <w:spacing w:after="80" w:before="0" w:line="290"/>
             </w:pPr>
             <w:r>
               <w:rPr>
                 <w:rFonts w:ascii="Calibri" w:cs="Calibri" w:eastAsia="Calibri" w:hAnsi="Calibri"/>
                 <w:color w:val="000000"/>
-                <w:sz w:val="22"/>
-                <w:szCs w:val="22"/>
-              </w:rPr>
-              <w:t xml:space="preserve">Franz Kafka (1883–1924) schrieb 1919 mit 36 Jahren einen über 100 Seiten langen Brief an seinen Vater Hermann, einen erfolgreichen, lauten und bestimmenden Kaufmann. Vor ihm fühlte sich der Sohn klein und verstummte oft. Den Brief gab Kafka seiner Mutter – sie reichte ihn nie weiter.</w:t>
+                <w:sz w:val="21"/>
+                <w:szCs w:val="21"/>
+              </w:rPr>
+              <w:t xml:space="preserve">Franz Kafka (1883–1924) schrieb 1919 mit 36 Jahren einen über 100 Seiten langen Brief an seinen Vater Hermann, einen erfolgreichen, lauten und bestimmenden Kaufmann. Vor ihm fühlte sich der Sohn klein und verstummte oft. Kafka wollte mit dem Brief erreichen, dass sich die Beziehung bessert. Den Brief gab er seiner Mutter – sie reichte ihn nie weiter.</w:t>
+            </w:r>
+          </w:p>
+          <w:p>
+            <w:pPr>
+              <w:spacing w:after="10" w:before="0"/>
+            </w:pPr>
+            <w:r>
+              <w:rPr>
+                <w:rFonts w:ascii="Cambria" w:cs="Cambria" w:eastAsia="Cambria" w:hAnsi="Cambria"/>
+                <w:i/>
+                <w:iCs/>
+                <w:color w:val="000000"/>
+                <w:sz w:val="21"/>
+                <w:szCs w:val="21"/>
+              </w:rPr>
+              <w:t xml:space="preserve">„… daß es uns beide ein wenig beruhigen und Leben und Sterben leichter machen kann.“</w:t>
+            </w:r>
+          </w:p>
+          <w:p>
+            <w:pPr>
+              <w:spacing w:after="0" w:before="0"/>
+            </w:pPr>
+            <w:r>
+              <w:rPr>
+                <w:rFonts w:ascii="Calibri" w:cs="Calibri" w:eastAsia="Calibri" w:hAnsi="Calibri"/>
+                <w:color w:val="5B6B8C"/>
+                <w:sz w:val="18"/>
+                <w:szCs w:val="18"/>
+              </w:rPr>
+              <w:t xml:space="preserve">– Franz Kafka, letzter Satz des Briefs (S. 20)</w:t>
             </w:r>
           </w:p>
         </w:tc>
@@ -106,7 +190,24 @@
     </w:tbl>
     <w:p>
       <w:pPr>
-        <w:spacing w:after="160" w:before="100"/>
+        <w:keepNext/>
+        <w:spacing w:after="80" w:before="200"/>
+      </w:pPr>
+      <w:r>
+        <w:rPr>
+          <w:rFonts w:ascii="Cambria" w:cs="Cambria" w:eastAsia="Cambria" w:hAnsi="Cambria"/>
+          <w:b/>
+          <w:bCs/>
+          <w:color w:val="1E2761"/>
+          <w:sz w:val="26"/>
+          <w:szCs w:val="26"/>
+        </w:rPr>
+        <w:t xml:space="preserve">1. Textauszug</w:t>
+      </w:r>
+    </w:p>
+    <w:p>
+      <w:pPr>
+        <w:spacing w:after="100" w:before="0"/>
       </w:pPr>
       <w:r>
         <w:rPr>
@@ -117,7 +218,7 @@
           <w:sz w:val="17"/>
           <w:szCs w:val="17"/>
         </w:rPr>
-        <w:t xml:space="preserve">Der Text steht in der Rechtschreibung vor 1996: daß = dass, mußte = musste, gewiß = gewiss.</w:t>
+        <w:t xml:space="preserve">Rechtschreibung vor 1996: daß = dass, mußte = musste · […] = Auslassung</w:t>
       </w:r>
     </w:p>
     <w:tbl>
@@ -198,8 +299,8 @@
               <w:rPr>
                 <w:rFonts w:ascii="Cambria" w:cs="Cambria" w:eastAsia="Cambria" w:hAnsi="Cambria"/>
                 <w:color w:val="000000"/>
-                <w:sz w:val="25"/>
-                <w:szCs w:val="25"/>
+                <w:sz w:val="24"/>
+                <w:szCs w:val="24"/>
               </w:rPr>
               <w:t xml:space="preserve">Wobei ich Dich aber immerfort</w:t>
             </w:r>
@@ -209,8 +310,8 @@
                 <w:b/>
                 <w:bCs/>
                 <w:color w:val="3F7CC4"/>
-                <w:sz w:val="25"/>
-                <w:szCs w:val="25"/>
+                <w:sz w:val="24"/>
+                <w:szCs w:val="24"/>
                 <w:vertAlign w:val="superscript"/>
               </w:rPr>
               <w:t xml:space="preserve">1</w:t>
@@ -219,8 +320,8 @@
               <w:rPr>
                 <w:rFonts w:ascii="Cambria" w:cs="Cambria" w:eastAsia="Cambria" w:hAnsi="Cambria"/>
                 <w:color w:val="000000"/>
-                <w:sz w:val="25"/>
-                <w:szCs w:val="25"/>
+                <w:sz w:val="24"/>
+                <w:szCs w:val="24"/>
               </w:rPr>
               <w:t xml:space="preserve"> bitte, nicht zu vergessen, daß ich</w:t>
             </w:r>
@@ -289,8 +390,8 @@
               <w:rPr>
                 <w:rFonts w:ascii="Cambria" w:cs="Cambria" w:eastAsia="Cambria" w:hAnsi="Cambria"/>
                 <w:color w:val="000000"/>
-                <w:sz w:val="25"/>
-                <w:szCs w:val="25"/>
+                <w:sz w:val="24"/>
+                <w:szCs w:val="24"/>
               </w:rPr>
               <w:t xml:space="preserve">niemals im entferntesten an eine Schuld Deinerseits</w:t>
             </w:r>
@@ -300,8 +401,8 @@
                 <w:b/>
                 <w:bCs/>
                 <w:color w:val="3F7CC4"/>
-                <w:sz w:val="25"/>
-                <w:szCs w:val="25"/>
+                <w:sz w:val="24"/>
+                <w:szCs w:val="24"/>
                 <w:vertAlign w:val="superscript"/>
               </w:rPr>
               <w:t xml:space="preserve">2</w:t>
@@ -310,8 +411,8 @@
               <w:rPr>
                 <w:rFonts w:ascii="Cambria" w:cs="Cambria" w:eastAsia="Cambria" w:hAnsi="Cambria"/>
                 <w:color w:val="000000"/>
-                <w:sz w:val="25"/>
-                <w:szCs w:val="25"/>
+                <w:sz w:val="24"/>
+                <w:szCs w:val="24"/>
               </w:rPr>
               <w:t xml:space="preserve"> glaube. Du</w:t>
             </w:r>
@@ -380,8 +481,8 @@
               <w:rPr>
                 <w:rFonts w:ascii="Cambria" w:cs="Cambria" w:eastAsia="Cambria" w:hAnsi="Cambria"/>
                 <w:color w:val="000000"/>
-                <w:sz w:val="25"/>
-                <w:szCs w:val="25"/>
+                <w:sz w:val="24"/>
+                <w:szCs w:val="24"/>
               </w:rPr>
               <w:t xml:space="preserve">wirktest so auf mich, wie Du wirken mußtest, nur sollst Du aufhören,</w:t>
             </w:r>
@@ -450,8 +551,8 @@
               <w:rPr>
                 <w:rFonts w:ascii="Cambria" w:cs="Cambria" w:eastAsia="Cambria" w:hAnsi="Cambria"/>
                 <w:color w:val="000000"/>
-                <w:sz w:val="25"/>
-                <w:szCs w:val="25"/>
+                <w:sz w:val="24"/>
+                <w:szCs w:val="24"/>
               </w:rPr>
               <w:t xml:space="preserve">es für eine besondere Bosheit</w:t>
             </w:r>
@@ -461,8 +562,8 @@
                 <w:b/>
                 <w:bCs/>
                 <w:color w:val="3F7CC4"/>
-                <w:sz w:val="25"/>
-                <w:szCs w:val="25"/>
+                <w:sz w:val="24"/>
+                <w:szCs w:val="24"/>
                 <w:vertAlign w:val="superscript"/>
               </w:rPr>
               <w:t xml:space="preserve">3</w:t>
@@ -471,8 +572,8 @@
               <w:rPr>
                 <w:rFonts w:ascii="Cambria" w:cs="Cambria" w:eastAsia="Cambria" w:hAnsi="Cambria"/>
                 <w:color w:val="000000"/>
-                <w:sz w:val="25"/>
-                <w:szCs w:val="25"/>
+                <w:sz w:val="24"/>
+                <w:szCs w:val="24"/>
               </w:rPr>
               <w:t xml:space="preserve"> meinerseits zu halten, daß ich dieser</w:t>
             </w:r>
@@ -541,8 +642,8 @@
               <w:rPr>
                 <w:rFonts w:ascii="Cambria" w:cs="Cambria" w:eastAsia="Cambria" w:hAnsi="Cambria"/>
                 <w:color w:val="000000"/>
-                <w:sz w:val="25"/>
-                <w:szCs w:val="25"/>
+                <w:sz w:val="24"/>
+                <w:szCs w:val="24"/>
               </w:rPr>
               <w:t xml:space="preserve">Wirkung erlegen</w:t>
             </w:r>
@@ -552,8 +653,8 @@
                 <w:b/>
                 <w:bCs/>
                 <w:color w:val="3F7CC4"/>
-                <w:sz w:val="25"/>
-                <w:szCs w:val="25"/>
+                <w:sz w:val="24"/>
+                <w:szCs w:val="24"/>
                 <w:vertAlign w:val="superscript"/>
               </w:rPr>
               <w:t xml:space="preserve">4</w:t>
@@ -562,10 +663,10 @@
               <w:rPr>
                 <w:rFonts w:ascii="Cambria" w:cs="Cambria" w:eastAsia="Cambria" w:hAnsi="Cambria"/>
                 <w:color w:val="000000"/>
-                <w:sz w:val="25"/>
-                <w:szCs w:val="25"/>
-              </w:rPr>
-              <w:t xml:space="preserve"> bin. Ich war ein ängstliches Kind; trotzdem war ich</w:t>
+                <w:sz w:val="24"/>
+                <w:szCs w:val="24"/>
+              </w:rPr>
+              <w:t xml:space="preserve"> bin. […] ich kann nicht glauben, daß ein freundliches</w:t>
             </w:r>
           </w:p>
         </w:tc>
@@ -632,31 +733,10 @@
               <w:rPr>
                 <w:rFonts w:ascii="Cambria" w:cs="Cambria" w:eastAsia="Cambria" w:hAnsi="Cambria"/>
                 <w:color w:val="000000"/>
-                <w:sz w:val="25"/>
-                <w:szCs w:val="25"/>
-              </w:rPr>
-              <w:t xml:space="preserve">gewiß auch störrisch</w:t>
-            </w:r>
-            <w:r>
-              <w:rPr>
-                <w:rFonts w:ascii="Calibri" w:cs="Calibri" w:eastAsia="Calibri" w:hAnsi="Calibri"/>
-                <w:b/>
-                <w:bCs/>
-                <w:color w:val="3F7CC4"/>
-                <w:sz w:val="25"/>
-                <w:szCs w:val="25"/>
-                <w:vertAlign w:val="superscript"/>
-              </w:rPr>
-              <w:t xml:space="preserve">5</w:t>
-            </w:r>
-            <w:r>
-              <w:rPr>
-                <w:rFonts w:ascii="Cambria" w:cs="Cambria" w:eastAsia="Cambria" w:hAnsi="Cambria"/>
-                <w:color w:val="000000"/>
-                <w:sz w:val="25"/>
-                <w:szCs w:val="25"/>
-              </w:rPr>
-              <w:t xml:space="preserve">, wie Kinder sind; gewiß verwöhnte mich die Mutter</w:t>
+                <w:sz w:val="24"/>
+                <w:szCs w:val="24"/>
+              </w:rPr>
+              <w:t xml:space="preserve">Wort, ein stilles Bei-der-Hand-Nehmen, ein guter Blick mir nicht alles</w:t>
             </w:r>
           </w:p>
         </w:tc>
@@ -723,10 +803,10 @@
               <w:rPr>
                 <w:rFonts w:ascii="Cambria" w:cs="Cambria" w:eastAsia="Cambria" w:hAnsi="Cambria"/>
                 <w:color w:val="000000"/>
-                <w:sz w:val="25"/>
-                <w:szCs w:val="25"/>
-              </w:rPr>
-              <w:t xml:space="preserve">auch, aber ich kann nicht glauben, daß ich besonders schwer lenkbar</w:t>
+                <w:sz w:val="24"/>
+                <w:szCs w:val="24"/>
+              </w:rPr>
+              <w:t xml:space="preserve">hätten abfordern</w:t>
             </w:r>
             <w:r>
               <w:rPr>
@@ -734,251 +814,20 @@
                 <w:b/>
                 <w:bCs/>
                 <w:color w:val="3F7CC4"/>
-                <w:sz w:val="25"/>
-                <w:szCs w:val="25"/>
+                <w:sz w:val="24"/>
+                <w:szCs w:val="24"/>
                 <w:vertAlign w:val="superscript"/>
               </w:rPr>
-              <w:t xml:space="preserve">6</w:t>
+              <w:t xml:space="preserve">5</w:t>
             </w:r>
             <w:r>
               <w:rPr>
                 <w:rFonts w:ascii="Cambria" w:cs="Cambria" w:eastAsia="Cambria" w:hAnsi="Cambria"/>
                 <w:color w:val="000000"/>
-                <w:sz w:val="25"/>
-                <w:szCs w:val="25"/>
-              </w:rPr>
-              <w:t xml:space="preserve"/>
-            </w:r>
-          </w:p>
-        </w:tc>
-      </w:tr>
-      <w:tr>
-        <w:trPr>
-          <w:cantSplit/>
-        </w:trPr>
-        <w:tc>
-          <w:tcPr>
-            <w:tcW w:type="dxa" w:w="520"/>
-            <w:tcBorders>
-              <w:top w:val="none" w:color="FFFFFF" w:sz="0"/>
-              <w:left w:val="none" w:color="FFFFFF" w:sz="0"/>
-              <w:bottom w:val="none" w:color="FFFFFF" w:sz="0"/>
-              <w:right w:val="single" w:color="3F7CC4" w:sz="10"/>
-            </w:tcBorders>
-            <w:tcMar>
-              <w:top w:type="dxa" w:w="6"/>
-              <w:left w:type="dxa" w:w="80"/>
-              <w:bottom w:type="dxa" w:w="6"/>
-              <w:right w:type="dxa" w:w="80"/>
-            </w:tcMar>
-            <w:vAlign w:val="center"/>
-          </w:tcPr>
-          <w:p>
-            <w:pPr>
-              <w:spacing w:after="0" w:before="0"/>
-              <w:jc w:val="right"/>
-            </w:pPr>
-            <w:r>
-              <w:rPr>
-                <w:rFonts w:ascii="Calibri" w:cs="Calibri" w:eastAsia="Calibri" w:hAnsi="Calibri"/>
-                <w:color w:val="5B6B8C"/>
-                <w:sz w:val="16"/>
-                <w:szCs w:val="16"/>
-              </w:rPr>
-              <w:t xml:space="preserve">8</w:t>
-            </w:r>
-          </w:p>
-        </w:tc>
-        <w:tc>
-          <w:tcPr>
-            <w:tcW w:type="dxa" w:w="9686"/>
-            <w:tcBorders>
-              <w:top w:val="none" w:color="FFFFFF" w:sz="0"/>
-              <w:left w:val="none" w:color="FFFFFF" w:sz="0"/>
-              <w:bottom w:val="none" w:color="FFFFFF" w:sz="0"/>
-              <w:right w:val="none" w:color="FFFFFF" w:sz="0"/>
-            </w:tcBorders>
-            <w:tcMar>
-              <w:top w:type="dxa" w:w="6"/>
-              <w:left w:type="dxa" w:w="140"/>
-              <w:bottom w:type="dxa" w:w="6"/>
-              <w:right w:type="dxa" w:w="140"/>
-            </w:tcMar>
-            <w:vAlign w:val="top"/>
-          </w:tcPr>
-          <w:p>
-            <w:pPr>
-              <w:spacing w:after="0" w:before="0" w:line="360"/>
-            </w:pPr>
-            <w:r>
-              <w:rPr>
-                <w:rFonts w:ascii="Cambria" w:cs="Cambria" w:eastAsia="Cambria" w:hAnsi="Cambria"/>
-                <w:color w:val="000000"/>
-                <w:sz w:val="25"/>
-                <w:szCs w:val="25"/>
-              </w:rPr>
-              <w:t xml:space="preserve">war, ich kann nicht glauben, daß ein freundliches Wort, ein stilles</w:t>
-            </w:r>
-          </w:p>
-        </w:tc>
-      </w:tr>
-      <w:tr>
-        <w:trPr>
-          <w:cantSplit/>
-        </w:trPr>
-        <w:tc>
-          <w:tcPr>
-            <w:tcW w:type="dxa" w:w="520"/>
-            <w:tcBorders>
-              <w:top w:val="none" w:color="FFFFFF" w:sz="0"/>
-              <w:left w:val="none" w:color="FFFFFF" w:sz="0"/>
-              <w:bottom w:val="none" w:color="FFFFFF" w:sz="0"/>
-              <w:right w:val="single" w:color="3F7CC4" w:sz="10"/>
-            </w:tcBorders>
-            <w:tcMar>
-              <w:top w:type="dxa" w:w="6"/>
-              <w:left w:type="dxa" w:w="80"/>
-              <w:bottom w:type="dxa" w:w="6"/>
-              <w:right w:type="dxa" w:w="80"/>
-            </w:tcMar>
-            <w:vAlign w:val="center"/>
-          </w:tcPr>
-          <w:p>
-            <w:pPr>
-              <w:spacing w:after="0" w:before="0"/>
-              <w:jc w:val="right"/>
-            </w:pPr>
-            <w:r>
-              <w:rPr>
-                <w:rFonts w:ascii="Calibri" w:cs="Calibri" w:eastAsia="Calibri" w:hAnsi="Calibri"/>
-                <w:color w:val="5B6B8C"/>
-                <w:sz w:val="16"/>
-                <w:szCs w:val="16"/>
-              </w:rPr>
-              <w:t xml:space="preserve">9</w:t>
-            </w:r>
-          </w:p>
-        </w:tc>
-        <w:tc>
-          <w:tcPr>
-            <w:tcW w:type="dxa" w:w="9686"/>
-            <w:tcBorders>
-              <w:top w:val="none" w:color="FFFFFF" w:sz="0"/>
-              <w:left w:val="none" w:color="FFFFFF" w:sz="0"/>
-              <w:bottom w:val="none" w:color="FFFFFF" w:sz="0"/>
-              <w:right w:val="none" w:color="FFFFFF" w:sz="0"/>
-            </w:tcBorders>
-            <w:tcMar>
-              <w:top w:type="dxa" w:w="6"/>
-              <w:left w:type="dxa" w:w="140"/>
-              <w:bottom w:type="dxa" w:w="6"/>
-              <w:right w:type="dxa" w:w="140"/>
-            </w:tcMar>
-            <w:vAlign w:val="top"/>
-          </w:tcPr>
-          <w:p>
-            <w:pPr>
-              <w:spacing w:after="0" w:before="0" w:line="360"/>
-            </w:pPr>
-            <w:r>
-              <w:rPr>
-                <w:rFonts w:ascii="Cambria" w:cs="Cambria" w:eastAsia="Cambria" w:hAnsi="Cambria"/>
-                <w:color w:val="000000"/>
-                <w:sz w:val="25"/>
-                <w:szCs w:val="25"/>
-              </w:rPr>
-              <w:t xml:space="preserve">Bei-der-Hand-Nehmen, ein guter Blick mir nicht alles hätten abfordern</w:t>
-            </w:r>
-            <w:r>
-              <w:rPr>
-                <w:rFonts w:ascii="Calibri" w:cs="Calibri" w:eastAsia="Calibri" w:hAnsi="Calibri"/>
-                <w:b/>
-                <w:bCs/>
-                <w:color w:val="3F7CC4"/>
-                <w:sz w:val="25"/>
-                <w:szCs w:val="25"/>
-                <w:vertAlign w:val="superscript"/>
-              </w:rPr>
-              <w:t xml:space="preserve">7</w:t>
-            </w:r>
-            <w:r>
-              <w:rPr>
-                <w:rFonts w:ascii="Cambria" w:cs="Cambria" w:eastAsia="Cambria" w:hAnsi="Cambria"/>
-                <w:color w:val="000000"/>
-                <w:sz w:val="25"/>
-                <w:szCs w:val="25"/>
-              </w:rPr>
-              <w:t xml:space="preserve"/>
-            </w:r>
-          </w:p>
-        </w:tc>
-      </w:tr>
-      <w:tr>
-        <w:trPr>
-          <w:cantSplit/>
-        </w:trPr>
-        <w:tc>
-          <w:tcPr>
-            <w:tcW w:type="dxa" w:w="520"/>
-            <w:tcBorders>
-              <w:top w:val="none" w:color="FFFFFF" w:sz="0"/>
-              <w:left w:val="none" w:color="FFFFFF" w:sz="0"/>
-              <w:bottom w:val="none" w:color="FFFFFF" w:sz="0"/>
-              <w:right w:val="single" w:color="3F7CC4" w:sz="10"/>
-            </w:tcBorders>
-            <w:tcMar>
-              <w:top w:type="dxa" w:w="6"/>
-              <w:left w:type="dxa" w:w="80"/>
-              <w:bottom w:type="dxa" w:w="6"/>
-              <w:right w:type="dxa" w:w="80"/>
-            </w:tcMar>
-            <w:vAlign w:val="center"/>
-          </w:tcPr>
-          <w:p>
-            <w:pPr>
-              <w:spacing w:after="0" w:before="0"/>
-              <w:jc w:val="right"/>
-            </w:pPr>
-            <w:r>
-              <w:rPr>
-                <w:rFonts w:ascii="Calibri" w:cs="Calibri" w:eastAsia="Calibri" w:hAnsi="Calibri"/>
-                <w:color w:val="5B6B8C"/>
-                <w:sz w:val="16"/>
-                <w:szCs w:val="16"/>
-              </w:rPr>
-              <w:t xml:space="preserve">10</w:t>
-            </w:r>
-          </w:p>
-        </w:tc>
-        <w:tc>
-          <w:tcPr>
-            <w:tcW w:type="dxa" w:w="9686"/>
-            <w:tcBorders>
-              <w:top w:val="none" w:color="FFFFFF" w:sz="0"/>
-              <w:left w:val="none" w:color="FFFFFF" w:sz="0"/>
-              <w:bottom w:val="none" w:color="FFFFFF" w:sz="0"/>
-              <w:right w:val="none" w:color="FFFFFF" w:sz="0"/>
-            </w:tcBorders>
-            <w:tcMar>
-              <w:top w:type="dxa" w:w="6"/>
-              <w:left w:type="dxa" w:w="140"/>
-              <w:bottom w:type="dxa" w:w="6"/>
-              <w:right w:type="dxa" w:w="140"/>
-            </w:tcMar>
-            <w:vAlign w:val="top"/>
-          </w:tcPr>
-          <w:p>
-            <w:pPr>
-              <w:spacing w:after="0" w:before="0" w:line="360"/>
-            </w:pPr>
-            <w:r>
-              <w:rPr>
-                <w:rFonts w:ascii="Cambria" w:cs="Cambria" w:eastAsia="Cambria" w:hAnsi="Cambria"/>
-                <w:color w:val="000000"/>
-                <w:sz w:val="25"/>
-                <w:szCs w:val="25"/>
-              </w:rPr>
-              <w:t xml:space="preserve">können, was man wollte.</w:t>
+                <w:sz w:val="24"/>
+                <w:szCs w:val="24"/>
+              </w:rPr>
+              <w:t xml:space="preserve"> können, was man wollte.</w:t>
             </w:r>
           </w:p>
         </w:tc>
@@ -1274,7 +1123,7 @@
                 <w:sz w:val="19"/>
                 <w:szCs w:val="19"/>
               </w:rPr>
-              <w:t xml:space="preserve"> störrisch </w:t>
+              <w:t xml:space="preserve"> abfordern </w:t>
             </w:r>
             <w:r>
               <w:rPr>
@@ -1283,7 +1132,142 @@
                 <w:sz w:val="19"/>
                 <w:szCs w:val="19"/>
               </w:rPr>
-              <w:t xml:space="preserve">= trotzig, eigensinnig</w:t>
+              <w:t xml:space="preserve">= abverlangen</w:t>
+            </w:r>
+          </w:p>
+        </w:tc>
+      </w:tr>
+    </w:tbl>
+    <w:p>
+      <w:pPr>
+        <w:spacing w:after="0" w:before="80"/>
+        <w:jc w:val="right"/>
+      </w:pPr>
+      <w:r>
+        <w:rPr>
+          <w:rFonts w:ascii="Calibri" w:cs="Calibri" w:eastAsia="Calibri" w:hAnsi="Calibri"/>
+          <w:color w:val="5B6B8C"/>
+          <w:sz w:val="17"/>
+          <w:szCs w:val="17"/>
+        </w:rPr>
+        <w:t xml:space="preserve">Franz Kafka: „Brief an den Vater“ (1919), S. 3</w:t>
+      </w:r>
+    </w:p>
+    <w:p>
+      <w:pPr>
+        <w:keepNext/>
+        <w:spacing w:after="80" w:before="200"/>
+      </w:pPr>
+      <w:r>
+        <w:rPr>
+          <w:rFonts w:ascii="Cambria" w:cs="Cambria" w:eastAsia="Cambria" w:hAnsi="Cambria"/>
+          <w:b/>
+          <w:bCs/>
+          <w:color w:val="1E2761"/>
+          <w:sz w:val="26"/>
+          <w:szCs w:val="26"/>
+        </w:rPr>
+        <w:t xml:space="preserve">2. Information: Das „Vier-Ohren-Modell“ (Fokus Appell)</w:t>
+      </w:r>
+    </w:p>
+    <w:p>
+      <w:pPr>
+        <w:spacing w:after="80" w:before="0" w:line="290"/>
+      </w:pPr>
+      <w:r>
+        <w:rPr>
+          <w:rFonts w:ascii="Calibri" w:cs="Calibri" w:eastAsia="Calibri" w:hAnsi="Calibri"/>
+          <w:color w:val="000000"/>
+          <w:sz w:val="21"/>
+          <w:szCs w:val="21"/>
+        </w:rPr>
+        <w:t xml:space="preserve">Jede Äußerung enthält vier Botschaften gleichzeitig: Sachinhalt, Selbstkundgabe, Beziehung und Appell. Das Appell-Ohr achtet darauf, wozu der Sprecher den anderen bringen will – was er tun, denken oder fühlen soll.</w:t>
+      </w:r>
+    </w:p>
+    <w:tbl>
+      <w:tblPr>
+        <w:tblW w:type="dxa" w:w="10206"/>
+        <w:tblBorders>
+          <w:top w:val="single" w:color="auto" w:sz="4"/>
+          <w:left w:val="single" w:color="auto" w:sz="4"/>
+          <w:bottom w:val="single" w:color="auto" w:sz="4"/>
+          <w:right w:val="single" w:color="auto" w:sz="4"/>
+          <w:insideH w:val="single" w:color="auto" w:sz="4"/>
+          <w:insideV w:val="single" w:color="auto" w:sz="4"/>
+        </w:tblBorders>
+      </w:tblPr>
+      <w:tblGrid>
+        <w:gridCol w:w="2200"/>
+        <w:gridCol w:w="8006"/>
+      </w:tblGrid>
+      <w:tr>
+        <w:trPr>
+          <w:cantSplit/>
+        </w:trPr>
+        <w:tc>
+          <w:tcPr>
+            <w:tcW w:type="dxa" w:w="2200"/>
+            <w:tcBorders>
+              <w:top w:val="single" w:color="B9C6E8" w:sz="6"/>
+              <w:left w:val="single" w:color="B9C6E8" w:sz="6"/>
+              <w:bottom w:val="single" w:color="B9C6E8" w:sz="6"/>
+              <w:right w:val="single" w:color="B9C6E8" w:sz="6"/>
+            </w:tcBorders>
+            <w:shd w:fill="F4F7FD" w:color="auto" w:val="clear"/>
+            <w:tcMar>
+              <w:top w:type="dxa" w:w="50"/>
+              <w:left w:type="dxa" w:w="100"/>
+              <w:bottom w:type="dxa" w:w="50"/>
+              <w:right w:type="dxa" w:w="100"/>
+            </w:tcMar>
+            <w:vAlign w:val="top"/>
+          </w:tcPr>
+          <w:p>
+            <w:pPr>
+              <w:spacing w:after="0" w:before="0"/>
+            </w:pPr>
+            <w:r>
+              <w:rPr>
+                <w:rFonts w:ascii="Calibri" w:cs="Calibri" w:eastAsia="Calibri" w:hAnsi="Calibri"/>
+                <w:b/>
+                <w:bCs/>
+                <w:color w:val="1E2761"/>
+                <w:sz w:val="21"/>
+                <w:szCs w:val="21"/>
+              </w:rPr>
+              <w:t xml:space="preserve">Offener Appell</w:t>
+            </w:r>
+          </w:p>
+        </w:tc>
+        <w:tc>
+          <w:tcPr>
+            <w:tcW w:type="dxa" w:w="8006"/>
+            <w:tcBorders>
+              <w:top w:val="single" w:color="B9C6E8" w:sz="6"/>
+              <w:left w:val="single" w:color="B9C6E8" w:sz="6"/>
+              <w:bottom w:val="single" w:color="B9C6E8" w:sz="6"/>
+              <w:right w:val="single" w:color="B9C6E8" w:sz="6"/>
+            </w:tcBorders>
+            <w:tcMar>
+              <w:top w:type="dxa" w:w="50"/>
+              <w:left w:type="dxa" w:w="100"/>
+              <w:bottom w:type="dxa" w:w="50"/>
+              <w:right w:type="dxa" w:w="100"/>
+            </w:tcMar>
+            <w:vAlign w:val="top"/>
+          </w:tcPr>
+          <w:p>
+            <w:pPr>
+              <w:spacing w:after="0" w:before="0"/>
+            </w:pPr>
+            <w:r>
+              <w:rPr>
+                <w:rFonts w:ascii="Calibri" w:cs="Calibri" w:eastAsia="Calibri" w:hAnsi="Calibri"/>
+                <w:color w:val="000000"/>
+                <w:sz w:val="21"/>
+                <w:szCs w:val="21"/>
+              </w:rPr>
+              <w:t xml:space="preserve">Direkt ausgesprochen, z. B. als Bitte: „Hör mir bitte zu!“</w:t>
             </w:r>
           </w:p>
         </w:tc>
@@ -1294,19 +1278,327 @@
         </w:trPr>
         <w:tc>
           <w:tcPr>
+            <w:tcW w:type="dxa" w:w="2200"/>
+            <w:tcBorders>
+              <w:top w:val="single" w:color="B9C6E8" w:sz="6"/>
+              <w:left w:val="single" w:color="B9C6E8" w:sz="6"/>
+              <w:bottom w:val="single" w:color="B9C6E8" w:sz="6"/>
+              <w:right w:val="single" w:color="B9C6E8" w:sz="6"/>
+            </w:tcBorders>
+            <w:shd w:fill="F4F7FD" w:color="auto" w:val="clear"/>
+            <w:tcMar>
+              <w:top w:type="dxa" w:w="50"/>
+              <w:left w:type="dxa" w:w="100"/>
+              <w:bottom w:type="dxa" w:w="50"/>
+              <w:right w:type="dxa" w:w="100"/>
+            </w:tcMar>
+            <w:vAlign w:val="top"/>
+          </w:tcPr>
+          <w:p>
+            <w:pPr>
+              <w:spacing w:after="0" w:before="0"/>
+            </w:pPr>
+            <w:r>
+              <w:rPr>
+                <w:rFonts w:ascii="Calibri" w:cs="Calibri" w:eastAsia="Calibri" w:hAnsi="Calibri"/>
+                <w:b/>
+                <w:bCs/>
+                <w:color w:val="D9534F"/>
+                <w:sz w:val="21"/>
+                <w:szCs w:val="21"/>
+              </w:rPr>
+              <w:t xml:space="preserve">Verdeckter Appell</w:t>
+            </w:r>
+          </w:p>
+        </w:tc>
+        <w:tc>
+          <w:tcPr>
+            <w:tcW w:type="dxa" w:w="8006"/>
+            <w:tcBorders>
+              <w:top w:val="single" w:color="B9C6E8" w:sz="6"/>
+              <w:left w:val="single" w:color="B9C6E8" w:sz="6"/>
+              <w:bottom w:val="single" w:color="B9C6E8" w:sz="6"/>
+              <w:right w:val="single" w:color="B9C6E8" w:sz="6"/>
+            </w:tcBorders>
+            <w:tcMar>
+              <w:top w:type="dxa" w:w="50"/>
+              <w:left w:type="dxa" w:w="100"/>
+              <w:bottom w:type="dxa" w:w="50"/>
+              <w:right w:type="dxa" w:w="100"/>
+            </w:tcMar>
+            <w:vAlign w:val="top"/>
+          </w:tcPr>
+          <w:p>
+            <w:pPr>
+              <w:spacing w:after="0" w:before="0"/>
+            </w:pPr>
+            <w:r>
+              <w:rPr>
+                <w:rFonts w:ascii="Calibri" w:cs="Calibri" w:eastAsia="Calibri" w:hAnsi="Calibri"/>
+                <w:color w:val="000000"/>
+                <w:sz w:val="21"/>
+                <w:szCs w:val="21"/>
+              </w:rPr>
+              <w:t xml:space="preserve">Versteckt in einem Wunsch, einer Frage oder einer Beschreibung: „Du hörst mir nie zu.“</w:t>
+            </w:r>
+          </w:p>
+        </w:tc>
+      </w:tr>
+    </w:tbl>
+    <w:p>
+      <w:pPr>
+        <w:keepNext/>
+        <w:pageBreakBefore/>
+        <w:spacing w:after="80" w:before="0"/>
+      </w:pPr>
+      <w:r>
+        <w:rPr>
+          <w:rFonts w:ascii="Cambria" w:cs="Cambria" w:eastAsia="Cambria" w:hAnsi="Cambria"/>
+          <w:b/>
+          <w:bCs/>
+          <w:color w:val="1E2761"/>
+          <w:sz w:val="26"/>
+          <w:szCs w:val="26"/>
+        </w:rPr>
+        <w:t xml:space="preserve">3. Arbeitsaufträge</w:t>
+      </w:r>
+    </w:p>
+    <w:p>
+      <w:pPr>
+        <w:spacing w:after="40" w:before="0"/>
+      </w:pPr>
+      <w:r>
+        <w:rPr>
+          <w:rFonts w:ascii="Calibri" w:cs="Calibri" w:eastAsia="Calibri" w:hAnsi="Calibri"/>
+          <w:i/>
+          <w:iCs/>
+          <w:color w:val="5B6B8C"/>
+          <w:sz w:val="19"/>
+          <w:szCs w:val="19"/>
+        </w:rPr>
+        <w:t xml:space="preserve">Bearbeite die Aufgaben in deinem Hefter.</w:t>
+      </w:r>
+    </w:p>
+    <w:p>
+      <w:pPr>
+        <w:keepNext/>
+        <w:spacing w:after="50" w:before="160"/>
+      </w:pPr>
+      <w:r>
+        <w:rPr>
+          <w:rFonts w:ascii="Calibri" w:cs="Calibri" w:eastAsia="Calibri" w:hAnsi="Calibri"/>
+          <w:b/>
+          <w:bCs/>
+          <w:color w:val="1E2761"/>
+          <w:sz w:val="22"/>
+          <w:szCs w:val="22"/>
+        </w:rPr>
+        <w:t xml:space="preserve">Aufgabe 1: Vorarbeit (Textverständnis)</w:t>
+      </w:r>
+      <w:r>
+        <w:rPr>
+          <w:rFonts w:ascii="Calibri" w:cs="Calibri" w:eastAsia="Calibri" w:hAnsi="Calibri"/>
+          <w:i/>
+          <w:iCs/>
+          <w:color w:val="5B6B8C"/>
+          <w:sz w:val="19"/>
+          <w:szCs w:val="19"/>
+        </w:rPr>
+        <w:t xml:space="preserve">   (allein)</w:t>
+      </w:r>
+    </w:p>
+    <w:p>
+      <w:pPr>
+        <w:spacing w:after="40" w:before="0"/>
+      </w:pPr>
+      <w:r>
+        <w:rPr>
+          <w:rFonts w:ascii="Calibri" w:cs="Calibri" w:eastAsia="Calibri" w:hAnsi="Calibri"/>
+          <w:color w:val="000000"/>
+          <w:sz w:val="21"/>
+          <w:szCs w:val="21"/>
+        </w:rPr>
+        <w:t xml:space="preserve">Fasse den Textauszug in einem Satz zusammen: Worum bittet Kafka seinen Vater?</w:t>
+      </w:r>
+    </w:p>
+    <w:p>
+      <w:pPr>
+        <w:keepNext/>
+        <w:spacing w:after="50" w:before="160"/>
+      </w:pPr>
+      <w:r>
+        <w:rPr>
+          <w:rFonts w:ascii="Calibri" w:cs="Calibri" w:eastAsia="Calibri" w:hAnsi="Calibri"/>
+          <w:b/>
+          <w:bCs/>
+          <w:color w:val="1E2761"/>
+          <w:sz w:val="22"/>
+          <w:szCs w:val="22"/>
+        </w:rPr>
+        <w:t xml:space="preserve">Aufgabe 2: Analyse des Appells</w:t>
+      </w:r>
+      <w:r>
+        <w:rPr>
+          <w:rFonts w:ascii="Calibri" w:cs="Calibri" w:eastAsia="Calibri" w:hAnsi="Calibri"/>
+          <w:i/>
+          <w:iCs/>
+          <w:color w:val="5B6B8C"/>
+          <w:sz w:val="19"/>
+          <w:szCs w:val="19"/>
+        </w:rPr>
+        <w:t xml:space="preserve">   (allein)</w:t>
+      </w:r>
+    </w:p>
+    <w:p>
+      <w:pPr>
+        <w:spacing w:after="50" w:before="0"/>
+      </w:pPr>
+      <w:r>
+        <w:rPr>
+          <w:rFonts w:ascii="Calibri" w:cs="Calibri" w:eastAsia="Calibri" w:hAnsi="Calibri"/>
+          <w:color w:val="000000"/>
+          <w:sz w:val="21"/>
+          <w:szCs w:val="21"/>
+        </w:rPr>
+        <w:t xml:space="preserve">Untersuche den Auszug gezielt mit dem Appell-Ohr. Beantworte die Leitfragen und belege deine Aussagen mit Zitaten und Zeilenangaben:</w:t>
+      </w:r>
+    </w:p>
+    <w:p>
+      <w:pPr>
+        <w:spacing w:after="40" w:before="0"/>
+      </w:pPr>
+      <w:r>
+        <w:rPr>
+          <w:rFonts w:ascii="Calibri" w:cs="Calibri" w:eastAsia="Calibri" w:hAnsi="Calibri"/>
+          <w:color w:val="1E2761"/>
+          <w:sz w:val="21"/>
+          <w:szCs w:val="21"/>
+        </w:rPr>
+        <w:t xml:space="preserve">•  </w:t>
+      </w:r>
+      <w:r>
+        <w:rPr>
+          <w:rFonts w:ascii="Calibri" w:cs="Calibri" w:eastAsia="Calibri" w:hAnsi="Calibri"/>
+          <w:b/>
+          <w:bCs/>
+          <w:color w:val="000000"/>
+          <w:sz w:val="21"/>
+          <w:szCs w:val="21"/>
+        </w:rPr>
+        <w:t xml:space="preserve">Was soll der Vater tun? </w:t>
+      </w:r>
+      <w:r>
+        <w:rPr>
+          <w:rFonts w:ascii="Calibri" w:cs="Calibri" w:eastAsia="Calibri" w:hAnsi="Calibri"/>
+          <w:color w:val="5B6B8C"/>
+          <w:sz w:val="19"/>
+          <w:szCs w:val="19"/>
+        </w:rPr>
+        <w:t xml:space="preserve">(Achte auf „bitte“ (Z. 1) und „sollst Du aufhören“ (Z. 3).)</w:t>
+      </w:r>
+    </w:p>
+    <w:p>
+      <w:pPr>
+        <w:spacing w:after="40" w:before="0"/>
+      </w:pPr>
+      <w:r>
+        <w:rPr>
+          <w:rFonts w:ascii="Calibri" w:cs="Calibri" w:eastAsia="Calibri" w:hAnsi="Calibri"/>
+          <w:color w:val="1E2761"/>
+          <w:sz w:val="21"/>
+          <w:szCs w:val="21"/>
+        </w:rPr>
+        <w:t xml:space="preserve">•  </w:t>
+      </w:r>
+      <w:r>
+        <w:rPr>
+          <w:rFonts w:ascii="Calibri" w:cs="Calibri" w:eastAsia="Calibri" w:hAnsi="Calibri"/>
+          <w:b/>
+          <w:bCs/>
+          <w:color w:val="000000"/>
+          <w:sz w:val="21"/>
+          <w:szCs w:val="21"/>
+        </w:rPr>
+        <w:t xml:space="preserve">Was wünscht sich Kafka, ohne es direkt zu fordern? </w:t>
+      </w:r>
+      <w:r>
+        <w:rPr>
+          <w:rFonts w:ascii="Calibri" w:cs="Calibri" w:eastAsia="Calibri" w:hAnsi="Calibri"/>
+          <w:color w:val="5B6B8C"/>
+          <w:sz w:val="19"/>
+          <w:szCs w:val="19"/>
+        </w:rPr>
+        <w:t xml:space="preserve">(Achte auf „Wort“, „Hand“ und „Blick“ (Z. 5 f.).)</w:t>
+      </w:r>
+    </w:p>
+    <w:p>
+      <w:pPr>
+        <w:spacing w:after="40" w:before="0"/>
+      </w:pPr>
+      <w:r>
+        <w:rPr>
+          <w:rFonts w:ascii="Calibri" w:cs="Calibri" w:eastAsia="Calibri" w:hAnsi="Calibri"/>
+          <w:color w:val="1E2761"/>
+          <w:sz w:val="21"/>
+          <w:szCs w:val="21"/>
+        </w:rPr>
+        <w:t xml:space="preserve">•  </w:t>
+      </w:r>
+      <w:r>
+        <w:rPr>
+          <w:rFonts w:ascii="Calibri" w:cs="Calibri" w:eastAsia="Calibri" w:hAnsi="Calibri"/>
+          <w:b/>
+          <w:bCs/>
+          <w:color w:val="000000"/>
+          <w:sz w:val="21"/>
+          <w:szCs w:val="21"/>
+        </w:rPr>
+        <w:t xml:space="preserve">Warum betont Kafka, dass der Vater keine Schuld hat? </w:t>
+      </w:r>
+      <w:r>
+        <w:rPr>
+          <w:rFonts w:ascii="Calibri" w:cs="Calibri" w:eastAsia="Calibri" w:hAnsi="Calibri"/>
+          <w:color w:val="5B6B8C"/>
+          <w:sz w:val="19"/>
+          <w:szCs w:val="19"/>
+        </w:rPr>
+        <w:t xml:space="preserve">(Achte auf „niemals … an eine Schuld Deinerseits“ (Z. 1 f.).)</w:t>
+      </w:r>
+    </w:p>
+    <w:tbl>
+      <w:tblPr>
+        <w:tblW w:type="dxa" w:w="10206"/>
+        <w:tblBorders>
+          <w:top w:val="single" w:color="auto" w:sz="4"/>
+          <w:left w:val="single" w:color="auto" w:sz="4"/>
+          <w:bottom w:val="single" w:color="auto" w:sz="4"/>
+          <w:right w:val="single" w:color="auto" w:sz="4"/>
+          <w:insideH w:val="single" w:color="auto" w:sz="4"/>
+          <w:insideV w:val="single" w:color="auto" w:sz="4"/>
+        </w:tblBorders>
+      </w:tblPr>
+      <w:tblGrid>
+        <w:gridCol w:w="10206"/>
+      </w:tblGrid>
+      <w:tr>
+        <w:trPr>
+          <w:cantSplit/>
+        </w:trPr>
+        <w:tc>
+          <w:tcPr>
             <w:tcW w:type="dxa" w:w="10206"/>
-            <w:gridSpan w:val="2"/>
             <w:tcBorders>
               <w:top w:val="none" w:color="FFFFFF" w:sz="0"/>
               <w:left w:val="none" w:color="FFFFFF" w:sz="0"/>
               <w:bottom w:val="none" w:color="FFFFFF" w:sz="0"/>
               <w:right w:val="none" w:color="FFFFFF" w:sz="0"/>
             </w:tcBorders>
-            <w:tcMar>
-              <w:top w:type="dxa" w:w="0"/>
-              <w:left w:type="dxa" w:w="140"/>
-              <w:bottom w:type="dxa" w:w="0"/>
-              <w:right w:type="dxa" w:w="140"/>
+            <w:shd w:fill="FFF8EC" w:color="auto" w:val="clear"/>
+            <w:tcMar>
+              <w:top w:type="dxa" w:w="120"/>
+              <w:left w:type="dxa" w:w="160"/>
+              <w:bottom w:type="dxa" w:w="120"/>
+              <w:right w:type="dxa" w:w="160"/>
             </w:tcMar>
             <w:vAlign w:val="top"/>
           </w:tcPr>
@@ -1319,32 +1611,189 @@
                 <w:rFonts w:ascii="Calibri" w:cs="Calibri" w:eastAsia="Calibri" w:hAnsi="Calibri"/>
                 <w:b/>
                 <w:bCs/>
-                <w:color w:val="3F7CC4"/>
+                <w:color w:val="1E2761"/>
                 <w:sz w:val="19"/>
                 <w:szCs w:val="19"/>
-                <w:vertAlign w:val="superscript"/>
-              </w:rPr>
-              <w:t xml:space="preserve">6</w:t>
-            </w:r>
+              </w:rPr>
+              <w:t xml:space="preserve">Formulierungshilfen:  </w:t>
+            </w:r>
+            <w:r>
+              <w:rPr>
+                <w:rFonts w:ascii="Calibri" w:cs="Calibri" w:eastAsia="Calibri" w:hAnsi="Calibri"/>
+                <w:i/>
+                <w:iCs/>
+                <w:color w:val="000000"/>
+                <w:sz w:val="19"/>
+                <w:szCs w:val="19"/>
+              </w:rPr>
+              <w:t xml:space="preserve">Ein offener Appell zeigt sich in … (Z. …).  ·  Verdeckt appelliert Kafka, wenn er …  ·  Damit will er erreichen, dass der Vater …  ·  Seine Bitte sichert er ab, indem er …</w:t>
+            </w:r>
+          </w:p>
+        </w:tc>
+      </w:tr>
+    </w:tbl>
+    <w:p>
+      <w:pPr>
+        <w:keepNext/>
+        <w:spacing w:after="50" w:before="160"/>
+      </w:pPr>
+      <w:r>
+        <w:rPr>
+          <w:rFonts w:ascii="Calibri" w:cs="Calibri" w:eastAsia="Calibri" w:hAnsi="Calibri"/>
+          <w:b/>
+          <w:bCs/>
+          <w:color w:val="1E2761"/>
+          <w:sz w:val="22"/>
+          <w:szCs w:val="22"/>
+        </w:rPr>
+        <w:t xml:space="preserve">Aufgabe 3: Visualisierung</w:t>
+      </w:r>
+      <w:r>
+        <w:rPr>
+          <w:rFonts w:ascii="Calibri" w:cs="Calibri" w:eastAsia="Calibri" w:hAnsi="Calibri"/>
+          <w:i/>
+          <w:iCs/>
+          <w:color w:val="5B6B8C"/>
+          <w:sz w:val="19"/>
+          <w:szCs w:val="19"/>
+        </w:rPr>
+        <w:t xml:space="preserve"/>
+      </w:r>
+    </w:p>
+    <w:p>
+      <w:pPr>
+        <w:spacing w:after="80" w:before="0"/>
+      </w:pPr>
+      <w:r>
+        <w:rPr>
+          <w:rFonts w:ascii="Calibri" w:cs="Calibri" w:eastAsia="Calibri" w:hAnsi="Calibri"/>
+          <w:color w:val="000000"/>
+          <w:sz w:val="21"/>
+          <w:szCs w:val="21"/>
+        </w:rPr>
+        <w:t xml:space="preserve">Trage deine Ergebnisse in das Kommunikationsquadrat ein. Konzentriere dich vor allem auf den Quadranten Appell.</w:t>
+      </w:r>
+    </w:p>
+    <w:tbl>
+      <w:tblPr>
+        <w:tblW w:type="dxa" w:w="10206"/>
+        <w:tblBorders>
+          <w:top w:val="single" w:color="auto" w:sz="4"/>
+          <w:left w:val="single" w:color="auto" w:sz="4"/>
+          <w:bottom w:val="single" w:color="auto" w:sz="4"/>
+          <w:right w:val="single" w:color="auto" w:sz="4"/>
+          <w:insideH w:val="single" w:color="auto" w:sz="4"/>
+          <w:insideV w:val="single" w:color="auto" w:sz="4"/>
+        </w:tblBorders>
+      </w:tblPr>
+      <w:tblGrid>
+        <w:gridCol w:w="5103"/>
+        <w:gridCol w:w="5103"/>
+      </w:tblGrid>
+      <w:tr>
+        <w:trPr>
+          <w:cantSplit/>
+          <w:trHeight w:val="1250" w:hRule="atLeast"/>
+        </w:trPr>
+        <w:tc>
+          <w:tcPr>
+            <w:tcW w:type="dxa" w:w="5103"/>
+            <w:tcBorders>
+              <w:top w:val="single" w:color="B9C6E8" w:sz="6"/>
+              <w:left w:val="single" w:color="B9C6E8" w:sz="6"/>
+              <w:bottom w:val="single" w:color="B9C6E8" w:sz="6"/>
+              <w:right w:val="single" w:color="B9C6E8" w:sz="6"/>
+            </w:tcBorders>
+            <w:shd w:fill="FFFFFF" w:color="auto" w:val="clear"/>
+            <w:tcMar>
+              <w:top w:type="dxa" w:w="80"/>
+              <w:left w:type="dxa" w:w="140"/>
+              <w:bottom w:type="dxa" w:w="80"/>
+              <w:right w:type="dxa" w:w="140"/>
+            </w:tcMar>
+            <w:vAlign w:val="top"/>
+          </w:tcPr>
+          <w:p>
+            <w:pPr>
+              <w:spacing w:after="10" w:before="0"/>
+            </w:pPr>
             <w:r>
               <w:rPr>
                 <w:rFonts w:ascii="Calibri" w:cs="Calibri" w:eastAsia="Calibri" w:hAnsi="Calibri"/>
                 <w:b/>
                 <w:bCs/>
-                <w:color w:val="3F7CC4"/>
-                <w:sz w:val="19"/>
-                <w:szCs w:val="19"/>
-              </w:rPr>
-              <w:t xml:space="preserve"> lenkbar </w:t>
-            </w:r>
-            <w:r>
-              <w:rPr>
-                <w:rFonts w:ascii="Calibri" w:cs="Calibri" w:eastAsia="Calibri" w:hAnsi="Calibri"/>
+                <w:color w:val="1E2761"/>
+                <w:sz w:val="20"/>
+                <w:szCs w:val="20"/>
+              </w:rPr>
+              <w:t xml:space="preserve">[ SACHINHALT ]</w:t>
+            </w:r>
+          </w:p>
+          <w:p>
+            <w:pPr>
+              <w:spacing w:after="0" w:before="0"/>
+            </w:pPr>
+            <w:r>
+              <w:rPr>
+                <w:rFonts w:ascii="Calibri" w:cs="Calibri" w:eastAsia="Calibri" w:hAnsi="Calibri"/>
+                <w:i/>
+                <w:iCs/>
                 <w:color w:val="5B6B8C"/>
-                <w:sz w:val="19"/>
-                <w:szCs w:val="19"/>
-              </w:rPr>
-              <w:t xml:space="preserve">= zu lenken, zu erziehen</w:t>
+                <w:sz w:val="17"/>
+                <w:szCs w:val="17"/>
+              </w:rPr>
+              <w:t xml:space="preserve">Worüber spricht Kafka?</w:t>
+            </w:r>
+          </w:p>
+        </w:tc>
+        <w:tc>
+          <w:tcPr>
+            <w:tcW w:type="dxa" w:w="5103"/>
+            <w:tcBorders>
+              <w:top w:val="single" w:color="B9C6E8" w:sz="6"/>
+              <w:left w:val="single" w:color="B9C6E8" w:sz="6"/>
+              <w:bottom w:val="single" w:color="B9C6E8" w:sz="6"/>
+              <w:right w:val="single" w:color="B9C6E8" w:sz="6"/>
+            </w:tcBorders>
+            <w:shd w:fill="FFFFFF" w:color="auto" w:val="clear"/>
+            <w:tcMar>
+              <w:top w:type="dxa" w:w="80"/>
+              <w:left w:type="dxa" w:w="140"/>
+              <w:bottom w:type="dxa" w:w="80"/>
+              <w:right w:type="dxa" w:w="140"/>
+            </w:tcMar>
+            <w:vAlign w:val="top"/>
+          </w:tcPr>
+          <w:p>
+            <w:pPr>
+              <w:spacing w:after="10" w:before="0"/>
+            </w:pPr>
+            <w:r>
+              <w:rPr>
+                <w:rFonts w:ascii="Calibri" w:cs="Calibri" w:eastAsia="Calibri" w:hAnsi="Calibri"/>
+                <w:b/>
+                <w:bCs/>
+                <w:color w:val="1E2761"/>
+                <w:sz w:val="20"/>
+                <w:szCs w:val="20"/>
+              </w:rPr>
+              <w:t xml:space="preserve">[ SELBSTKUNDGABE ]</w:t>
+            </w:r>
+          </w:p>
+          <w:p>
+            <w:pPr>
+              <w:spacing w:after="0" w:before="0"/>
+            </w:pPr>
+            <w:r>
+              <w:rPr>
+                <w:rFonts w:ascii="Calibri" w:cs="Calibri" w:eastAsia="Calibri" w:hAnsi="Calibri"/>
+                <w:i/>
+                <w:iCs/>
+                <w:color w:val="5B6B8C"/>
+                <w:sz w:val="17"/>
+                <w:szCs w:val="17"/>
+              </w:rPr>
+              <w:t xml:space="preserve">Was zeigt er von sich?</w:t>
             </w:r>
           </w:p>
         </w:tc>
@@ -1352,60 +1801,107 @@
       <w:tr>
         <w:trPr>
           <w:cantSplit/>
+          <w:trHeight w:val="1650" w:hRule="atLeast"/>
         </w:trPr>
         <w:tc>
           <w:tcPr>
-            <w:tcW w:type="dxa" w:w="10206"/>
-            <w:gridSpan w:val="2"/>
-            <w:tcBorders>
-              <w:top w:val="none" w:color="FFFFFF" w:sz="0"/>
-              <w:left w:val="none" w:color="FFFFFF" w:sz="0"/>
-              <w:bottom w:val="none" w:color="FFFFFF" w:sz="0"/>
-              <w:right w:val="none" w:color="FFFFFF" w:sz="0"/>
-            </w:tcBorders>
-            <w:tcMar>
-              <w:top w:type="dxa" w:w="0"/>
+            <w:tcW w:type="dxa" w:w="5103"/>
+            <w:tcBorders>
+              <w:top w:val="single" w:color="B9C6E8" w:sz="6"/>
+              <w:left w:val="single" w:color="B9C6E8" w:sz="6"/>
+              <w:bottom w:val="single" w:color="B9C6E8" w:sz="6"/>
+              <w:right w:val="single" w:color="B9C6E8" w:sz="6"/>
+            </w:tcBorders>
+            <w:shd w:fill="FFFFFF" w:color="auto" w:val="clear"/>
+            <w:tcMar>
+              <w:top w:type="dxa" w:w="80"/>
               <w:left w:type="dxa" w:w="140"/>
-              <w:bottom w:type="dxa" w:w="0"/>
+              <w:bottom w:type="dxa" w:w="80"/>
               <w:right w:type="dxa" w:w="140"/>
             </w:tcMar>
             <w:vAlign w:val="top"/>
           </w:tcPr>
           <w:p>
             <w:pPr>
-              <w:spacing w:after="0" w:before="0"/>
+              <w:spacing w:after="10" w:before="0"/>
             </w:pPr>
             <w:r>
               <w:rPr>
                 <w:rFonts w:ascii="Calibri" w:cs="Calibri" w:eastAsia="Calibri" w:hAnsi="Calibri"/>
                 <w:b/>
                 <w:bCs/>
-                <w:color w:val="3F7CC4"/>
-                <w:sz w:val="19"/>
-                <w:szCs w:val="19"/>
-                <w:vertAlign w:val="superscript"/>
-              </w:rPr>
-              <w:t xml:space="preserve">7</w:t>
-            </w:r>
+                <w:color w:val="1E2761"/>
+                <w:sz w:val="20"/>
+                <w:szCs w:val="20"/>
+              </w:rPr>
+              <w:t xml:space="preserve">[ BEZIEHUNG ]</w:t>
+            </w:r>
+          </w:p>
+          <w:p>
+            <w:pPr>
+              <w:spacing w:after="0" w:before="0"/>
+            </w:pPr>
+            <w:r>
+              <w:rPr>
+                <w:rFonts w:ascii="Calibri" w:cs="Calibri" w:eastAsia="Calibri" w:hAnsi="Calibri"/>
+                <w:i/>
+                <w:iCs/>
+                <w:color w:val="5B6B8C"/>
+                <w:sz w:val="17"/>
+                <w:szCs w:val="17"/>
+              </w:rPr>
+              <w:t xml:space="preserve">Wie steht er zum Vater?</w:t>
+            </w:r>
+          </w:p>
+        </w:tc>
+        <w:tc>
+          <w:tcPr>
+            <w:tcW w:type="dxa" w:w="5103"/>
+            <w:tcBorders>
+              <w:top w:val="single" w:color="D9534F" w:sz="12"/>
+              <w:left w:val="single" w:color="D9534F" w:sz="12"/>
+              <w:bottom w:val="single" w:color="D9534F" w:sz="12"/>
+              <w:right w:val="single" w:color="D9534F" w:sz="12"/>
+            </w:tcBorders>
+            <w:shd w:fill="FDECEA" w:color="auto" w:val="clear"/>
+            <w:tcMar>
+              <w:top w:type="dxa" w:w="80"/>
+              <w:left w:type="dxa" w:w="140"/>
+              <w:bottom w:type="dxa" w:w="80"/>
+              <w:right w:type="dxa" w:w="140"/>
+            </w:tcMar>
+            <w:vAlign w:val="top"/>
+          </w:tcPr>
+          <w:p>
+            <w:pPr>
+              <w:spacing w:after="10" w:before="0"/>
+            </w:pPr>
             <w:r>
               <w:rPr>
                 <w:rFonts w:ascii="Calibri" w:cs="Calibri" w:eastAsia="Calibri" w:hAnsi="Calibri"/>
                 <w:b/>
                 <w:bCs/>
-                <w:color w:val="3F7CC4"/>
-                <w:sz w:val="19"/>
-                <w:szCs w:val="19"/>
-              </w:rPr>
-              <w:t xml:space="preserve"> abfordern </w:t>
-            </w:r>
-            <w:r>
-              <w:rPr>
-                <w:rFonts w:ascii="Calibri" w:cs="Calibri" w:eastAsia="Calibri" w:hAnsi="Calibri"/>
+                <w:color w:val="D9534F"/>
+                <w:sz w:val="20"/>
+                <w:szCs w:val="20"/>
+              </w:rPr>
+              <w:t xml:space="preserve">[ APPELL ]</w:t>
+            </w:r>
+          </w:p>
+          <w:p>
+            <w:pPr>
+              <w:spacing w:after="0" w:before="0"/>
+            </w:pPr>
+            <w:r>
+              <w:rPr>
+                <w:rFonts w:ascii="Calibri" w:cs="Calibri" w:eastAsia="Calibri" w:hAnsi="Calibri"/>
+                <w:i/>
+                <w:iCs/>
                 <w:color w:val="5B6B8C"/>
-                <w:sz w:val="19"/>
-                <w:szCs w:val="19"/>
-              </w:rPr>
-              <w:t xml:space="preserve">= abverlangen</w:t>
+                <w:sz w:val="17"/>
+                <w:szCs w:val="17"/>
+              </w:rPr>
+              <w:t xml:space="preserve">Was soll der Vater tun? offen / verdeckt</w:t>
             </w:r>
           </w:p>
         </w:tc>
@@ -1413,17 +1909,292 @@
     </w:tbl>
     <w:p>
       <w:pPr>
-        <w:spacing w:after="100" w:before="120"/>
-        <w:jc w:val="right"/>
-      </w:pPr>
-      <w:r>
-        <w:rPr>
-          <w:rFonts w:ascii="Calibri" w:cs="Calibri" w:eastAsia="Calibri" w:hAnsi="Calibri"/>
+        <w:keepNext/>
+        <w:spacing w:after="50" w:before="160"/>
+      </w:pPr>
+      <w:r>
+        <w:rPr>
+          <w:rFonts w:ascii="Calibri" w:cs="Calibri" w:eastAsia="Calibri" w:hAnsi="Calibri"/>
+          <w:b/>
+          <w:bCs/>
+          <w:color w:val="1E2761"/>
+          <w:sz w:val="22"/>
+          <w:szCs w:val="22"/>
+        </w:rPr>
+        <w:t xml:space="preserve">Aufgabe 4: Reflexion</w:t>
+      </w:r>
+      <w:r>
+        <w:rPr>
+          <w:rFonts w:ascii="Calibri" w:cs="Calibri" w:eastAsia="Calibri" w:hAnsi="Calibri"/>
+          <w:i/>
+          <w:iCs/>
           <w:color w:val="5B6B8C"/>
-          <w:sz w:val="17"/>
-          <w:szCs w:val="17"/>
-        </w:rPr>
-        <w:t xml:space="preserve">Franz Kafka: „Brief an den Vater“ (1919), S. 3</w:t>
+          <w:sz w:val="19"/>
+          <w:szCs w:val="19"/>
+        </w:rPr>
+        <w:t xml:space="preserve"/>
+      </w:r>
+    </w:p>
+    <w:p>
+      <w:pPr>
+        <w:spacing w:after="40" w:before="0"/>
+      </w:pPr>
+      <w:r>
+        <w:rPr>
+          <w:rFonts w:ascii="Calibri" w:cs="Calibri" w:eastAsia="Calibri" w:hAnsi="Calibri"/>
+          <w:color w:val="000000"/>
+          <w:sz w:val="21"/>
+          <w:szCs w:val="21"/>
+        </w:rPr>
+        <w:t xml:space="preserve">Kafka hat den Brief seinem Vater nie übergeben. Warum appelliert er so vorsichtig und versteckt? Hätte der Vater die Bitte verstanden?</w:t>
+      </w:r>
+    </w:p>
+    <w:p>
+      <w:pPr>
+        <w:keepNext/>
+        <w:spacing w:after="50" w:before="160"/>
+      </w:pPr>
+      <w:r>
+        <w:rPr>
+          <w:rFonts w:ascii="Calibri" w:cs="Calibri" w:eastAsia="Calibri" w:hAnsi="Calibri"/>
+          <w:b/>
+          <w:bCs/>
+          <w:color w:val="1E2761"/>
+          <w:sz w:val="22"/>
+          <w:szCs w:val="22"/>
+        </w:rPr>
+        <w:t xml:space="preserve">Aufgabe 5: Transfer: Kafkas Rede an den Vater</w:t>
+      </w:r>
+      <w:r>
+        <w:rPr>
+          <w:rFonts w:ascii="Calibri" w:cs="Calibri" w:eastAsia="Calibri" w:hAnsi="Calibri"/>
+          <w:i/>
+          <w:iCs/>
+          <w:color w:val="5B6B8C"/>
+          <w:sz w:val="19"/>
+          <w:szCs w:val="19"/>
+        </w:rPr>
+        <w:t xml:space="preserve">   (allein)</w:t>
+      </w:r>
+    </w:p>
+    <w:p>
+      <w:pPr>
+        <w:spacing w:after="30" w:before="0"/>
+      </w:pPr>
+      <w:r>
+        <w:rPr>
+          <w:rFonts w:ascii="Calibri" w:cs="Calibri" w:eastAsia="Calibri" w:hAnsi="Calibri"/>
+          <w:b/>
+          <w:bCs/>
+          <w:color w:val="000000"/>
+          <w:sz w:val="21"/>
+          <w:szCs w:val="21"/>
+        </w:rPr>
+        <w:t xml:space="preserve">Situation: </w:t>
+      </w:r>
+      <w:r>
+        <w:rPr>
+          <w:rFonts w:ascii="Calibri" w:cs="Calibri" w:eastAsia="Calibri" w:hAnsi="Calibri"/>
+          <w:color w:val="000000"/>
+          <w:sz w:val="21"/>
+          <w:szCs w:val="21"/>
+        </w:rPr>
+        <w:t xml:space="preserve">Max Brods Brief an Hermann Kafka war erfolgreich: Der Vater ist bereit, seinem Sohn zuzuhören.</w:t>
+      </w:r>
+    </w:p>
+    <w:p>
+      <w:pPr>
+        <w:spacing w:after="50" w:before="0"/>
+      </w:pPr>
+      <w:r>
+        <w:rPr>
+          <w:rFonts w:ascii="Calibri" w:cs="Calibri" w:eastAsia="Calibri" w:hAnsi="Calibri"/>
+          <w:b/>
+          <w:bCs/>
+          <w:color w:val="000000"/>
+          <w:sz w:val="21"/>
+          <w:szCs w:val="21"/>
+        </w:rPr>
+        <w:t xml:space="preserve">Deine Aufgabe: </w:t>
+      </w:r>
+      <w:r>
+        <w:rPr>
+          <w:rFonts w:ascii="Calibri" w:cs="Calibri" w:eastAsia="Calibri" w:hAnsi="Calibri"/>
+          <w:color w:val="000000"/>
+          <w:sz w:val="21"/>
+          <w:szCs w:val="21"/>
+        </w:rPr>
+        <w:t xml:space="preserve">Schreibe als Franz eine Rede an den Vater, in der du an ihn appellierst. Umfang: ca. 100–150 Wörter.</w:t>
+      </w:r>
+    </w:p>
+    <w:p>
+      <w:pPr>
+        <w:spacing w:after="40" w:before="0"/>
+      </w:pPr>
+      <w:r>
+        <w:rPr>
+          <w:rFonts w:ascii="Calibri" w:cs="Calibri" w:eastAsia="Calibri" w:hAnsi="Calibri"/>
+          <w:color w:val="1E2761"/>
+          <w:sz w:val="21"/>
+          <w:szCs w:val="21"/>
+        </w:rPr>
+        <w:t xml:space="preserve">•  </w:t>
+      </w:r>
+      <w:r>
+        <w:rPr>
+          <w:rFonts w:ascii="Calibri" w:cs="Calibri" w:eastAsia="Calibri" w:hAnsi="Calibri"/>
+          <w:b/>
+          <w:bCs/>
+          <w:color w:val="000000"/>
+          <w:sz w:val="20"/>
+          <w:szCs w:val="20"/>
+        </w:rPr>
+        <w:t xml:space="preserve">Anrede: </w:t>
+      </w:r>
+      <w:r>
+        <w:rPr>
+          <w:rFonts w:ascii="Calibri" w:cs="Calibri" w:eastAsia="Calibri" w:hAnsi="Calibri"/>
+          <w:color w:val="000000"/>
+          <w:sz w:val="20"/>
+          <w:szCs w:val="20"/>
+        </w:rPr>
+        <w:t xml:space="preserve">„Vater, …“</w:t>
+      </w:r>
+    </w:p>
+    <w:p>
+      <w:pPr>
+        <w:spacing w:after="40" w:before="0"/>
+      </w:pPr>
+      <w:r>
+        <w:rPr>
+          <w:rFonts w:ascii="Calibri" w:cs="Calibri" w:eastAsia="Calibri" w:hAnsi="Calibri"/>
+          <w:color w:val="1E2761"/>
+          <w:sz w:val="21"/>
+          <w:szCs w:val="21"/>
+        </w:rPr>
+        <w:t xml:space="preserve">•  </w:t>
+      </w:r>
+      <w:r>
+        <w:rPr>
+          <w:rFonts w:ascii="Calibri" w:cs="Calibri" w:eastAsia="Calibri" w:hAnsi="Calibri"/>
+          <w:b/>
+          <w:bCs/>
+          <w:color w:val="000000"/>
+          <w:sz w:val="20"/>
+          <w:szCs w:val="20"/>
+        </w:rPr>
+        <w:t xml:space="preserve">Ich-Botschaften: </w:t>
+      </w:r>
+      <w:r>
+        <w:rPr>
+          <w:rFonts w:ascii="Calibri" w:cs="Calibri" w:eastAsia="Calibri" w:hAnsi="Calibri"/>
+          <w:color w:val="000000"/>
+          <w:sz w:val="20"/>
+          <w:szCs w:val="20"/>
+        </w:rPr>
+        <w:t xml:space="preserve">mindestens zwei: Gefühl + Wirkung</w:t>
+      </w:r>
+    </w:p>
+    <w:p>
+      <w:pPr>
+        <w:spacing w:after="40" w:before="0"/>
+      </w:pPr>
+      <w:r>
+        <w:rPr>
+          <w:rFonts w:ascii="Calibri" w:cs="Calibri" w:eastAsia="Calibri" w:hAnsi="Calibri"/>
+          <w:color w:val="1E2761"/>
+          <w:sz w:val="21"/>
+          <w:szCs w:val="21"/>
+        </w:rPr>
+        <w:t xml:space="preserve">•  </w:t>
+      </w:r>
+      <w:r>
+        <w:rPr>
+          <w:rFonts w:ascii="Calibri" w:cs="Calibri" w:eastAsia="Calibri" w:hAnsi="Calibri"/>
+          <w:b/>
+          <w:bCs/>
+          <w:color w:val="000000"/>
+          <w:sz w:val="20"/>
+          <w:szCs w:val="20"/>
+        </w:rPr>
+        <w:t xml:space="preserve">Offener Appell: </w:t>
+      </w:r>
+      <w:r>
+        <w:rPr>
+          <w:rFonts w:ascii="Calibri" w:cs="Calibri" w:eastAsia="Calibri" w:hAnsi="Calibri"/>
+          <w:color w:val="000000"/>
+          <w:sz w:val="20"/>
+          <w:szCs w:val="20"/>
+        </w:rPr>
+        <w:t xml:space="preserve">mindestens eine klare Bitte</w:t>
+      </w:r>
+    </w:p>
+    <w:p>
+      <w:pPr>
+        <w:spacing w:after="40" w:before="0"/>
+      </w:pPr>
+      <w:r>
+        <w:rPr>
+          <w:rFonts w:ascii="Calibri" w:cs="Calibri" w:eastAsia="Calibri" w:hAnsi="Calibri"/>
+          <w:color w:val="1E2761"/>
+          <w:sz w:val="21"/>
+          <w:szCs w:val="21"/>
+        </w:rPr>
+        <w:t xml:space="preserve">•  </w:t>
+      </w:r>
+      <w:r>
+        <w:rPr>
+          <w:rFonts w:ascii="Calibri" w:cs="Calibri" w:eastAsia="Calibri" w:hAnsi="Calibri"/>
+          <w:b/>
+          <w:bCs/>
+          <w:color w:val="000000"/>
+          <w:sz w:val="20"/>
+          <w:szCs w:val="20"/>
+        </w:rPr>
+        <w:t xml:space="preserve">Bezug zum Text: </w:t>
+      </w:r>
+      <w:r>
+        <w:rPr>
+          <w:rFonts w:ascii="Calibri" w:cs="Calibri" w:eastAsia="Calibri" w:hAnsi="Calibri"/>
+          <w:color w:val="000000"/>
+          <w:sz w:val="20"/>
+          <w:szCs w:val="20"/>
+        </w:rPr>
+        <w:t xml:space="preserve">Kafkas Wünsche: Wort, Hand, Blick</w:t>
+      </w:r>
+    </w:p>
+    <w:p>
+      <w:pPr>
+        <w:spacing w:after="40" w:before="0"/>
+      </w:pPr>
+      <w:r>
+        <w:rPr>
+          <w:rFonts w:ascii="Calibri" w:cs="Calibri" w:eastAsia="Calibri" w:hAnsi="Calibri"/>
+          <w:color w:val="1E2761"/>
+          <w:sz w:val="21"/>
+          <w:szCs w:val="21"/>
+        </w:rPr>
+        <w:t xml:space="preserve">•  </w:t>
+      </w:r>
+      <w:r>
+        <w:rPr>
+          <w:rFonts w:ascii="Calibri" w:cs="Calibri" w:eastAsia="Calibri" w:hAnsi="Calibri"/>
+          <w:b/>
+          <w:bCs/>
+          <w:color w:val="000000"/>
+          <w:sz w:val="20"/>
+          <w:szCs w:val="20"/>
+        </w:rPr>
+        <w:t xml:space="preserve">Ton: </w:t>
+      </w:r>
+      <w:r>
+        <w:rPr>
+          <w:rFonts w:ascii="Calibri" w:cs="Calibri" w:eastAsia="Calibri" w:hAnsi="Calibri"/>
+          <w:color w:val="000000"/>
+          <w:sz w:val="20"/>
+          <w:szCs w:val="20"/>
+        </w:rPr>
+        <w:t xml:space="preserve">ehrlich, mutig, respektvoll – keine Vorwürfe</w:t>
       </w:r>
     </w:p>
     <w:sectPr>

</xml_diff>

<commit_message>
Kafka-Appell: Verlauf und Lernziele in der Präsentation, Testwerte aus der Briefauswertung, Komma ohne dass, Schreiblinien im Quadrat
Co-Authored-By: Claude Opus 5.5 <noreply@anthropic.com>
Claude-Session: https://claude.ai/code/session_01Kzh1oWiqhC6W8oSNq8mKnj
</commit_message>
<xml_diff>
--- a/Deutsch_11/Kafka_Appell/Arbeitsblatt_Kafkas_Appell.docx
+++ b/Deutsch_11/Kafka_Appell/Arbeitsblatt_Kafkas_Appell.docx
@@ -1376,7 +1376,7 @@
           <w:sz w:val="19"/>
           <w:szCs w:val="19"/>
         </w:rPr>
-        <w:t xml:space="preserve">Bearbeite die Aufgaben in deinem Hefter.</w:t>
+        <w:t xml:space="preserve">Aufgabe 3 löst du direkt auf diesem Blatt, alle anderen Aufgaben in deinem Hefter.</w:t>
       </w:r>
     </w:p>
     <w:p>
@@ -1693,7 +1693,6 @@
       <w:tr>
         <w:trPr>
           <w:cantSplit/>
-          <w:trHeight w:val="1250" w:hRule="atLeast"/>
         </w:trPr>
         <w:tc>
           <w:tcPr>
@@ -1745,6 +1744,188 @@
               <w:t xml:space="preserve">Worüber spricht Kafka?</w:t>
             </w:r>
           </w:p>
+          <w:tbl>
+            <w:tblPr>
+              <w:tblW w:type="dxa" w:w="4783"/>
+              <w:tblBorders>
+                <w:top w:val="single" w:color="auto" w:sz="4"/>
+                <w:left w:val="single" w:color="auto" w:sz="4"/>
+                <w:bottom w:val="single" w:color="auto" w:sz="4"/>
+                <w:right w:val="single" w:color="auto" w:sz="4"/>
+                <w:insideH w:val="single" w:color="auto" w:sz="4"/>
+                <w:insideV w:val="single" w:color="auto" w:sz="4"/>
+              </w:tblBorders>
+            </w:tblPr>
+            <w:tblGrid>
+              <w:gridCol w:w="4783"/>
+            </w:tblGrid>
+            <w:tr>
+              <w:trPr>
+                <w:cantSplit/>
+                <w:trHeight w:val="440" w:hRule="atLeast"/>
+              </w:trPr>
+              <w:tc>
+                <w:tcPr>
+                  <w:tcW w:type="dxa" w:w="4783"/>
+                  <w:tcBorders>
+                    <w:top w:val="none" w:color="FFFFFF" w:sz="0"/>
+                    <w:left w:val="none" w:color="FFFFFF" w:sz="0"/>
+                    <w:bottom w:val="single" w:color="9AA6C4" w:sz="4"/>
+                    <w:right w:val="none" w:color="FFFFFF" w:sz="0"/>
+                  </w:tcBorders>
+                  <w:tcMar>
+                    <w:top w:type="dxa" w:w="0"/>
+                    <w:left w:type="dxa" w:w="0"/>
+                    <w:bottom w:type="dxa" w:w="0"/>
+                    <w:right w:type="dxa" w:w="0"/>
+                  </w:tcMar>
+                  <w:vAlign w:val="top"/>
+                </w:tcPr>
+                <w:p>
+                  <w:pPr>
+                    <w:spacing w:after="0" w:before="0"/>
+                  </w:pPr>
+                  <w:r>
+                    <w:rPr>
+                      <w:rFonts w:ascii="Calibri" w:cs="Calibri" w:eastAsia="Calibri" w:hAnsi="Calibri"/>
+                      <w:color w:val="000000"/>
+                      <w:sz w:val="22"/>
+                      <w:szCs w:val="22"/>
+                    </w:rPr>
+                    <w:t xml:space="preserve"/>
+                  </w:r>
+                </w:p>
+              </w:tc>
+            </w:tr>
+            <w:tr>
+              <w:trPr>
+                <w:cantSplit/>
+                <w:trHeight w:val="440" w:hRule="atLeast"/>
+              </w:trPr>
+              <w:tc>
+                <w:tcPr>
+                  <w:tcW w:type="dxa" w:w="4783"/>
+                  <w:tcBorders>
+                    <w:top w:val="none" w:color="FFFFFF" w:sz="0"/>
+                    <w:left w:val="none" w:color="FFFFFF" w:sz="0"/>
+                    <w:bottom w:val="single" w:color="9AA6C4" w:sz="4"/>
+                    <w:right w:val="none" w:color="FFFFFF" w:sz="0"/>
+                  </w:tcBorders>
+                  <w:tcMar>
+                    <w:top w:type="dxa" w:w="0"/>
+                    <w:left w:type="dxa" w:w="0"/>
+                    <w:bottom w:type="dxa" w:w="0"/>
+                    <w:right w:type="dxa" w:w="0"/>
+                  </w:tcMar>
+                  <w:vAlign w:val="top"/>
+                </w:tcPr>
+                <w:p>
+                  <w:pPr>
+                    <w:spacing w:after="0" w:before="0"/>
+                  </w:pPr>
+                  <w:r>
+                    <w:rPr>
+                      <w:rFonts w:ascii="Calibri" w:cs="Calibri" w:eastAsia="Calibri" w:hAnsi="Calibri"/>
+                      <w:color w:val="000000"/>
+                      <w:sz w:val="22"/>
+                      <w:szCs w:val="22"/>
+                    </w:rPr>
+                    <w:t xml:space="preserve"/>
+                  </w:r>
+                </w:p>
+              </w:tc>
+            </w:tr>
+            <w:tr>
+              <w:trPr>
+                <w:cantSplit/>
+                <w:trHeight w:val="440" w:hRule="atLeast"/>
+              </w:trPr>
+              <w:tc>
+                <w:tcPr>
+                  <w:tcW w:type="dxa" w:w="4783"/>
+                  <w:tcBorders>
+                    <w:top w:val="none" w:color="FFFFFF" w:sz="0"/>
+                    <w:left w:val="none" w:color="FFFFFF" w:sz="0"/>
+                    <w:bottom w:val="single" w:color="9AA6C4" w:sz="4"/>
+                    <w:right w:val="none" w:color="FFFFFF" w:sz="0"/>
+                  </w:tcBorders>
+                  <w:tcMar>
+                    <w:top w:type="dxa" w:w="0"/>
+                    <w:left w:type="dxa" w:w="0"/>
+                    <w:bottom w:type="dxa" w:w="0"/>
+                    <w:right w:type="dxa" w:w="0"/>
+                  </w:tcMar>
+                  <w:vAlign w:val="top"/>
+                </w:tcPr>
+                <w:p>
+                  <w:pPr>
+                    <w:spacing w:after="0" w:before="0"/>
+                  </w:pPr>
+                  <w:r>
+                    <w:rPr>
+                      <w:rFonts w:ascii="Calibri" w:cs="Calibri" w:eastAsia="Calibri" w:hAnsi="Calibri"/>
+                      <w:color w:val="000000"/>
+                      <w:sz w:val="22"/>
+                      <w:szCs w:val="22"/>
+                    </w:rPr>
+                    <w:t xml:space="preserve"/>
+                  </w:r>
+                </w:p>
+              </w:tc>
+            </w:tr>
+            <w:tr>
+              <w:trPr>
+                <w:cantSplit/>
+                <w:trHeight w:val="440" w:hRule="atLeast"/>
+              </w:trPr>
+              <w:tc>
+                <w:tcPr>
+                  <w:tcW w:type="dxa" w:w="4783"/>
+                  <w:tcBorders>
+                    <w:top w:val="none" w:color="FFFFFF" w:sz="0"/>
+                    <w:left w:val="none" w:color="FFFFFF" w:sz="0"/>
+                    <w:bottom w:val="single" w:color="9AA6C4" w:sz="4"/>
+                    <w:right w:val="none" w:color="FFFFFF" w:sz="0"/>
+                  </w:tcBorders>
+                  <w:tcMar>
+                    <w:top w:type="dxa" w:w="0"/>
+                    <w:left w:type="dxa" w:w="0"/>
+                    <w:bottom w:type="dxa" w:w="0"/>
+                    <w:right w:type="dxa" w:w="0"/>
+                  </w:tcMar>
+                  <w:vAlign w:val="top"/>
+                </w:tcPr>
+                <w:p>
+                  <w:pPr>
+                    <w:spacing w:after="0" w:before="0"/>
+                  </w:pPr>
+                  <w:r>
+                    <w:rPr>
+                      <w:rFonts w:ascii="Calibri" w:cs="Calibri" w:eastAsia="Calibri" w:hAnsi="Calibri"/>
+                      <w:color w:val="000000"/>
+                      <w:sz w:val="22"/>
+                      <w:szCs w:val="22"/>
+                    </w:rPr>
+                    <w:t xml:space="preserve"/>
+                  </w:r>
+                </w:p>
+              </w:tc>
+            </w:tr>
+          </w:tbl>
+          <w:p>
+            <w:pPr>
+              <w:spacing w:after="0" w:before="0"/>
+            </w:pPr>
+            <w:r>
+              <w:rPr>
+                <w:rFonts w:ascii="Calibri" w:cs="Calibri" w:eastAsia="Calibri" w:hAnsi="Calibri"/>
+                <w:color w:val="000000"/>
+                <w:sz w:val="22"/>
+                <w:szCs w:val="22"/>
+              </w:rPr>
+              <w:t xml:space="preserve"/>
+            </w:r>
+          </w:p>
         </w:tc>
         <w:tc>
           <w:tcPr>
@@ -1796,12 +1977,193 @@
               <w:t xml:space="preserve">Was zeigt er von sich?</w:t>
             </w:r>
           </w:p>
+          <w:tbl>
+            <w:tblPr>
+              <w:tblW w:type="dxa" w:w="4783"/>
+              <w:tblBorders>
+                <w:top w:val="single" w:color="auto" w:sz="4"/>
+                <w:left w:val="single" w:color="auto" w:sz="4"/>
+                <w:bottom w:val="single" w:color="auto" w:sz="4"/>
+                <w:right w:val="single" w:color="auto" w:sz="4"/>
+                <w:insideH w:val="single" w:color="auto" w:sz="4"/>
+                <w:insideV w:val="single" w:color="auto" w:sz="4"/>
+              </w:tblBorders>
+            </w:tblPr>
+            <w:tblGrid>
+              <w:gridCol w:w="4783"/>
+            </w:tblGrid>
+            <w:tr>
+              <w:trPr>
+                <w:cantSplit/>
+                <w:trHeight w:val="440" w:hRule="atLeast"/>
+              </w:trPr>
+              <w:tc>
+                <w:tcPr>
+                  <w:tcW w:type="dxa" w:w="4783"/>
+                  <w:tcBorders>
+                    <w:top w:val="none" w:color="FFFFFF" w:sz="0"/>
+                    <w:left w:val="none" w:color="FFFFFF" w:sz="0"/>
+                    <w:bottom w:val="single" w:color="9AA6C4" w:sz="4"/>
+                    <w:right w:val="none" w:color="FFFFFF" w:sz="0"/>
+                  </w:tcBorders>
+                  <w:tcMar>
+                    <w:top w:type="dxa" w:w="0"/>
+                    <w:left w:type="dxa" w:w="0"/>
+                    <w:bottom w:type="dxa" w:w="0"/>
+                    <w:right w:type="dxa" w:w="0"/>
+                  </w:tcMar>
+                  <w:vAlign w:val="top"/>
+                </w:tcPr>
+                <w:p>
+                  <w:pPr>
+                    <w:spacing w:after="0" w:before="0"/>
+                  </w:pPr>
+                  <w:r>
+                    <w:rPr>
+                      <w:rFonts w:ascii="Calibri" w:cs="Calibri" w:eastAsia="Calibri" w:hAnsi="Calibri"/>
+                      <w:color w:val="000000"/>
+                      <w:sz w:val="22"/>
+                      <w:szCs w:val="22"/>
+                    </w:rPr>
+                    <w:t xml:space="preserve"/>
+                  </w:r>
+                </w:p>
+              </w:tc>
+            </w:tr>
+            <w:tr>
+              <w:trPr>
+                <w:cantSplit/>
+                <w:trHeight w:val="440" w:hRule="atLeast"/>
+              </w:trPr>
+              <w:tc>
+                <w:tcPr>
+                  <w:tcW w:type="dxa" w:w="4783"/>
+                  <w:tcBorders>
+                    <w:top w:val="none" w:color="FFFFFF" w:sz="0"/>
+                    <w:left w:val="none" w:color="FFFFFF" w:sz="0"/>
+                    <w:bottom w:val="single" w:color="9AA6C4" w:sz="4"/>
+                    <w:right w:val="none" w:color="FFFFFF" w:sz="0"/>
+                  </w:tcBorders>
+                  <w:tcMar>
+                    <w:top w:type="dxa" w:w="0"/>
+                    <w:left w:type="dxa" w:w="0"/>
+                    <w:bottom w:type="dxa" w:w="0"/>
+                    <w:right w:type="dxa" w:w="0"/>
+                  </w:tcMar>
+                  <w:vAlign w:val="top"/>
+                </w:tcPr>
+                <w:p>
+                  <w:pPr>
+                    <w:spacing w:after="0" w:before="0"/>
+                  </w:pPr>
+                  <w:r>
+                    <w:rPr>
+                      <w:rFonts w:ascii="Calibri" w:cs="Calibri" w:eastAsia="Calibri" w:hAnsi="Calibri"/>
+                      <w:color w:val="000000"/>
+                      <w:sz w:val="22"/>
+                      <w:szCs w:val="22"/>
+                    </w:rPr>
+                    <w:t xml:space="preserve"/>
+                  </w:r>
+                </w:p>
+              </w:tc>
+            </w:tr>
+            <w:tr>
+              <w:trPr>
+                <w:cantSplit/>
+                <w:trHeight w:val="440" w:hRule="atLeast"/>
+              </w:trPr>
+              <w:tc>
+                <w:tcPr>
+                  <w:tcW w:type="dxa" w:w="4783"/>
+                  <w:tcBorders>
+                    <w:top w:val="none" w:color="FFFFFF" w:sz="0"/>
+                    <w:left w:val="none" w:color="FFFFFF" w:sz="0"/>
+                    <w:bottom w:val="single" w:color="9AA6C4" w:sz="4"/>
+                    <w:right w:val="none" w:color="FFFFFF" w:sz="0"/>
+                  </w:tcBorders>
+                  <w:tcMar>
+                    <w:top w:type="dxa" w:w="0"/>
+                    <w:left w:type="dxa" w:w="0"/>
+                    <w:bottom w:type="dxa" w:w="0"/>
+                    <w:right w:type="dxa" w:w="0"/>
+                  </w:tcMar>
+                  <w:vAlign w:val="top"/>
+                </w:tcPr>
+                <w:p>
+                  <w:pPr>
+                    <w:spacing w:after="0" w:before="0"/>
+                  </w:pPr>
+                  <w:r>
+                    <w:rPr>
+                      <w:rFonts w:ascii="Calibri" w:cs="Calibri" w:eastAsia="Calibri" w:hAnsi="Calibri"/>
+                      <w:color w:val="000000"/>
+                      <w:sz w:val="22"/>
+                      <w:szCs w:val="22"/>
+                    </w:rPr>
+                    <w:t xml:space="preserve"/>
+                  </w:r>
+                </w:p>
+              </w:tc>
+            </w:tr>
+            <w:tr>
+              <w:trPr>
+                <w:cantSplit/>
+                <w:trHeight w:val="440" w:hRule="atLeast"/>
+              </w:trPr>
+              <w:tc>
+                <w:tcPr>
+                  <w:tcW w:type="dxa" w:w="4783"/>
+                  <w:tcBorders>
+                    <w:top w:val="none" w:color="FFFFFF" w:sz="0"/>
+                    <w:left w:val="none" w:color="FFFFFF" w:sz="0"/>
+                    <w:bottom w:val="single" w:color="9AA6C4" w:sz="4"/>
+                    <w:right w:val="none" w:color="FFFFFF" w:sz="0"/>
+                  </w:tcBorders>
+                  <w:tcMar>
+                    <w:top w:type="dxa" w:w="0"/>
+                    <w:left w:type="dxa" w:w="0"/>
+                    <w:bottom w:type="dxa" w:w="0"/>
+                    <w:right w:type="dxa" w:w="0"/>
+                  </w:tcMar>
+                  <w:vAlign w:val="top"/>
+                </w:tcPr>
+                <w:p>
+                  <w:pPr>
+                    <w:spacing w:after="0" w:before="0"/>
+                  </w:pPr>
+                  <w:r>
+                    <w:rPr>
+                      <w:rFonts w:ascii="Calibri" w:cs="Calibri" w:eastAsia="Calibri" w:hAnsi="Calibri"/>
+                      <w:color w:val="000000"/>
+                      <w:sz w:val="22"/>
+                      <w:szCs w:val="22"/>
+                    </w:rPr>
+                    <w:t xml:space="preserve"/>
+                  </w:r>
+                </w:p>
+              </w:tc>
+            </w:tr>
+          </w:tbl>
+          <w:p>
+            <w:pPr>
+              <w:spacing w:after="0" w:before="0"/>
+            </w:pPr>
+            <w:r>
+              <w:rPr>
+                <w:rFonts w:ascii="Calibri" w:cs="Calibri" w:eastAsia="Calibri" w:hAnsi="Calibri"/>
+                <w:color w:val="000000"/>
+                <w:sz w:val="22"/>
+                <w:szCs w:val="22"/>
+              </w:rPr>
+              <w:t xml:space="preserve"/>
+            </w:r>
+          </w:p>
         </w:tc>
       </w:tr>
       <w:tr>
         <w:trPr>
           <w:cantSplit/>
-          <w:trHeight w:val="1650" w:hRule="atLeast"/>
         </w:trPr>
         <w:tc>
           <w:tcPr>
@@ -1853,6 +2215,226 @@
               <w:t xml:space="preserve">Wie steht er zum Vater?</w:t>
             </w:r>
           </w:p>
+          <w:tbl>
+            <w:tblPr>
+              <w:tblW w:type="dxa" w:w="4783"/>
+              <w:tblBorders>
+                <w:top w:val="single" w:color="auto" w:sz="4"/>
+                <w:left w:val="single" w:color="auto" w:sz="4"/>
+                <w:bottom w:val="single" w:color="auto" w:sz="4"/>
+                <w:right w:val="single" w:color="auto" w:sz="4"/>
+                <w:insideH w:val="single" w:color="auto" w:sz="4"/>
+                <w:insideV w:val="single" w:color="auto" w:sz="4"/>
+              </w:tblBorders>
+            </w:tblPr>
+            <w:tblGrid>
+              <w:gridCol w:w="4783"/>
+            </w:tblGrid>
+            <w:tr>
+              <w:trPr>
+                <w:cantSplit/>
+                <w:trHeight w:val="440" w:hRule="atLeast"/>
+              </w:trPr>
+              <w:tc>
+                <w:tcPr>
+                  <w:tcW w:type="dxa" w:w="4783"/>
+                  <w:tcBorders>
+                    <w:top w:val="none" w:color="FFFFFF" w:sz="0"/>
+                    <w:left w:val="none" w:color="FFFFFF" w:sz="0"/>
+                    <w:bottom w:val="single" w:color="9AA6C4" w:sz="4"/>
+                    <w:right w:val="none" w:color="FFFFFF" w:sz="0"/>
+                  </w:tcBorders>
+                  <w:tcMar>
+                    <w:top w:type="dxa" w:w="0"/>
+                    <w:left w:type="dxa" w:w="0"/>
+                    <w:bottom w:type="dxa" w:w="0"/>
+                    <w:right w:type="dxa" w:w="0"/>
+                  </w:tcMar>
+                  <w:vAlign w:val="top"/>
+                </w:tcPr>
+                <w:p>
+                  <w:pPr>
+                    <w:spacing w:after="0" w:before="0"/>
+                  </w:pPr>
+                  <w:r>
+                    <w:rPr>
+                      <w:rFonts w:ascii="Calibri" w:cs="Calibri" w:eastAsia="Calibri" w:hAnsi="Calibri"/>
+                      <w:color w:val="000000"/>
+                      <w:sz w:val="22"/>
+                      <w:szCs w:val="22"/>
+                    </w:rPr>
+                    <w:t xml:space="preserve"/>
+                  </w:r>
+                </w:p>
+              </w:tc>
+            </w:tr>
+            <w:tr>
+              <w:trPr>
+                <w:cantSplit/>
+                <w:trHeight w:val="440" w:hRule="atLeast"/>
+              </w:trPr>
+              <w:tc>
+                <w:tcPr>
+                  <w:tcW w:type="dxa" w:w="4783"/>
+                  <w:tcBorders>
+                    <w:top w:val="none" w:color="FFFFFF" w:sz="0"/>
+                    <w:left w:val="none" w:color="FFFFFF" w:sz="0"/>
+                    <w:bottom w:val="single" w:color="9AA6C4" w:sz="4"/>
+                    <w:right w:val="none" w:color="FFFFFF" w:sz="0"/>
+                  </w:tcBorders>
+                  <w:tcMar>
+                    <w:top w:type="dxa" w:w="0"/>
+                    <w:left w:type="dxa" w:w="0"/>
+                    <w:bottom w:type="dxa" w:w="0"/>
+                    <w:right w:type="dxa" w:w="0"/>
+                  </w:tcMar>
+                  <w:vAlign w:val="top"/>
+                </w:tcPr>
+                <w:p>
+                  <w:pPr>
+                    <w:spacing w:after="0" w:before="0"/>
+                  </w:pPr>
+                  <w:r>
+                    <w:rPr>
+                      <w:rFonts w:ascii="Calibri" w:cs="Calibri" w:eastAsia="Calibri" w:hAnsi="Calibri"/>
+                      <w:color w:val="000000"/>
+                      <w:sz w:val="22"/>
+                      <w:szCs w:val="22"/>
+                    </w:rPr>
+                    <w:t xml:space="preserve"/>
+                  </w:r>
+                </w:p>
+              </w:tc>
+            </w:tr>
+            <w:tr>
+              <w:trPr>
+                <w:cantSplit/>
+                <w:trHeight w:val="440" w:hRule="atLeast"/>
+              </w:trPr>
+              <w:tc>
+                <w:tcPr>
+                  <w:tcW w:type="dxa" w:w="4783"/>
+                  <w:tcBorders>
+                    <w:top w:val="none" w:color="FFFFFF" w:sz="0"/>
+                    <w:left w:val="none" w:color="FFFFFF" w:sz="0"/>
+                    <w:bottom w:val="single" w:color="9AA6C4" w:sz="4"/>
+                    <w:right w:val="none" w:color="FFFFFF" w:sz="0"/>
+                  </w:tcBorders>
+                  <w:tcMar>
+                    <w:top w:type="dxa" w:w="0"/>
+                    <w:left w:type="dxa" w:w="0"/>
+                    <w:bottom w:type="dxa" w:w="0"/>
+                    <w:right w:type="dxa" w:w="0"/>
+                  </w:tcMar>
+                  <w:vAlign w:val="top"/>
+                </w:tcPr>
+                <w:p>
+                  <w:pPr>
+                    <w:spacing w:after="0" w:before="0"/>
+                  </w:pPr>
+                  <w:r>
+                    <w:rPr>
+                      <w:rFonts w:ascii="Calibri" w:cs="Calibri" w:eastAsia="Calibri" w:hAnsi="Calibri"/>
+                      <w:color w:val="000000"/>
+                      <w:sz w:val="22"/>
+                      <w:szCs w:val="22"/>
+                    </w:rPr>
+                    <w:t xml:space="preserve"/>
+                  </w:r>
+                </w:p>
+              </w:tc>
+            </w:tr>
+            <w:tr>
+              <w:trPr>
+                <w:cantSplit/>
+                <w:trHeight w:val="440" w:hRule="atLeast"/>
+              </w:trPr>
+              <w:tc>
+                <w:tcPr>
+                  <w:tcW w:type="dxa" w:w="4783"/>
+                  <w:tcBorders>
+                    <w:top w:val="none" w:color="FFFFFF" w:sz="0"/>
+                    <w:left w:val="none" w:color="FFFFFF" w:sz="0"/>
+                    <w:bottom w:val="single" w:color="9AA6C4" w:sz="4"/>
+                    <w:right w:val="none" w:color="FFFFFF" w:sz="0"/>
+                  </w:tcBorders>
+                  <w:tcMar>
+                    <w:top w:type="dxa" w:w="0"/>
+                    <w:left w:type="dxa" w:w="0"/>
+                    <w:bottom w:type="dxa" w:w="0"/>
+                    <w:right w:type="dxa" w:w="0"/>
+                  </w:tcMar>
+                  <w:vAlign w:val="top"/>
+                </w:tcPr>
+                <w:p>
+                  <w:pPr>
+                    <w:spacing w:after="0" w:before="0"/>
+                  </w:pPr>
+                  <w:r>
+                    <w:rPr>
+                      <w:rFonts w:ascii="Calibri" w:cs="Calibri" w:eastAsia="Calibri" w:hAnsi="Calibri"/>
+                      <w:color w:val="000000"/>
+                      <w:sz w:val="22"/>
+                      <w:szCs w:val="22"/>
+                    </w:rPr>
+                    <w:t xml:space="preserve"/>
+                  </w:r>
+                </w:p>
+              </w:tc>
+            </w:tr>
+            <w:tr>
+              <w:trPr>
+                <w:cantSplit/>
+                <w:trHeight w:val="440" w:hRule="atLeast"/>
+              </w:trPr>
+              <w:tc>
+                <w:tcPr>
+                  <w:tcW w:type="dxa" w:w="4783"/>
+                  <w:tcBorders>
+                    <w:top w:val="none" w:color="FFFFFF" w:sz="0"/>
+                    <w:left w:val="none" w:color="FFFFFF" w:sz="0"/>
+                    <w:bottom w:val="single" w:color="9AA6C4" w:sz="4"/>
+                    <w:right w:val="none" w:color="FFFFFF" w:sz="0"/>
+                  </w:tcBorders>
+                  <w:tcMar>
+                    <w:top w:type="dxa" w:w="0"/>
+                    <w:left w:type="dxa" w:w="0"/>
+                    <w:bottom w:type="dxa" w:w="0"/>
+                    <w:right w:type="dxa" w:w="0"/>
+                  </w:tcMar>
+                  <w:vAlign w:val="top"/>
+                </w:tcPr>
+                <w:p>
+                  <w:pPr>
+                    <w:spacing w:after="0" w:before="0"/>
+                  </w:pPr>
+                  <w:r>
+                    <w:rPr>
+                      <w:rFonts w:ascii="Calibri" w:cs="Calibri" w:eastAsia="Calibri" w:hAnsi="Calibri"/>
+                      <w:color w:val="000000"/>
+                      <w:sz w:val="22"/>
+                      <w:szCs w:val="22"/>
+                    </w:rPr>
+                    <w:t xml:space="preserve"/>
+                  </w:r>
+                </w:p>
+              </w:tc>
+            </w:tr>
+          </w:tbl>
+          <w:p>
+            <w:pPr>
+              <w:spacing w:after="0" w:before="0"/>
+            </w:pPr>
+            <w:r>
+              <w:rPr>
+                <w:rFonts w:ascii="Calibri" w:cs="Calibri" w:eastAsia="Calibri" w:hAnsi="Calibri"/>
+                <w:color w:val="000000"/>
+                <w:sz w:val="22"/>
+                <w:szCs w:val="22"/>
+              </w:rPr>
+              <w:t xml:space="preserve"/>
+            </w:r>
+          </w:p>
         </w:tc>
         <w:tc>
           <w:tcPr>
@@ -1902,6 +2484,226 @@
                 <w:szCs w:val="17"/>
               </w:rPr>
               <w:t xml:space="preserve">Was soll der Vater tun? offen / verdeckt</w:t>
+            </w:r>
+          </w:p>
+          <w:tbl>
+            <w:tblPr>
+              <w:tblW w:type="dxa" w:w="4783"/>
+              <w:tblBorders>
+                <w:top w:val="single" w:color="auto" w:sz="4"/>
+                <w:left w:val="single" w:color="auto" w:sz="4"/>
+                <w:bottom w:val="single" w:color="auto" w:sz="4"/>
+                <w:right w:val="single" w:color="auto" w:sz="4"/>
+                <w:insideH w:val="single" w:color="auto" w:sz="4"/>
+                <w:insideV w:val="single" w:color="auto" w:sz="4"/>
+              </w:tblBorders>
+            </w:tblPr>
+            <w:tblGrid>
+              <w:gridCol w:w="4783"/>
+            </w:tblGrid>
+            <w:tr>
+              <w:trPr>
+                <w:cantSplit/>
+                <w:trHeight w:val="440" w:hRule="atLeast"/>
+              </w:trPr>
+              <w:tc>
+                <w:tcPr>
+                  <w:tcW w:type="dxa" w:w="4783"/>
+                  <w:tcBorders>
+                    <w:top w:val="none" w:color="FFFFFF" w:sz="0"/>
+                    <w:left w:val="none" w:color="FFFFFF" w:sz="0"/>
+                    <w:bottom w:val="single" w:color="9AA6C4" w:sz="4"/>
+                    <w:right w:val="none" w:color="FFFFFF" w:sz="0"/>
+                  </w:tcBorders>
+                  <w:tcMar>
+                    <w:top w:type="dxa" w:w="0"/>
+                    <w:left w:type="dxa" w:w="0"/>
+                    <w:bottom w:type="dxa" w:w="0"/>
+                    <w:right w:type="dxa" w:w="0"/>
+                  </w:tcMar>
+                  <w:vAlign w:val="top"/>
+                </w:tcPr>
+                <w:p>
+                  <w:pPr>
+                    <w:spacing w:after="0" w:before="0"/>
+                  </w:pPr>
+                  <w:r>
+                    <w:rPr>
+                      <w:rFonts w:ascii="Calibri" w:cs="Calibri" w:eastAsia="Calibri" w:hAnsi="Calibri"/>
+                      <w:color w:val="000000"/>
+                      <w:sz w:val="22"/>
+                      <w:szCs w:val="22"/>
+                    </w:rPr>
+                    <w:t xml:space="preserve"/>
+                  </w:r>
+                </w:p>
+              </w:tc>
+            </w:tr>
+            <w:tr>
+              <w:trPr>
+                <w:cantSplit/>
+                <w:trHeight w:val="440" w:hRule="atLeast"/>
+              </w:trPr>
+              <w:tc>
+                <w:tcPr>
+                  <w:tcW w:type="dxa" w:w="4783"/>
+                  <w:tcBorders>
+                    <w:top w:val="none" w:color="FFFFFF" w:sz="0"/>
+                    <w:left w:val="none" w:color="FFFFFF" w:sz="0"/>
+                    <w:bottom w:val="single" w:color="9AA6C4" w:sz="4"/>
+                    <w:right w:val="none" w:color="FFFFFF" w:sz="0"/>
+                  </w:tcBorders>
+                  <w:tcMar>
+                    <w:top w:type="dxa" w:w="0"/>
+                    <w:left w:type="dxa" w:w="0"/>
+                    <w:bottom w:type="dxa" w:w="0"/>
+                    <w:right w:type="dxa" w:w="0"/>
+                  </w:tcMar>
+                  <w:vAlign w:val="top"/>
+                </w:tcPr>
+                <w:p>
+                  <w:pPr>
+                    <w:spacing w:after="0" w:before="0"/>
+                  </w:pPr>
+                  <w:r>
+                    <w:rPr>
+                      <w:rFonts w:ascii="Calibri" w:cs="Calibri" w:eastAsia="Calibri" w:hAnsi="Calibri"/>
+                      <w:color w:val="000000"/>
+                      <w:sz w:val="22"/>
+                      <w:szCs w:val="22"/>
+                    </w:rPr>
+                    <w:t xml:space="preserve"/>
+                  </w:r>
+                </w:p>
+              </w:tc>
+            </w:tr>
+            <w:tr>
+              <w:trPr>
+                <w:cantSplit/>
+                <w:trHeight w:val="440" w:hRule="atLeast"/>
+              </w:trPr>
+              <w:tc>
+                <w:tcPr>
+                  <w:tcW w:type="dxa" w:w="4783"/>
+                  <w:tcBorders>
+                    <w:top w:val="none" w:color="FFFFFF" w:sz="0"/>
+                    <w:left w:val="none" w:color="FFFFFF" w:sz="0"/>
+                    <w:bottom w:val="single" w:color="9AA6C4" w:sz="4"/>
+                    <w:right w:val="none" w:color="FFFFFF" w:sz="0"/>
+                  </w:tcBorders>
+                  <w:tcMar>
+                    <w:top w:type="dxa" w:w="0"/>
+                    <w:left w:type="dxa" w:w="0"/>
+                    <w:bottom w:type="dxa" w:w="0"/>
+                    <w:right w:type="dxa" w:w="0"/>
+                  </w:tcMar>
+                  <w:vAlign w:val="top"/>
+                </w:tcPr>
+                <w:p>
+                  <w:pPr>
+                    <w:spacing w:after="0" w:before="0"/>
+                  </w:pPr>
+                  <w:r>
+                    <w:rPr>
+                      <w:rFonts w:ascii="Calibri" w:cs="Calibri" w:eastAsia="Calibri" w:hAnsi="Calibri"/>
+                      <w:color w:val="000000"/>
+                      <w:sz w:val="22"/>
+                      <w:szCs w:val="22"/>
+                    </w:rPr>
+                    <w:t xml:space="preserve"/>
+                  </w:r>
+                </w:p>
+              </w:tc>
+            </w:tr>
+            <w:tr>
+              <w:trPr>
+                <w:cantSplit/>
+                <w:trHeight w:val="440" w:hRule="atLeast"/>
+              </w:trPr>
+              <w:tc>
+                <w:tcPr>
+                  <w:tcW w:type="dxa" w:w="4783"/>
+                  <w:tcBorders>
+                    <w:top w:val="none" w:color="FFFFFF" w:sz="0"/>
+                    <w:left w:val="none" w:color="FFFFFF" w:sz="0"/>
+                    <w:bottom w:val="single" w:color="9AA6C4" w:sz="4"/>
+                    <w:right w:val="none" w:color="FFFFFF" w:sz="0"/>
+                  </w:tcBorders>
+                  <w:tcMar>
+                    <w:top w:type="dxa" w:w="0"/>
+                    <w:left w:type="dxa" w:w="0"/>
+                    <w:bottom w:type="dxa" w:w="0"/>
+                    <w:right w:type="dxa" w:w="0"/>
+                  </w:tcMar>
+                  <w:vAlign w:val="top"/>
+                </w:tcPr>
+                <w:p>
+                  <w:pPr>
+                    <w:spacing w:after="0" w:before="0"/>
+                  </w:pPr>
+                  <w:r>
+                    <w:rPr>
+                      <w:rFonts w:ascii="Calibri" w:cs="Calibri" w:eastAsia="Calibri" w:hAnsi="Calibri"/>
+                      <w:color w:val="000000"/>
+                      <w:sz w:val="22"/>
+                      <w:szCs w:val="22"/>
+                    </w:rPr>
+                    <w:t xml:space="preserve"/>
+                  </w:r>
+                </w:p>
+              </w:tc>
+            </w:tr>
+            <w:tr>
+              <w:trPr>
+                <w:cantSplit/>
+                <w:trHeight w:val="440" w:hRule="atLeast"/>
+              </w:trPr>
+              <w:tc>
+                <w:tcPr>
+                  <w:tcW w:type="dxa" w:w="4783"/>
+                  <w:tcBorders>
+                    <w:top w:val="none" w:color="FFFFFF" w:sz="0"/>
+                    <w:left w:val="none" w:color="FFFFFF" w:sz="0"/>
+                    <w:bottom w:val="single" w:color="9AA6C4" w:sz="4"/>
+                    <w:right w:val="none" w:color="FFFFFF" w:sz="0"/>
+                  </w:tcBorders>
+                  <w:tcMar>
+                    <w:top w:type="dxa" w:w="0"/>
+                    <w:left w:type="dxa" w:w="0"/>
+                    <w:bottom w:type="dxa" w:w="0"/>
+                    <w:right w:type="dxa" w:w="0"/>
+                  </w:tcMar>
+                  <w:vAlign w:val="top"/>
+                </w:tcPr>
+                <w:p>
+                  <w:pPr>
+                    <w:spacing w:after="0" w:before="0"/>
+                  </w:pPr>
+                  <w:r>
+                    <w:rPr>
+                      <w:rFonts w:ascii="Calibri" w:cs="Calibri" w:eastAsia="Calibri" w:hAnsi="Calibri"/>
+                      <w:color w:val="000000"/>
+                      <w:sz w:val="22"/>
+                      <w:szCs w:val="22"/>
+                    </w:rPr>
+                    <w:t xml:space="preserve"/>
+                  </w:r>
+                </w:p>
+              </w:tc>
+            </w:tr>
+          </w:tbl>
+          <w:p>
+            <w:pPr>
+              <w:spacing w:after="0" w:before="0"/>
+            </w:pPr>
+            <w:r>
+              <w:rPr>
+                <w:rFonts w:ascii="Calibri" w:cs="Calibri" w:eastAsia="Calibri" w:hAnsi="Calibri"/>
+                <w:color w:val="000000"/>
+                <w:sz w:val="22"/>
+                <w:szCs w:val="22"/>
+              </w:rPr>
+              <w:t xml:space="preserve"/>
             </w:r>
           </w:p>
         </w:tc>

</xml_diff>

<commit_message>
Kafka-Appell: Schreiblinien für Aufgabe 1 und 2 auf dem Arbeitsblatt
Co-Authored-By: Claude Opus 5.5 <noreply@anthropic.com>
Claude-Session: https://claude.ai/code/session_01Kzh1oWiqhC6W8oSNq8mKnj
</commit_message>
<xml_diff>
--- a/Deutsch_11/Kafka_Appell/Arbeitsblatt_Kafkas_Appell.docx
+++ b/Deutsch_11/Kafka_Appell/Arbeitsblatt_Kafkas_Appell.docx
@@ -1348,8 +1348,7 @@
     <w:p>
       <w:pPr>
         <w:keepNext/>
-        <w:pageBreakBefore/>
-        <w:spacing w:after="80" w:before="0"/>
+        <w:spacing w:after="80" w:before="200"/>
       </w:pPr>
       <w:r>
         <w:rPr>
@@ -1376,13 +1375,13 @@
           <w:sz w:val="19"/>
           <w:szCs w:val="19"/>
         </w:rPr>
-        <w:t xml:space="preserve">Aufgabe 3 löst du direkt auf diesem Blatt, alle anderen Aufgaben in deinem Hefter.</w:t>
+        <w:t xml:space="preserve">Aufgaben 1–3 löst du direkt auf diesem Blatt, Aufgabe 4 und 5 in deinem Hefter.</w:t>
       </w:r>
     </w:p>
     <w:p>
       <w:pPr>
         <w:keepNext/>
-        <w:spacing w:after="50" w:before="160"/>
+        <w:spacing w:after="40" w:before="100"/>
       </w:pPr>
       <w:r>
         <w:rPr>
@@ -1409,7 +1408,7 @@
     </w:p>
     <w:p>
       <w:pPr>
-        <w:spacing w:after="40" w:before="0"/>
+        <w:spacing w:after="0" w:before="0"/>
       </w:pPr>
       <w:r>
         <w:rPr>
@@ -1419,150 +1418,6 @@
           <w:szCs w:val="21"/>
         </w:rPr>
         <w:t xml:space="preserve">Fasse den Textauszug in einem Satz zusammen: Worum bittet Kafka seinen Vater?</w:t>
-      </w:r>
-    </w:p>
-    <w:p>
-      <w:pPr>
-        <w:keepNext/>
-        <w:spacing w:after="50" w:before="160"/>
-      </w:pPr>
-      <w:r>
-        <w:rPr>
-          <w:rFonts w:ascii="Calibri" w:cs="Calibri" w:eastAsia="Calibri" w:hAnsi="Calibri"/>
-          <w:b/>
-          <w:bCs/>
-          <w:color w:val="1E2761"/>
-          <w:sz w:val="22"/>
-          <w:szCs w:val="22"/>
-        </w:rPr>
-        <w:t xml:space="preserve">Aufgabe 2: Analyse des Appells</w:t>
-      </w:r>
-      <w:r>
-        <w:rPr>
-          <w:rFonts w:ascii="Calibri" w:cs="Calibri" w:eastAsia="Calibri" w:hAnsi="Calibri"/>
-          <w:i/>
-          <w:iCs/>
-          <w:color w:val="5B6B8C"/>
-          <w:sz w:val="19"/>
-          <w:szCs w:val="19"/>
-        </w:rPr>
-        <w:t xml:space="preserve">   (allein)</w:t>
-      </w:r>
-    </w:p>
-    <w:p>
-      <w:pPr>
-        <w:spacing w:after="50" w:before="0"/>
-      </w:pPr>
-      <w:r>
-        <w:rPr>
-          <w:rFonts w:ascii="Calibri" w:cs="Calibri" w:eastAsia="Calibri" w:hAnsi="Calibri"/>
-          <w:color w:val="000000"/>
-          <w:sz w:val="21"/>
-          <w:szCs w:val="21"/>
-        </w:rPr>
-        <w:t xml:space="preserve">Untersuche den Auszug gezielt mit dem Appell-Ohr. Beantworte die Leitfragen und belege deine Aussagen mit Zitaten und Zeilenangaben:</w:t>
-      </w:r>
-    </w:p>
-    <w:p>
-      <w:pPr>
-        <w:spacing w:after="40" w:before="0"/>
-      </w:pPr>
-      <w:r>
-        <w:rPr>
-          <w:rFonts w:ascii="Calibri" w:cs="Calibri" w:eastAsia="Calibri" w:hAnsi="Calibri"/>
-          <w:color w:val="1E2761"/>
-          <w:sz w:val="21"/>
-          <w:szCs w:val="21"/>
-        </w:rPr>
-        <w:t xml:space="preserve">•  </w:t>
-      </w:r>
-      <w:r>
-        <w:rPr>
-          <w:rFonts w:ascii="Calibri" w:cs="Calibri" w:eastAsia="Calibri" w:hAnsi="Calibri"/>
-          <w:b/>
-          <w:bCs/>
-          <w:color w:val="000000"/>
-          <w:sz w:val="21"/>
-          <w:szCs w:val="21"/>
-        </w:rPr>
-        <w:t xml:space="preserve">Was soll der Vater tun? </w:t>
-      </w:r>
-      <w:r>
-        <w:rPr>
-          <w:rFonts w:ascii="Calibri" w:cs="Calibri" w:eastAsia="Calibri" w:hAnsi="Calibri"/>
-          <w:color w:val="5B6B8C"/>
-          <w:sz w:val="19"/>
-          <w:szCs w:val="19"/>
-        </w:rPr>
-        <w:t xml:space="preserve">(Achte auf „bitte“ (Z. 1) und „sollst Du aufhören“ (Z. 3).)</w:t>
-      </w:r>
-    </w:p>
-    <w:p>
-      <w:pPr>
-        <w:spacing w:after="40" w:before="0"/>
-      </w:pPr>
-      <w:r>
-        <w:rPr>
-          <w:rFonts w:ascii="Calibri" w:cs="Calibri" w:eastAsia="Calibri" w:hAnsi="Calibri"/>
-          <w:color w:val="1E2761"/>
-          <w:sz w:val="21"/>
-          <w:szCs w:val="21"/>
-        </w:rPr>
-        <w:t xml:space="preserve">•  </w:t>
-      </w:r>
-      <w:r>
-        <w:rPr>
-          <w:rFonts w:ascii="Calibri" w:cs="Calibri" w:eastAsia="Calibri" w:hAnsi="Calibri"/>
-          <w:b/>
-          <w:bCs/>
-          <w:color w:val="000000"/>
-          <w:sz w:val="21"/>
-          <w:szCs w:val="21"/>
-        </w:rPr>
-        <w:t xml:space="preserve">Was wünscht sich Kafka, ohne es direkt zu fordern? </w:t>
-      </w:r>
-      <w:r>
-        <w:rPr>
-          <w:rFonts w:ascii="Calibri" w:cs="Calibri" w:eastAsia="Calibri" w:hAnsi="Calibri"/>
-          <w:color w:val="5B6B8C"/>
-          <w:sz w:val="19"/>
-          <w:szCs w:val="19"/>
-        </w:rPr>
-        <w:t xml:space="preserve">(Achte auf „Wort“, „Hand“ und „Blick“ (Z. 5 f.).)</w:t>
-      </w:r>
-    </w:p>
-    <w:p>
-      <w:pPr>
-        <w:spacing w:after="40" w:before="0"/>
-      </w:pPr>
-      <w:r>
-        <w:rPr>
-          <w:rFonts w:ascii="Calibri" w:cs="Calibri" w:eastAsia="Calibri" w:hAnsi="Calibri"/>
-          <w:color w:val="1E2761"/>
-          <w:sz w:val="21"/>
-          <w:szCs w:val="21"/>
-        </w:rPr>
-        <w:t xml:space="preserve">•  </w:t>
-      </w:r>
-      <w:r>
-        <w:rPr>
-          <w:rFonts w:ascii="Calibri" w:cs="Calibri" w:eastAsia="Calibri" w:hAnsi="Calibri"/>
-          <w:b/>
-          <w:bCs/>
-          <w:color w:val="000000"/>
-          <w:sz w:val="21"/>
-          <w:szCs w:val="21"/>
-        </w:rPr>
-        <w:t xml:space="preserve">Warum betont Kafka, dass der Vater keine Schuld hat? </w:t>
-      </w:r>
-      <w:r>
-        <w:rPr>
-          <w:rFonts w:ascii="Calibri" w:cs="Calibri" w:eastAsia="Calibri" w:hAnsi="Calibri"/>
-          <w:color w:val="5B6B8C"/>
-          <w:sz w:val="19"/>
-          <w:szCs w:val="19"/>
-        </w:rPr>
-        <w:t xml:space="preserve">(Achte auf „niemals … an eine Schuld Deinerseits“ (Z. 1 f.).)</w:t>
       </w:r>
     </w:p>
     <w:tbl>
@@ -1583,6 +1438,633 @@
       <w:tr>
         <w:trPr>
           <w:cantSplit/>
+          <w:trHeight w:val="420" w:hRule="atLeast"/>
+        </w:trPr>
+        <w:tc>
+          <w:tcPr>
+            <w:tcW w:type="dxa" w:w="10206"/>
+            <w:tcBorders>
+              <w:top w:val="none" w:color="FFFFFF" w:sz="0"/>
+              <w:left w:val="none" w:color="FFFFFF" w:sz="0"/>
+              <w:bottom w:val="single" w:color="9AA6C4" w:sz="4"/>
+              <w:right w:val="none" w:color="FFFFFF" w:sz="0"/>
+            </w:tcBorders>
+            <w:tcMar>
+              <w:top w:type="dxa" w:w="0"/>
+              <w:left w:type="dxa" w:w="0"/>
+              <w:bottom w:type="dxa" w:w="0"/>
+              <w:right w:type="dxa" w:w="0"/>
+            </w:tcMar>
+            <w:vAlign w:val="top"/>
+          </w:tcPr>
+          <w:p>
+            <w:pPr>
+              <w:spacing w:after="0" w:before="0"/>
+            </w:pPr>
+            <w:r>
+              <w:rPr>
+                <w:rFonts w:ascii="Calibri" w:cs="Calibri" w:eastAsia="Calibri" w:hAnsi="Calibri"/>
+                <w:color w:val="000000"/>
+                <w:sz w:val="22"/>
+                <w:szCs w:val="22"/>
+              </w:rPr>
+              <w:t xml:space="preserve"/>
+            </w:r>
+          </w:p>
+        </w:tc>
+      </w:tr>
+      <w:tr>
+        <w:trPr>
+          <w:cantSplit/>
+          <w:trHeight w:val="420" w:hRule="atLeast"/>
+        </w:trPr>
+        <w:tc>
+          <w:tcPr>
+            <w:tcW w:type="dxa" w:w="10206"/>
+            <w:tcBorders>
+              <w:top w:val="none" w:color="FFFFFF" w:sz="0"/>
+              <w:left w:val="none" w:color="FFFFFF" w:sz="0"/>
+              <w:bottom w:val="single" w:color="9AA6C4" w:sz="4"/>
+              <w:right w:val="none" w:color="FFFFFF" w:sz="0"/>
+            </w:tcBorders>
+            <w:tcMar>
+              <w:top w:type="dxa" w:w="0"/>
+              <w:left w:type="dxa" w:w="0"/>
+              <w:bottom w:type="dxa" w:w="0"/>
+              <w:right w:type="dxa" w:w="0"/>
+            </w:tcMar>
+            <w:vAlign w:val="top"/>
+          </w:tcPr>
+          <w:p>
+            <w:pPr>
+              <w:spacing w:after="0" w:before="0"/>
+            </w:pPr>
+            <w:r>
+              <w:rPr>
+                <w:rFonts w:ascii="Calibri" w:cs="Calibri" w:eastAsia="Calibri" w:hAnsi="Calibri"/>
+                <w:color w:val="000000"/>
+                <w:sz w:val="22"/>
+                <w:szCs w:val="22"/>
+              </w:rPr>
+              <w:t xml:space="preserve"/>
+            </w:r>
+          </w:p>
+        </w:tc>
+      </w:tr>
+    </w:tbl>
+    <w:p>
+      <w:pPr>
+        <w:keepNext/>
+        <w:pageBreakBefore/>
+        <w:spacing w:after="40" w:before="0"/>
+      </w:pPr>
+      <w:r>
+        <w:rPr>
+          <w:rFonts w:ascii="Calibri" w:cs="Calibri" w:eastAsia="Calibri" w:hAnsi="Calibri"/>
+          <w:b/>
+          <w:bCs/>
+          <w:color w:val="1E2761"/>
+          <w:sz w:val="22"/>
+          <w:szCs w:val="22"/>
+        </w:rPr>
+        <w:t xml:space="preserve">Aufgabe 2: Analyse des Appells</w:t>
+      </w:r>
+      <w:r>
+        <w:rPr>
+          <w:rFonts w:ascii="Calibri" w:cs="Calibri" w:eastAsia="Calibri" w:hAnsi="Calibri"/>
+          <w:i/>
+          <w:iCs/>
+          <w:color w:val="5B6B8C"/>
+          <w:sz w:val="19"/>
+          <w:szCs w:val="19"/>
+        </w:rPr>
+        <w:t xml:space="preserve">   (allein)</w:t>
+      </w:r>
+    </w:p>
+    <w:p>
+      <w:pPr>
+        <w:spacing w:after="50" w:before="0"/>
+      </w:pPr>
+      <w:r>
+        <w:rPr>
+          <w:rFonts w:ascii="Calibri" w:cs="Calibri" w:eastAsia="Calibri" w:hAnsi="Calibri"/>
+          <w:color w:val="000000"/>
+          <w:sz w:val="21"/>
+          <w:szCs w:val="21"/>
+        </w:rPr>
+        <w:t xml:space="preserve">Untersuche den Auszug gezielt mit dem Appell-Ohr. Beantworte die Leitfragen und belege deine Aussagen mit Zitaten und Zeilenangaben:</w:t>
+      </w:r>
+    </w:p>
+    <w:p>
+      <w:pPr>
+        <w:spacing w:after="40" w:before="0"/>
+      </w:pPr>
+      <w:r>
+        <w:rPr>
+          <w:rFonts w:ascii="Calibri" w:cs="Calibri" w:eastAsia="Calibri" w:hAnsi="Calibri"/>
+          <w:color w:val="1E2761"/>
+          <w:sz w:val="21"/>
+          <w:szCs w:val="21"/>
+        </w:rPr>
+        <w:t xml:space="preserve">•  </w:t>
+      </w:r>
+      <w:r>
+        <w:rPr>
+          <w:rFonts w:ascii="Calibri" w:cs="Calibri" w:eastAsia="Calibri" w:hAnsi="Calibri"/>
+          <w:b/>
+          <w:bCs/>
+          <w:color w:val="000000"/>
+          <w:sz w:val="21"/>
+          <w:szCs w:val="21"/>
+        </w:rPr>
+        <w:t xml:space="preserve">Was soll der Vater tun? </w:t>
+      </w:r>
+      <w:r>
+        <w:rPr>
+          <w:rFonts w:ascii="Calibri" w:cs="Calibri" w:eastAsia="Calibri" w:hAnsi="Calibri"/>
+          <w:color w:val="5B6B8C"/>
+          <w:sz w:val="19"/>
+          <w:szCs w:val="19"/>
+        </w:rPr>
+        <w:t xml:space="preserve">(Achte auf „bitte“ (Z. 1) und „sollst Du aufhören“ (Z. 3).)</w:t>
+      </w:r>
+    </w:p>
+    <w:tbl>
+      <w:tblPr>
+        <w:tblW w:type="dxa" w:w="10206"/>
+        <w:tblBorders>
+          <w:top w:val="single" w:color="auto" w:sz="4"/>
+          <w:left w:val="single" w:color="auto" w:sz="4"/>
+          <w:bottom w:val="single" w:color="auto" w:sz="4"/>
+          <w:right w:val="single" w:color="auto" w:sz="4"/>
+          <w:insideH w:val="single" w:color="auto" w:sz="4"/>
+          <w:insideV w:val="single" w:color="auto" w:sz="4"/>
+        </w:tblBorders>
+      </w:tblPr>
+      <w:tblGrid>
+        <w:gridCol w:w="10206"/>
+      </w:tblGrid>
+      <w:tr>
+        <w:trPr>
+          <w:cantSplit/>
+          <w:trHeight w:val="420" w:hRule="atLeast"/>
+        </w:trPr>
+        <w:tc>
+          <w:tcPr>
+            <w:tcW w:type="dxa" w:w="10206"/>
+            <w:tcBorders>
+              <w:top w:val="none" w:color="FFFFFF" w:sz="0"/>
+              <w:left w:val="none" w:color="FFFFFF" w:sz="0"/>
+              <w:bottom w:val="single" w:color="9AA6C4" w:sz="4"/>
+              <w:right w:val="none" w:color="FFFFFF" w:sz="0"/>
+            </w:tcBorders>
+            <w:tcMar>
+              <w:top w:type="dxa" w:w="0"/>
+              <w:left w:type="dxa" w:w="0"/>
+              <w:bottom w:type="dxa" w:w="0"/>
+              <w:right w:type="dxa" w:w="0"/>
+            </w:tcMar>
+            <w:vAlign w:val="top"/>
+          </w:tcPr>
+          <w:p>
+            <w:pPr>
+              <w:spacing w:after="0" w:before="0"/>
+            </w:pPr>
+            <w:r>
+              <w:rPr>
+                <w:rFonts w:ascii="Calibri" w:cs="Calibri" w:eastAsia="Calibri" w:hAnsi="Calibri"/>
+                <w:color w:val="000000"/>
+                <w:sz w:val="22"/>
+                <w:szCs w:val="22"/>
+              </w:rPr>
+              <w:t xml:space="preserve"/>
+            </w:r>
+          </w:p>
+        </w:tc>
+      </w:tr>
+      <w:tr>
+        <w:trPr>
+          <w:cantSplit/>
+          <w:trHeight w:val="420" w:hRule="atLeast"/>
+        </w:trPr>
+        <w:tc>
+          <w:tcPr>
+            <w:tcW w:type="dxa" w:w="10206"/>
+            <w:tcBorders>
+              <w:top w:val="none" w:color="FFFFFF" w:sz="0"/>
+              <w:left w:val="none" w:color="FFFFFF" w:sz="0"/>
+              <w:bottom w:val="single" w:color="9AA6C4" w:sz="4"/>
+              <w:right w:val="none" w:color="FFFFFF" w:sz="0"/>
+            </w:tcBorders>
+            <w:tcMar>
+              <w:top w:type="dxa" w:w="0"/>
+              <w:left w:type="dxa" w:w="0"/>
+              <w:bottom w:type="dxa" w:w="0"/>
+              <w:right w:type="dxa" w:w="0"/>
+            </w:tcMar>
+            <w:vAlign w:val="top"/>
+          </w:tcPr>
+          <w:p>
+            <w:pPr>
+              <w:spacing w:after="0" w:before="0"/>
+            </w:pPr>
+            <w:r>
+              <w:rPr>
+                <w:rFonts w:ascii="Calibri" w:cs="Calibri" w:eastAsia="Calibri" w:hAnsi="Calibri"/>
+                <w:color w:val="000000"/>
+                <w:sz w:val="22"/>
+                <w:szCs w:val="22"/>
+              </w:rPr>
+              <w:t xml:space="preserve"/>
+            </w:r>
+          </w:p>
+        </w:tc>
+      </w:tr>
+      <w:tr>
+        <w:trPr>
+          <w:cantSplit/>
+          <w:trHeight w:val="420" w:hRule="atLeast"/>
+        </w:trPr>
+        <w:tc>
+          <w:tcPr>
+            <w:tcW w:type="dxa" w:w="10206"/>
+            <w:tcBorders>
+              <w:top w:val="none" w:color="FFFFFF" w:sz="0"/>
+              <w:left w:val="none" w:color="FFFFFF" w:sz="0"/>
+              <w:bottom w:val="single" w:color="9AA6C4" w:sz="4"/>
+              <w:right w:val="none" w:color="FFFFFF" w:sz="0"/>
+            </w:tcBorders>
+            <w:tcMar>
+              <w:top w:type="dxa" w:w="0"/>
+              <w:left w:type="dxa" w:w="0"/>
+              <w:bottom w:type="dxa" w:w="0"/>
+              <w:right w:type="dxa" w:w="0"/>
+            </w:tcMar>
+            <w:vAlign w:val="top"/>
+          </w:tcPr>
+          <w:p>
+            <w:pPr>
+              <w:spacing w:after="0" w:before="0"/>
+            </w:pPr>
+            <w:r>
+              <w:rPr>
+                <w:rFonts w:ascii="Calibri" w:cs="Calibri" w:eastAsia="Calibri" w:hAnsi="Calibri"/>
+                <w:color w:val="000000"/>
+                <w:sz w:val="22"/>
+                <w:szCs w:val="22"/>
+              </w:rPr>
+              <w:t xml:space="preserve"/>
+            </w:r>
+          </w:p>
+        </w:tc>
+      </w:tr>
+    </w:tbl>
+    <w:p>
+      <w:pPr>
+        <w:spacing w:after="40" w:before="0"/>
+      </w:pPr>
+      <w:r>
+        <w:rPr>
+          <w:rFonts w:ascii="Calibri" w:cs="Calibri" w:eastAsia="Calibri" w:hAnsi="Calibri"/>
+          <w:color w:val="1E2761"/>
+          <w:sz w:val="21"/>
+          <w:szCs w:val="21"/>
+        </w:rPr>
+        <w:t xml:space="preserve">•  </w:t>
+      </w:r>
+      <w:r>
+        <w:rPr>
+          <w:rFonts w:ascii="Calibri" w:cs="Calibri" w:eastAsia="Calibri" w:hAnsi="Calibri"/>
+          <w:b/>
+          <w:bCs/>
+          <w:color w:val="000000"/>
+          <w:sz w:val="21"/>
+          <w:szCs w:val="21"/>
+        </w:rPr>
+        <w:t xml:space="preserve">Was wünscht sich Kafka, ohne es direkt zu fordern? </w:t>
+      </w:r>
+      <w:r>
+        <w:rPr>
+          <w:rFonts w:ascii="Calibri" w:cs="Calibri" w:eastAsia="Calibri" w:hAnsi="Calibri"/>
+          <w:color w:val="5B6B8C"/>
+          <w:sz w:val="19"/>
+          <w:szCs w:val="19"/>
+        </w:rPr>
+        <w:t xml:space="preserve">(Achte auf „Wort“, „Hand“ und „Blick“ (Z. 5 f.).)</w:t>
+      </w:r>
+    </w:p>
+    <w:tbl>
+      <w:tblPr>
+        <w:tblW w:type="dxa" w:w="10206"/>
+        <w:tblBorders>
+          <w:top w:val="single" w:color="auto" w:sz="4"/>
+          <w:left w:val="single" w:color="auto" w:sz="4"/>
+          <w:bottom w:val="single" w:color="auto" w:sz="4"/>
+          <w:right w:val="single" w:color="auto" w:sz="4"/>
+          <w:insideH w:val="single" w:color="auto" w:sz="4"/>
+          <w:insideV w:val="single" w:color="auto" w:sz="4"/>
+        </w:tblBorders>
+      </w:tblPr>
+      <w:tblGrid>
+        <w:gridCol w:w="10206"/>
+      </w:tblGrid>
+      <w:tr>
+        <w:trPr>
+          <w:cantSplit/>
+          <w:trHeight w:val="420" w:hRule="atLeast"/>
+        </w:trPr>
+        <w:tc>
+          <w:tcPr>
+            <w:tcW w:type="dxa" w:w="10206"/>
+            <w:tcBorders>
+              <w:top w:val="none" w:color="FFFFFF" w:sz="0"/>
+              <w:left w:val="none" w:color="FFFFFF" w:sz="0"/>
+              <w:bottom w:val="single" w:color="9AA6C4" w:sz="4"/>
+              <w:right w:val="none" w:color="FFFFFF" w:sz="0"/>
+            </w:tcBorders>
+            <w:tcMar>
+              <w:top w:type="dxa" w:w="0"/>
+              <w:left w:type="dxa" w:w="0"/>
+              <w:bottom w:type="dxa" w:w="0"/>
+              <w:right w:type="dxa" w:w="0"/>
+            </w:tcMar>
+            <w:vAlign w:val="top"/>
+          </w:tcPr>
+          <w:p>
+            <w:pPr>
+              <w:spacing w:after="0" w:before="0"/>
+            </w:pPr>
+            <w:r>
+              <w:rPr>
+                <w:rFonts w:ascii="Calibri" w:cs="Calibri" w:eastAsia="Calibri" w:hAnsi="Calibri"/>
+                <w:color w:val="000000"/>
+                <w:sz w:val="22"/>
+                <w:szCs w:val="22"/>
+              </w:rPr>
+              <w:t xml:space="preserve"/>
+            </w:r>
+          </w:p>
+        </w:tc>
+      </w:tr>
+      <w:tr>
+        <w:trPr>
+          <w:cantSplit/>
+          <w:trHeight w:val="420" w:hRule="atLeast"/>
+        </w:trPr>
+        <w:tc>
+          <w:tcPr>
+            <w:tcW w:type="dxa" w:w="10206"/>
+            <w:tcBorders>
+              <w:top w:val="none" w:color="FFFFFF" w:sz="0"/>
+              <w:left w:val="none" w:color="FFFFFF" w:sz="0"/>
+              <w:bottom w:val="single" w:color="9AA6C4" w:sz="4"/>
+              <w:right w:val="none" w:color="FFFFFF" w:sz="0"/>
+            </w:tcBorders>
+            <w:tcMar>
+              <w:top w:type="dxa" w:w="0"/>
+              <w:left w:type="dxa" w:w="0"/>
+              <w:bottom w:type="dxa" w:w="0"/>
+              <w:right w:type="dxa" w:w="0"/>
+            </w:tcMar>
+            <w:vAlign w:val="top"/>
+          </w:tcPr>
+          <w:p>
+            <w:pPr>
+              <w:spacing w:after="0" w:before="0"/>
+            </w:pPr>
+            <w:r>
+              <w:rPr>
+                <w:rFonts w:ascii="Calibri" w:cs="Calibri" w:eastAsia="Calibri" w:hAnsi="Calibri"/>
+                <w:color w:val="000000"/>
+                <w:sz w:val="22"/>
+                <w:szCs w:val="22"/>
+              </w:rPr>
+              <w:t xml:space="preserve"/>
+            </w:r>
+          </w:p>
+        </w:tc>
+      </w:tr>
+      <w:tr>
+        <w:trPr>
+          <w:cantSplit/>
+          <w:trHeight w:val="420" w:hRule="atLeast"/>
+        </w:trPr>
+        <w:tc>
+          <w:tcPr>
+            <w:tcW w:type="dxa" w:w="10206"/>
+            <w:tcBorders>
+              <w:top w:val="none" w:color="FFFFFF" w:sz="0"/>
+              <w:left w:val="none" w:color="FFFFFF" w:sz="0"/>
+              <w:bottom w:val="single" w:color="9AA6C4" w:sz="4"/>
+              <w:right w:val="none" w:color="FFFFFF" w:sz="0"/>
+            </w:tcBorders>
+            <w:tcMar>
+              <w:top w:type="dxa" w:w="0"/>
+              <w:left w:type="dxa" w:w="0"/>
+              <w:bottom w:type="dxa" w:w="0"/>
+              <w:right w:type="dxa" w:w="0"/>
+            </w:tcMar>
+            <w:vAlign w:val="top"/>
+          </w:tcPr>
+          <w:p>
+            <w:pPr>
+              <w:spacing w:after="0" w:before="0"/>
+            </w:pPr>
+            <w:r>
+              <w:rPr>
+                <w:rFonts w:ascii="Calibri" w:cs="Calibri" w:eastAsia="Calibri" w:hAnsi="Calibri"/>
+                <w:color w:val="000000"/>
+                <w:sz w:val="22"/>
+                <w:szCs w:val="22"/>
+              </w:rPr>
+              <w:t xml:space="preserve"/>
+            </w:r>
+          </w:p>
+        </w:tc>
+      </w:tr>
+    </w:tbl>
+    <w:p>
+      <w:pPr>
+        <w:spacing w:after="40" w:before="0"/>
+      </w:pPr>
+      <w:r>
+        <w:rPr>
+          <w:rFonts w:ascii="Calibri" w:cs="Calibri" w:eastAsia="Calibri" w:hAnsi="Calibri"/>
+          <w:color w:val="1E2761"/>
+          <w:sz w:val="21"/>
+          <w:szCs w:val="21"/>
+        </w:rPr>
+        <w:t xml:space="preserve">•  </w:t>
+      </w:r>
+      <w:r>
+        <w:rPr>
+          <w:rFonts w:ascii="Calibri" w:cs="Calibri" w:eastAsia="Calibri" w:hAnsi="Calibri"/>
+          <w:b/>
+          <w:bCs/>
+          <w:color w:val="000000"/>
+          <w:sz w:val="21"/>
+          <w:szCs w:val="21"/>
+        </w:rPr>
+        <w:t xml:space="preserve">Warum betont Kafka, dass der Vater keine Schuld hat? </w:t>
+      </w:r>
+      <w:r>
+        <w:rPr>
+          <w:rFonts w:ascii="Calibri" w:cs="Calibri" w:eastAsia="Calibri" w:hAnsi="Calibri"/>
+          <w:color w:val="5B6B8C"/>
+          <w:sz w:val="19"/>
+          <w:szCs w:val="19"/>
+        </w:rPr>
+        <w:t xml:space="preserve">(Achte auf „niemals … an eine Schuld Deinerseits“ (Z. 1 f.).)</w:t>
+      </w:r>
+    </w:p>
+    <w:tbl>
+      <w:tblPr>
+        <w:tblW w:type="dxa" w:w="10206"/>
+        <w:tblBorders>
+          <w:top w:val="single" w:color="auto" w:sz="4"/>
+          <w:left w:val="single" w:color="auto" w:sz="4"/>
+          <w:bottom w:val="single" w:color="auto" w:sz="4"/>
+          <w:right w:val="single" w:color="auto" w:sz="4"/>
+          <w:insideH w:val="single" w:color="auto" w:sz="4"/>
+          <w:insideV w:val="single" w:color="auto" w:sz="4"/>
+        </w:tblBorders>
+      </w:tblPr>
+      <w:tblGrid>
+        <w:gridCol w:w="10206"/>
+      </w:tblGrid>
+      <w:tr>
+        <w:trPr>
+          <w:cantSplit/>
+          <w:trHeight w:val="420" w:hRule="atLeast"/>
+        </w:trPr>
+        <w:tc>
+          <w:tcPr>
+            <w:tcW w:type="dxa" w:w="10206"/>
+            <w:tcBorders>
+              <w:top w:val="none" w:color="FFFFFF" w:sz="0"/>
+              <w:left w:val="none" w:color="FFFFFF" w:sz="0"/>
+              <w:bottom w:val="single" w:color="9AA6C4" w:sz="4"/>
+              <w:right w:val="none" w:color="FFFFFF" w:sz="0"/>
+            </w:tcBorders>
+            <w:tcMar>
+              <w:top w:type="dxa" w:w="0"/>
+              <w:left w:type="dxa" w:w="0"/>
+              <w:bottom w:type="dxa" w:w="0"/>
+              <w:right w:type="dxa" w:w="0"/>
+            </w:tcMar>
+            <w:vAlign w:val="top"/>
+          </w:tcPr>
+          <w:p>
+            <w:pPr>
+              <w:spacing w:after="0" w:before="0"/>
+            </w:pPr>
+            <w:r>
+              <w:rPr>
+                <w:rFonts w:ascii="Calibri" w:cs="Calibri" w:eastAsia="Calibri" w:hAnsi="Calibri"/>
+                <w:color w:val="000000"/>
+                <w:sz w:val="22"/>
+                <w:szCs w:val="22"/>
+              </w:rPr>
+              <w:t xml:space="preserve"/>
+            </w:r>
+          </w:p>
+        </w:tc>
+      </w:tr>
+      <w:tr>
+        <w:trPr>
+          <w:cantSplit/>
+          <w:trHeight w:val="420" w:hRule="atLeast"/>
+        </w:trPr>
+        <w:tc>
+          <w:tcPr>
+            <w:tcW w:type="dxa" w:w="10206"/>
+            <w:tcBorders>
+              <w:top w:val="none" w:color="FFFFFF" w:sz="0"/>
+              <w:left w:val="none" w:color="FFFFFF" w:sz="0"/>
+              <w:bottom w:val="single" w:color="9AA6C4" w:sz="4"/>
+              <w:right w:val="none" w:color="FFFFFF" w:sz="0"/>
+            </w:tcBorders>
+            <w:tcMar>
+              <w:top w:type="dxa" w:w="0"/>
+              <w:left w:type="dxa" w:w="0"/>
+              <w:bottom w:type="dxa" w:w="0"/>
+              <w:right w:type="dxa" w:w="0"/>
+            </w:tcMar>
+            <w:vAlign w:val="top"/>
+          </w:tcPr>
+          <w:p>
+            <w:pPr>
+              <w:spacing w:after="0" w:before="0"/>
+            </w:pPr>
+            <w:r>
+              <w:rPr>
+                <w:rFonts w:ascii="Calibri" w:cs="Calibri" w:eastAsia="Calibri" w:hAnsi="Calibri"/>
+                <w:color w:val="000000"/>
+                <w:sz w:val="22"/>
+                <w:szCs w:val="22"/>
+              </w:rPr>
+              <w:t xml:space="preserve"/>
+            </w:r>
+          </w:p>
+        </w:tc>
+      </w:tr>
+      <w:tr>
+        <w:trPr>
+          <w:cantSplit/>
+          <w:trHeight w:val="420" w:hRule="atLeast"/>
+        </w:trPr>
+        <w:tc>
+          <w:tcPr>
+            <w:tcW w:type="dxa" w:w="10206"/>
+            <w:tcBorders>
+              <w:top w:val="none" w:color="FFFFFF" w:sz="0"/>
+              <w:left w:val="none" w:color="FFFFFF" w:sz="0"/>
+              <w:bottom w:val="single" w:color="9AA6C4" w:sz="4"/>
+              <w:right w:val="none" w:color="FFFFFF" w:sz="0"/>
+            </w:tcBorders>
+            <w:tcMar>
+              <w:top w:type="dxa" w:w="0"/>
+              <w:left w:type="dxa" w:w="0"/>
+              <w:bottom w:type="dxa" w:w="0"/>
+              <w:right w:type="dxa" w:w="0"/>
+            </w:tcMar>
+            <w:vAlign w:val="top"/>
+          </w:tcPr>
+          <w:p>
+            <w:pPr>
+              <w:spacing w:after="0" w:before="0"/>
+            </w:pPr>
+            <w:r>
+              <w:rPr>
+                <w:rFonts w:ascii="Calibri" w:cs="Calibri" w:eastAsia="Calibri" w:hAnsi="Calibri"/>
+                <w:color w:val="000000"/>
+                <w:sz w:val="22"/>
+                <w:szCs w:val="22"/>
+              </w:rPr>
+              <w:t xml:space="preserve"/>
+            </w:r>
+          </w:p>
+        </w:tc>
+      </w:tr>
+    </w:tbl>
+    <w:tbl>
+      <w:tblPr>
+        <w:tblW w:type="dxa" w:w="10206"/>
+        <w:tblBorders>
+          <w:top w:val="single" w:color="auto" w:sz="4"/>
+          <w:left w:val="single" w:color="auto" w:sz="4"/>
+          <w:bottom w:val="single" w:color="auto" w:sz="4"/>
+          <w:right w:val="single" w:color="auto" w:sz="4"/>
+          <w:insideH w:val="single" w:color="auto" w:sz="4"/>
+          <w:insideV w:val="single" w:color="auto" w:sz="4"/>
+        </w:tblBorders>
+      </w:tblPr>
+      <w:tblGrid>
+        <w:gridCol w:w="10206"/>
+      </w:tblGrid>
+      <w:tr>
+        <w:trPr>
+          <w:cantSplit/>
         </w:trPr>
         <w:tc>
           <w:tcPr>
@@ -1635,7 +2117,7 @@
     <w:p>
       <w:pPr>
         <w:keepNext/>
-        <w:spacing w:after="50" w:before="160"/>
+        <w:spacing w:after="40" w:before="100"/>
       </w:pPr>
       <w:r>
         <w:rPr>
@@ -1762,7 +2244,7 @@
             <w:tr>
               <w:trPr>
                 <w:cantSplit/>
-                <w:trHeight w:val="440" w:hRule="atLeast"/>
+                <w:trHeight w:val="420" w:hRule="atLeast"/>
               </w:trPr>
               <w:tc>
                 <w:tcPr>
@@ -1800,7 +2282,7 @@
             <w:tr>
               <w:trPr>
                 <w:cantSplit/>
-                <w:trHeight w:val="440" w:hRule="atLeast"/>
+                <w:trHeight w:val="420" w:hRule="atLeast"/>
               </w:trPr>
               <w:tc>
                 <w:tcPr>
@@ -1838,7 +2320,126 @@
             <w:tr>
               <w:trPr>
                 <w:cantSplit/>
-                <w:trHeight w:val="440" w:hRule="atLeast"/>
+                <w:trHeight w:val="420" w:hRule="atLeast"/>
+              </w:trPr>
+              <w:tc>
+                <w:tcPr>
+                  <w:tcW w:type="dxa" w:w="4783"/>
+                  <w:tcBorders>
+                    <w:top w:val="none" w:color="FFFFFF" w:sz="0"/>
+                    <w:left w:val="none" w:color="FFFFFF" w:sz="0"/>
+                    <w:bottom w:val="single" w:color="9AA6C4" w:sz="4"/>
+                    <w:right w:val="none" w:color="FFFFFF" w:sz="0"/>
+                  </w:tcBorders>
+                  <w:tcMar>
+                    <w:top w:type="dxa" w:w="0"/>
+                    <w:left w:type="dxa" w:w="0"/>
+                    <w:bottom w:type="dxa" w:w="0"/>
+                    <w:right w:type="dxa" w:w="0"/>
+                  </w:tcMar>
+                  <w:vAlign w:val="top"/>
+                </w:tcPr>
+                <w:p>
+                  <w:pPr>
+                    <w:spacing w:after="0" w:before="0"/>
+                  </w:pPr>
+                  <w:r>
+                    <w:rPr>
+                      <w:rFonts w:ascii="Calibri" w:cs="Calibri" w:eastAsia="Calibri" w:hAnsi="Calibri"/>
+                      <w:color w:val="000000"/>
+                      <w:sz w:val="22"/>
+                      <w:szCs w:val="22"/>
+                    </w:rPr>
+                    <w:t xml:space="preserve"/>
+                  </w:r>
+                </w:p>
+              </w:tc>
+            </w:tr>
+          </w:tbl>
+          <w:p>
+            <w:pPr>
+              <w:spacing w:after="0" w:before="0"/>
+            </w:pPr>
+            <w:r>
+              <w:rPr>
+                <w:rFonts w:ascii="Calibri" w:cs="Calibri" w:eastAsia="Calibri" w:hAnsi="Calibri"/>
+                <w:color w:val="000000"/>
+                <w:sz w:val="22"/>
+                <w:szCs w:val="22"/>
+              </w:rPr>
+              <w:t xml:space="preserve"/>
+            </w:r>
+          </w:p>
+        </w:tc>
+        <w:tc>
+          <w:tcPr>
+            <w:tcW w:type="dxa" w:w="5103"/>
+            <w:tcBorders>
+              <w:top w:val="single" w:color="B9C6E8" w:sz="6"/>
+              <w:left w:val="single" w:color="B9C6E8" w:sz="6"/>
+              <w:bottom w:val="single" w:color="B9C6E8" w:sz="6"/>
+              <w:right w:val="single" w:color="B9C6E8" w:sz="6"/>
+            </w:tcBorders>
+            <w:shd w:fill="FFFFFF" w:color="auto" w:val="clear"/>
+            <w:tcMar>
+              <w:top w:type="dxa" w:w="80"/>
+              <w:left w:type="dxa" w:w="140"/>
+              <w:bottom w:type="dxa" w:w="80"/>
+              <w:right w:type="dxa" w:w="140"/>
+            </w:tcMar>
+            <w:vAlign w:val="top"/>
+          </w:tcPr>
+          <w:p>
+            <w:pPr>
+              <w:spacing w:after="10" w:before="0"/>
+            </w:pPr>
+            <w:r>
+              <w:rPr>
+                <w:rFonts w:ascii="Calibri" w:cs="Calibri" w:eastAsia="Calibri" w:hAnsi="Calibri"/>
+                <w:b/>
+                <w:bCs/>
+                <w:color w:val="1E2761"/>
+                <w:sz w:val="20"/>
+                <w:szCs w:val="20"/>
+              </w:rPr>
+              <w:t xml:space="preserve">[ SELBSTKUNDGABE ]</w:t>
+            </w:r>
+          </w:p>
+          <w:p>
+            <w:pPr>
+              <w:spacing w:after="0" w:before="0"/>
+            </w:pPr>
+            <w:r>
+              <w:rPr>
+                <w:rFonts w:ascii="Calibri" w:cs="Calibri" w:eastAsia="Calibri" w:hAnsi="Calibri"/>
+                <w:i/>
+                <w:iCs/>
+                <w:color w:val="5B6B8C"/>
+                <w:sz w:val="17"/>
+                <w:szCs w:val="17"/>
+              </w:rPr>
+              <w:t xml:space="preserve">Was zeigt er von sich?</w:t>
+            </w:r>
+          </w:p>
+          <w:tbl>
+            <w:tblPr>
+              <w:tblW w:type="dxa" w:w="4783"/>
+              <w:tblBorders>
+                <w:top w:val="single" w:color="auto" w:sz="4"/>
+                <w:left w:val="single" w:color="auto" w:sz="4"/>
+                <w:bottom w:val="single" w:color="auto" w:sz="4"/>
+                <w:right w:val="single" w:color="auto" w:sz="4"/>
+                <w:insideH w:val="single" w:color="auto" w:sz="4"/>
+                <w:insideV w:val="single" w:color="auto" w:sz="4"/>
+              </w:tblBorders>
+            </w:tblPr>
+            <w:tblGrid>
+              <w:gridCol w:w="4783"/>
+            </w:tblGrid>
+            <w:tr>
+              <w:trPr>
+                <w:cantSplit/>
+                <w:trHeight w:val="420" w:hRule="atLeast"/>
               </w:trPr>
               <w:tc>
                 <w:tcPr>
@@ -1876,126 +2477,7 @@
             <w:tr>
               <w:trPr>
                 <w:cantSplit/>
-                <w:trHeight w:val="440" w:hRule="atLeast"/>
-              </w:trPr>
-              <w:tc>
-                <w:tcPr>
-                  <w:tcW w:type="dxa" w:w="4783"/>
-                  <w:tcBorders>
-                    <w:top w:val="none" w:color="FFFFFF" w:sz="0"/>
-                    <w:left w:val="none" w:color="FFFFFF" w:sz="0"/>
-                    <w:bottom w:val="single" w:color="9AA6C4" w:sz="4"/>
-                    <w:right w:val="none" w:color="FFFFFF" w:sz="0"/>
-                  </w:tcBorders>
-                  <w:tcMar>
-                    <w:top w:type="dxa" w:w="0"/>
-                    <w:left w:type="dxa" w:w="0"/>
-                    <w:bottom w:type="dxa" w:w="0"/>
-                    <w:right w:type="dxa" w:w="0"/>
-                  </w:tcMar>
-                  <w:vAlign w:val="top"/>
-                </w:tcPr>
-                <w:p>
-                  <w:pPr>
-                    <w:spacing w:after="0" w:before="0"/>
-                  </w:pPr>
-                  <w:r>
-                    <w:rPr>
-                      <w:rFonts w:ascii="Calibri" w:cs="Calibri" w:eastAsia="Calibri" w:hAnsi="Calibri"/>
-                      <w:color w:val="000000"/>
-                      <w:sz w:val="22"/>
-                      <w:szCs w:val="22"/>
-                    </w:rPr>
-                    <w:t xml:space="preserve"/>
-                  </w:r>
-                </w:p>
-              </w:tc>
-            </w:tr>
-          </w:tbl>
-          <w:p>
-            <w:pPr>
-              <w:spacing w:after="0" w:before="0"/>
-            </w:pPr>
-            <w:r>
-              <w:rPr>
-                <w:rFonts w:ascii="Calibri" w:cs="Calibri" w:eastAsia="Calibri" w:hAnsi="Calibri"/>
-                <w:color w:val="000000"/>
-                <w:sz w:val="22"/>
-                <w:szCs w:val="22"/>
-              </w:rPr>
-              <w:t xml:space="preserve"/>
-            </w:r>
-          </w:p>
-        </w:tc>
-        <w:tc>
-          <w:tcPr>
-            <w:tcW w:type="dxa" w:w="5103"/>
-            <w:tcBorders>
-              <w:top w:val="single" w:color="B9C6E8" w:sz="6"/>
-              <w:left w:val="single" w:color="B9C6E8" w:sz="6"/>
-              <w:bottom w:val="single" w:color="B9C6E8" w:sz="6"/>
-              <w:right w:val="single" w:color="B9C6E8" w:sz="6"/>
-            </w:tcBorders>
-            <w:shd w:fill="FFFFFF" w:color="auto" w:val="clear"/>
-            <w:tcMar>
-              <w:top w:type="dxa" w:w="80"/>
-              <w:left w:type="dxa" w:w="140"/>
-              <w:bottom w:type="dxa" w:w="80"/>
-              <w:right w:type="dxa" w:w="140"/>
-            </w:tcMar>
-            <w:vAlign w:val="top"/>
-          </w:tcPr>
-          <w:p>
-            <w:pPr>
-              <w:spacing w:after="10" w:before="0"/>
-            </w:pPr>
-            <w:r>
-              <w:rPr>
-                <w:rFonts w:ascii="Calibri" w:cs="Calibri" w:eastAsia="Calibri" w:hAnsi="Calibri"/>
-                <w:b/>
-                <w:bCs/>
-                <w:color w:val="1E2761"/>
-                <w:sz w:val="20"/>
-                <w:szCs w:val="20"/>
-              </w:rPr>
-              <w:t xml:space="preserve">[ SELBSTKUNDGABE ]</w:t>
-            </w:r>
-          </w:p>
-          <w:p>
-            <w:pPr>
-              <w:spacing w:after="0" w:before="0"/>
-            </w:pPr>
-            <w:r>
-              <w:rPr>
-                <w:rFonts w:ascii="Calibri" w:cs="Calibri" w:eastAsia="Calibri" w:hAnsi="Calibri"/>
-                <w:i/>
-                <w:iCs/>
-                <w:color w:val="5B6B8C"/>
-                <w:sz w:val="17"/>
-                <w:szCs w:val="17"/>
-              </w:rPr>
-              <w:t xml:space="preserve">Was zeigt er von sich?</w:t>
-            </w:r>
-          </w:p>
-          <w:tbl>
-            <w:tblPr>
-              <w:tblW w:type="dxa" w:w="4783"/>
-              <w:tblBorders>
-                <w:top w:val="single" w:color="auto" w:sz="4"/>
-                <w:left w:val="single" w:color="auto" w:sz="4"/>
-                <w:bottom w:val="single" w:color="auto" w:sz="4"/>
-                <w:right w:val="single" w:color="auto" w:sz="4"/>
-                <w:insideH w:val="single" w:color="auto" w:sz="4"/>
-                <w:insideV w:val="single" w:color="auto" w:sz="4"/>
-              </w:tblBorders>
-            </w:tblPr>
-            <w:tblGrid>
-              <w:gridCol w:w="4783"/>
-            </w:tblGrid>
-            <w:tr>
-              <w:trPr>
-                <w:cantSplit/>
-                <w:trHeight w:val="440" w:hRule="atLeast"/>
+                <w:trHeight w:val="420" w:hRule="atLeast"/>
               </w:trPr>
               <w:tc>
                 <w:tcPr>
@@ -2033,7 +2515,131 @@
             <w:tr>
               <w:trPr>
                 <w:cantSplit/>
-                <w:trHeight w:val="440" w:hRule="atLeast"/>
+                <w:trHeight w:val="420" w:hRule="atLeast"/>
+              </w:trPr>
+              <w:tc>
+                <w:tcPr>
+                  <w:tcW w:type="dxa" w:w="4783"/>
+                  <w:tcBorders>
+                    <w:top w:val="none" w:color="FFFFFF" w:sz="0"/>
+                    <w:left w:val="none" w:color="FFFFFF" w:sz="0"/>
+                    <w:bottom w:val="single" w:color="9AA6C4" w:sz="4"/>
+                    <w:right w:val="none" w:color="FFFFFF" w:sz="0"/>
+                  </w:tcBorders>
+                  <w:tcMar>
+                    <w:top w:type="dxa" w:w="0"/>
+                    <w:left w:type="dxa" w:w="0"/>
+                    <w:bottom w:type="dxa" w:w="0"/>
+                    <w:right w:type="dxa" w:w="0"/>
+                  </w:tcMar>
+                  <w:vAlign w:val="top"/>
+                </w:tcPr>
+                <w:p>
+                  <w:pPr>
+                    <w:spacing w:after="0" w:before="0"/>
+                  </w:pPr>
+                  <w:r>
+                    <w:rPr>
+                      <w:rFonts w:ascii="Calibri" w:cs="Calibri" w:eastAsia="Calibri" w:hAnsi="Calibri"/>
+                      <w:color w:val="000000"/>
+                      <w:sz w:val="22"/>
+                      <w:szCs w:val="22"/>
+                    </w:rPr>
+                    <w:t xml:space="preserve"/>
+                  </w:r>
+                </w:p>
+              </w:tc>
+            </w:tr>
+          </w:tbl>
+          <w:p>
+            <w:pPr>
+              <w:spacing w:after="0" w:before="0"/>
+            </w:pPr>
+            <w:r>
+              <w:rPr>
+                <w:rFonts w:ascii="Calibri" w:cs="Calibri" w:eastAsia="Calibri" w:hAnsi="Calibri"/>
+                <w:color w:val="000000"/>
+                <w:sz w:val="22"/>
+                <w:szCs w:val="22"/>
+              </w:rPr>
+              <w:t xml:space="preserve"/>
+            </w:r>
+          </w:p>
+        </w:tc>
+      </w:tr>
+      <w:tr>
+        <w:trPr>
+          <w:cantSplit/>
+        </w:trPr>
+        <w:tc>
+          <w:tcPr>
+            <w:tcW w:type="dxa" w:w="5103"/>
+            <w:tcBorders>
+              <w:top w:val="single" w:color="B9C6E8" w:sz="6"/>
+              <w:left w:val="single" w:color="B9C6E8" w:sz="6"/>
+              <w:bottom w:val="single" w:color="B9C6E8" w:sz="6"/>
+              <w:right w:val="single" w:color="B9C6E8" w:sz="6"/>
+            </w:tcBorders>
+            <w:shd w:fill="FFFFFF" w:color="auto" w:val="clear"/>
+            <w:tcMar>
+              <w:top w:type="dxa" w:w="80"/>
+              <w:left w:type="dxa" w:w="140"/>
+              <w:bottom w:type="dxa" w:w="80"/>
+              <w:right w:type="dxa" w:w="140"/>
+            </w:tcMar>
+            <w:vAlign w:val="top"/>
+          </w:tcPr>
+          <w:p>
+            <w:pPr>
+              <w:spacing w:after="10" w:before="0"/>
+            </w:pPr>
+            <w:r>
+              <w:rPr>
+                <w:rFonts w:ascii="Calibri" w:cs="Calibri" w:eastAsia="Calibri" w:hAnsi="Calibri"/>
+                <w:b/>
+                <w:bCs/>
+                <w:color w:val="1E2761"/>
+                <w:sz w:val="20"/>
+                <w:szCs w:val="20"/>
+              </w:rPr>
+              <w:t xml:space="preserve">[ BEZIEHUNG ]</w:t>
+            </w:r>
+          </w:p>
+          <w:p>
+            <w:pPr>
+              <w:spacing w:after="0" w:before="0"/>
+            </w:pPr>
+            <w:r>
+              <w:rPr>
+                <w:rFonts w:ascii="Calibri" w:cs="Calibri" w:eastAsia="Calibri" w:hAnsi="Calibri"/>
+                <w:i/>
+                <w:iCs/>
+                <w:color w:val="5B6B8C"/>
+                <w:sz w:val="17"/>
+                <w:szCs w:val="17"/>
+              </w:rPr>
+              <w:t xml:space="preserve">Wie steht er zum Vater?</w:t>
+            </w:r>
+          </w:p>
+          <w:tbl>
+            <w:tblPr>
+              <w:tblW w:type="dxa" w:w="4783"/>
+              <w:tblBorders>
+                <w:top w:val="single" w:color="auto" w:sz="4"/>
+                <w:left w:val="single" w:color="auto" w:sz="4"/>
+                <w:bottom w:val="single" w:color="auto" w:sz="4"/>
+                <w:right w:val="single" w:color="auto" w:sz="4"/>
+                <w:insideH w:val="single" w:color="auto" w:sz="4"/>
+                <w:insideV w:val="single" w:color="auto" w:sz="4"/>
+              </w:tblBorders>
+            </w:tblPr>
+            <w:tblGrid>
+              <w:gridCol w:w="4783"/>
+            </w:tblGrid>
+            <w:tr>
+              <w:trPr>
+                <w:cantSplit/>
+                <w:trHeight w:val="420" w:hRule="atLeast"/>
               </w:trPr>
               <w:tc>
                 <w:tcPr>
@@ -2071,7 +2677,7 @@
             <w:tr>
               <w:trPr>
                 <w:cantSplit/>
-                <w:trHeight w:val="440" w:hRule="atLeast"/>
+                <w:trHeight w:val="420" w:hRule="atLeast"/>
               </w:trPr>
               <w:tc>
                 <w:tcPr>
@@ -2109,131 +2715,7 @@
             <w:tr>
               <w:trPr>
                 <w:cantSplit/>
-                <w:trHeight w:val="440" w:hRule="atLeast"/>
-              </w:trPr>
-              <w:tc>
-                <w:tcPr>
-                  <w:tcW w:type="dxa" w:w="4783"/>
-                  <w:tcBorders>
-                    <w:top w:val="none" w:color="FFFFFF" w:sz="0"/>
-                    <w:left w:val="none" w:color="FFFFFF" w:sz="0"/>
-                    <w:bottom w:val="single" w:color="9AA6C4" w:sz="4"/>
-                    <w:right w:val="none" w:color="FFFFFF" w:sz="0"/>
-                  </w:tcBorders>
-                  <w:tcMar>
-                    <w:top w:type="dxa" w:w="0"/>
-                    <w:left w:type="dxa" w:w="0"/>
-                    <w:bottom w:type="dxa" w:w="0"/>
-                    <w:right w:type="dxa" w:w="0"/>
-                  </w:tcMar>
-                  <w:vAlign w:val="top"/>
-                </w:tcPr>
-                <w:p>
-                  <w:pPr>
-                    <w:spacing w:after="0" w:before="0"/>
-                  </w:pPr>
-                  <w:r>
-                    <w:rPr>
-                      <w:rFonts w:ascii="Calibri" w:cs="Calibri" w:eastAsia="Calibri" w:hAnsi="Calibri"/>
-                      <w:color w:val="000000"/>
-                      <w:sz w:val="22"/>
-                      <w:szCs w:val="22"/>
-                    </w:rPr>
-                    <w:t xml:space="preserve"/>
-                  </w:r>
-                </w:p>
-              </w:tc>
-            </w:tr>
-          </w:tbl>
-          <w:p>
-            <w:pPr>
-              <w:spacing w:after="0" w:before="0"/>
-            </w:pPr>
-            <w:r>
-              <w:rPr>
-                <w:rFonts w:ascii="Calibri" w:cs="Calibri" w:eastAsia="Calibri" w:hAnsi="Calibri"/>
-                <w:color w:val="000000"/>
-                <w:sz w:val="22"/>
-                <w:szCs w:val="22"/>
-              </w:rPr>
-              <w:t xml:space="preserve"/>
-            </w:r>
-          </w:p>
-        </w:tc>
-      </w:tr>
-      <w:tr>
-        <w:trPr>
-          <w:cantSplit/>
-        </w:trPr>
-        <w:tc>
-          <w:tcPr>
-            <w:tcW w:type="dxa" w:w="5103"/>
-            <w:tcBorders>
-              <w:top w:val="single" w:color="B9C6E8" w:sz="6"/>
-              <w:left w:val="single" w:color="B9C6E8" w:sz="6"/>
-              <w:bottom w:val="single" w:color="B9C6E8" w:sz="6"/>
-              <w:right w:val="single" w:color="B9C6E8" w:sz="6"/>
-            </w:tcBorders>
-            <w:shd w:fill="FFFFFF" w:color="auto" w:val="clear"/>
-            <w:tcMar>
-              <w:top w:type="dxa" w:w="80"/>
-              <w:left w:type="dxa" w:w="140"/>
-              <w:bottom w:type="dxa" w:w="80"/>
-              <w:right w:type="dxa" w:w="140"/>
-            </w:tcMar>
-            <w:vAlign w:val="top"/>
-          </w:tcPr>
-          <w:p>
-            <w:pPr>
-              <w:spacing w:after="10" w:before="0"/>
-            </w:pPr>
-            <w:r>
-              <w:rPr>
-                <w:rFonts w:ascii="Calibri" w:cs="Calibri" w:eastAsia="Calibri" w:hAnsi="Calibri"/>
-                <w:b/>
-                <w:bCs/>
-                <w:color w:val="1E2761"/>
-                <w:sz w:val="20"/>
-                <w:szCs w:val="20"/>
-              </w:rPr>
-              <w:t xml:space="preserve">[ BEZIEHUNG ]</w:t>
-            </w:r>
-          </w:p>
-          <w:p>
-            <w:pPr>
-              <w:spacing w:after="0" w:before="0"/>
-            </w:pPr>
-            <w:r>
-              <w:rPr>
-                <w:rFonts w:ascii="Calibri" w:cs="Calibri" w:eastAsia="Calibri" w:hAnsi="Calibri"/>
-                <w:i/>
-                <w:iCs/>
-                <w:color w:val="5B6B8C"/>
-                <w:sz w:val="17"/>
-                <w:szCs w:val="17"/>
-              </w:rPr>
-              <w:t xml:space="preserve">Wie steht er zum Vater?</w:t>
-            </w:r>
-          </w:p>
-          <w:tbl>
-            <w:tblPr>
-              <w:tblW w:type="dxa" w:w="4783"/>
-              <w:tblBorders>
-                <w:top w:val="single" w:color="auto" w:sz="4"/>
-                <w:left w:val="single" w:color="auto" w:sz="4"/>
-                <w:bottom w:val="single" w:color="auto" w:sz="4"/>
-                <w:right w:val="single" w:color="auto" w:sz="4"/>
-                <w:insideH w:val="single" w:color="auto" w:sz="4"/>
-                <w:insideV w:val="single" w:color="auto" w:sz="4"/>
-              </w:tblBorders>
-            </w:tblPr>
-            <w:tblGrid>
-              <w:gridCol w:w="4783"/>
-            </w:tblGrid>
-            <w:tr>
-              <w:trPr>
-                <w:cantSplit/>
-                <w:trHeight w:val="440" w:hRule="atLeast"/>
+                <w:trHeight w:val="420" w:hRule="atLeast"/>
               </w:trPr>
               <w:tc>
                 <w:tcPr>
@@ -2271,7 +2753,126 @@
             <w:tr>
               <w:trPr>
                 <w:cantSplit/>
-                <w:trHeight w:val="440" w:hRule="atLeast"/>
+                <w:trHeight w:val="420" w:hRule="atLeast"/>
+              </w:trPr>
+              <w:tc>
+                <w:tcPr>
+                  <w:tcW w:type="dxa" w:w="4783"/>
+                  <w:tcBorders>
+                    <w:top w:val="none" w:color="FFFFFF" w:sz="0"/>
+                    <w:left w:val="none" w:color="FFFFFF" w:sz="0"/>
+                    <w:bottom w:val="single" w:color="9AA6C4" w:sz="4"/>
+                    <w:right w:val="none" w:color="FFFFFF" w:sz="0"/>
+                  </w:tcBorders>
+                  <w:tcMar>
+                    <w:top w:type="dxa" w:w="0"/>
+                    <w:left w:type="dxa" w:w="0"/>
+                    <w:bottom w:type="dxa" w:w="0"/>
+                    <w:right w:type="dxa" w:w="0"/>
+                  </w:tcMar>
+                  <w:vAlign w:val="top"/>
+                </w:tcPr>
+                <w:p>
+                  <w:pPr>
+                    <w:spacing w:after="0" w:before="0"/>
+                  </w:pPr>
+                  <w:r>
+                    <w:rPr>
+                      <w:rFonts w:ascii="Calibri" w:cs="Calibri" w:eastAsia="Calibri" w:hAnsi="Calibri"/>
+                      <w:color w:val="000000"/>
+                      <w:sz w:val="22"/>
+                      <w:szCs w:val="22"/>
+                    </w:rPr>
+                    <w:t xml:space="preserve"/>
+                  </w:r>
+                </w:p>
+              </w:tc>
+            </w:tr>
+          </w:tbl>
+          <w:p>
+            <w:pPr>
+              <w:spacing w:after="0" w:before="0"/>
+            </w:pPr>
+            <w:r>
+              <w:rPr>
+                <w:rFonts w:ascii="Calibri" w:cs="Calibri" w:eastAsia="Calibri" w:hAnsi="Calibri"/>
+                <w:color w:val="000000"/>
+                <w:sz w:val="22"/>
+                <w:szCs w:val="22"/>
+              </w:rPr>
+              <w:t xml:space="preserve"/>
+            </w:r>
+          </w:p>
+        </w:tc>
+        <w:tc>
+          <w:tcPr>
+            <w:tcW w:type="dxa" w:w="5103"/>
+            <w:tcBorders>
+              <w:top w:val="single" w:color="D9534F" w:sz="12"/>
+              <w:left w:val="single" w:color="D9534F" w:sz="12"/>
+              <w:bottom w:val="single" w:color="D9534F" w:sz="12"/>
+              <w:right w:val="single" w:color="D9534F" w:sz="12"/>
+            </w:tcBorders>
+            <w:shd w:fill="FDECEA" w:color="auto" w:val="clear"/>
+            <w:tcMar>
+              <w:top w:type="dxa" w:w="80"/>
+              <w:left w:type="dxa" w:w="140"/>
+              <w:bottom w:type="dxa" w:w="80"/>
+              <w:right w:type="dxa" w:w="140"/>
+            </w:tcMar>
+            <w:vAlign w:val="top"/>
+          </w:tcPr>
+          <w:p>
+            <w:pPr>
+              <w:spacing w:after="10" w:before="0"/>
+            </w:pPr>
+            <w:r>
+              <w:rPr>
+                <w:rFonts w:ascii="Calibri" w:cs="Calibri" w:eastAsia="Calibri" w:hAnsi="Calibri"/>
+                <w:b/>
+                <w:bCs/>
+                <w:color w:val="D9534F"/>
+                <w:sz w:val="20"/>
+                <w:szCs w:val="20"/>
+              </w:rPr>
+              <w:t xml:space="preserve">[ APPELL ]</w:t>
+            </w:r>
+          </w:p>
+          <w:p>
+            <w:pPr>
+              <w:spacing w:after="0" w:before="0"/>
+            </w:pPr>
+            <w:r>
+              <w:rPr>
+                <w:rFonts w:ascii="Calibri" w:cs="Calibri" w:eastAsia="Calibri" w:hAnsi="Calibri"/>
+                <w:i/>
+                <w:iCs/>
+                <w:color w:val="5B6B8C"/>
+                <w:sz w:val="17"/>
+                <w:szCs w:val="17"/>
+              </w:rPr>
+              <w:t xml:space="preserve">Was soll der Vater tun? offen / verdeckt</w:t>
+            </w:r>
+          </w:p>
+          <w:tbl>
+            <w:tblPr>
+              <w:tblW w:type="dxa" w:w="4783"/>
+              <w:tblBorders>
+                <w:top w:val="single" w:color="auto" w:sz="4"/>
+                <w:left w:val="single" w:color="auto" w:sz="4"/>
+                <w:bottom w:val="single" w:color="auto" w:sz="4"/>
+                <w:right w:val="single" w:color="auto" w:sz="4"/>
+                <w:insideH w:val="single" w:color="auto" w:sz="4"/>
+                <w:insideV w:val="single" w:color="auto" w:sz="4"/>
+              </w:tblBorders>
+            </w:tblPr>
+            <w:tblGrid>
+              <w:gridCol w:w="4783"/>
+            </w:tblGrid>
+            <w:tr>
+              <w:trPr>
+                <w:cantSplit/>
+                <w:trHeight w:val="420" w:hRule="atLeast"/>
               </w:trPr>
               <w:tc>
                 <w:tcPr>
@@ -2309,7 +2910,7 @@
             <w:tr>
               <w:trPr>
                 <w:cantSplit/>
-                <w:trHeight w:val="440" w:hRule="atLeast"/>
+                <w:trHeight w:val="420" w:hRule="atLeast"/>
               </w:trPr>
               <w:tc>
                 <w:tcPr>
@@ -2347,7 +2948,7 @@
             <w:tr>
               <w:trPr>
                 <w:cantSplit/>
-                <w:trHeight w:val="440" w:hRule="atLeast"/>
+                <w:trHeight w:val="420" w:hRule="atLeast"/>
               </w:trPr>
               <w:tc>
                 <w:tcPr>
@@ -2385,7 +2986,7 @@
             <w:tr>
               <w:trPr>
                 <w:cantSplit/>
-                <w:trHeight w:val="440" w:hRule="atLeast"/>
+                <w:trHeight w:val="420" w:hRule="atLeast"/>
               </w:trPr>
               <w:tc>
                 <w:tcPr>
@@ -2436,283 +3037,12 @@
             </w:r>
           </w:p>
         </w:tc>
-        <w:tc>
-          <w:tcPr>
-            <w:tcW w:type="dxa" w:w="5103"/>
-            <w:tcBorders>
-              <w:top w:val="single" w:color="D9534F" w:sz="12"/>
-              <w:left w:val="single" w:color="D9534F" w:sz="12"/>
-              <w:bottom w:val="single" w:color="D9534F" w:sz="12"/>
-              <w:right w:val="single" w:color="D9534F" w:sz="12"/>
-            </w:tcBorders>
-            <w:shd w:fill="FDECEA" w:color="auto" w:val="clear"/>
-            <w:tcMar>
-              <w:top w:type="dxa" w:w="80"/>
-              <w:left w:type="dxa" w:w="140"/>
-              <w:bottom w:type="dxa" w:w="80"/>
-              <w:right w:type="dxa" w:w="140"/>
-            </w:tcMar>
-            <w:vAlign w:val="top"/>
-          </w:tcPr>
-          <w:p>
-            <w:pPr>
-              <w:spacing w:after="10" w:before="0"/>
-            </w:pPr>
-            <w:r>
-              <w:rPr>
-                <w:rFonts w:ascii="Calibri" w:cs="Calibri" w:eastAsia="Calibri" w:hAnsi="Calibri"/>
-                <w:b/>
-                <w:bCs/>
-                <w:color w:val="D9534F"/>
-                <w:sz w:val="20"/>
-                <w:szCs w:val="20"/>
-              </w:rPr>
-              <w:t xml:space="preserve">[ APPELL ]</w:t>
-            </w:r>
-          </w:p>
-          <w:p>
-            <w:pPr>
-              <w:spacing w:after="0" w:before="0"/>
-            </w:pPr>
-            <w:r>
-              <w:rPr>
-                <w:rFonts w:ascii="Calibri" w:cs="Calibri" w:eastAsia="Calibri" w:hAnsi="Calibri"/>
-                <w:i/>
-                <w:iCs/>
-                <w:color w:val="5B6B8C"/>
-                <w:sz w:val="17"/>
-                <w:szCs w:val="17"/>
-              </w:rPr>
-              <w:t xml:space="preserve">Was soll der Vater tun? offen / verdeckt</w:t>
-            </w:r>
-          </w:p>
-          <w:tbl>
-            <w:tblPr>
-              <w:tblW w:type="dxa" w:w="4783"/>
-              <w:tblBorders>
-                <w:top w:val="single" w:color="auto" w:sz="4"/>
-                <w:left w:val="single" w:color="auto" w:sz="4"/>
-                <w:bottom w:val="single" w:color="auto" w:sz="4"/>
-                <w:right w:val="single" w:color="auto" w:sz="4"/>
-                <w:insideH w:val="single" w:color="auto" w:sz="4"/>
-                <w:insideV w:val="single" w:color="auto" w:sz="4"/>
-              </w:tblBorders>
-            </w:tblPr>
-            <w:tblGrid>
-              <w:gridCol w:w="4783"/>
-            </w:tblGrid>
-            <w:tr>
-              <w:trPr>
-                <w:cantSplit/>
-                <w:trHeight w:val="440" w:hRule="atLeast"/>
-              </w:trPr>
-              <w:tc>
-                <w:tcPr>
-                  <w:tcW w:type="dxa" w:w="4783"/>
-                  <w:tcBorders>
-                    <w:top w:val="none" w:color="FFFFFF" w:sz="0"/>
-                    <w:left w:val="none" w:color="FFFFFF" w:sz="0"/>
-                    <w:bottom w:val="single" w:color="9AA6C4" w:sz="4"/>
-                    <w:right w:val="none" w:color="FFFFFF" w:sz="0"/>
-                  </w:tcBorders>
-                  <w:tcMar>
-                    <w:top w:type="dxa" w:w="0"/>
-                    <w:left w:type="dxa" w:w="0"/>
-                    <w:bottom w:type="dxa" w:w="0"/>
-                    <w:right w:type="dxa" w:w="0"/>
-                  </w:tcMar>
-                  <w:vAlign w:val="top"/>
-                </w:tcPr>
-                <w:p>
-                  <w:pPr>
-                    <w:spacing w:after="0" w:before="0"/>
-                  </w:pPr>
-                  <w:r>
-                    <w:rPr>
-                      <w:rFonts w:ascii="Calibri" w:cs="Calibri" w:eastAsia="Calibri" w:hAnsi="Calibri"/>
-                      <w:color w:val="000000"/>
-                      <w:sz w:val="22"/>
-                      <w:szCs w:val="22"/>
-                    </w:rPr>
-                    <w:t xml:space="preserve"/>
-                  </w:r>
-                </w:p>
-              </w:tc>
-            </w:tr>
-            <w:tr>
-              <w:trPr>
-                <w:cantSplit/>
-                <w:trHeight w:val="440" w:hRule="atLeast"/>
-              </w:trPr>
-              <w:tc>
-                <w:tcPr>
-                  <w:tcW w:type="dxa" w:w="4783"/>
-                  <w:tcBorders>
-                    <w:top w:val="none" w:color="FFFFFF" w:sz="0"/>
-                    <w:left w:val="none" w:color="FFFFFF" w:sz="0"/>
-                    <w:bottom w:val="single" w:color="9AA6C4" w:sz="4"/>
-                    <w:right w:val="none" w:color="FFFFFF" w:sz="0"/>
-                  </w:tcBorders>
-                  <w:tcMar>
-                    <w:top w:type="dxa" w:w="0"/>
-                    <w:left w:type="dxa" w:w="0"/>
-                    <w:bottom w:type="dxa" w:w="0"/>
-                    <w:right w:type="dxa" w:w="0"/>
-                  </w:tcMar>
-                  <w:vAlign w:val="top"/>
-                </w:tcPr>
-                <w:p>
-                  <w:pPr>
-                    <w:spacing w:after="0" w:before="0"/>
-                  </w:pPr>
-                  <w:r>
-                    <w:rPr>
-                      <w:rFonts w:ascii="Calibri" w:cs="Calibri" w:eastAsia="Calibri" w:hAnsi="Calibri"/>
-                      <w:color w:val="000000"/>
-                      <w:sz w:val="22"/>
-                      <w:szCs w:val="22"/>
-                    </w:rPr>
-                    <w:t xml:space="preserve"/>
-                  </w:r>
-                </w:p>
-              </w:tc>
-            </w:tr>
-            <w:tr>
-              <w:trPr>
-                <w:cantSplit/>
-                <w:trHeight w:val="440" w:hRule="atLeast"/>
-              </w:trPr>
-              <w:tc>
-                <w:tcPr>
-                  <w:tcW w:type="dxa" w:w="4783"/>
-                  <w:tcBorders>
-                    <w:top w:val="none" w:color="FFFFFF" w:sz="0"/>
-                    <w:left w:val="none" w:color="FFFFFF" w:sz="0"/>
-                    <w:bottom w:val="single" w:color="9AA6C4" w:sz="4"/>
-                    <w:right w:val="none" w:color="FFFFFF" w:sz="0"/>
-                  </w:tcBorders>
-                  <w:tcMar>
-                    <w:top w:type="dxa" w:w="0"/>
-                    <w:left w:type="dxa" w:w="0"/>
-                    <w:bottom w:type="dxa" w:w="0"/>
-                    <w:right w:type="dxa" w:w="0"/>
-                  </w:tcMar>
-                  <w:vAlign w:val="top"/>
-                </w:tcPr>
-                <w:p>
-                  <w:pPr>
-                    <w:spacing w:after="0" w:before="0"/>
-                  </w:pPr>
-                  <w:r>
-                    <w:rPr>
-                      <w:rFonts w:ascii="Calibri" w:cs="Calibri" w:eastAsia="Calibri" w:hAnsi="Calibri"/>
-                      <w:color w:val="000000"/>
-                      <w:sz w:val="22"/>
-                      <w:szCs w:val="22"/>
-                    </w:rPr>
-                    <w:t xml:space="preserve"/>
-                  </w:r>
-                </w:p>
-              </w:tc>
-            </w:tr>
-            <w:tr>
-              <w:trPr>
-                <w:cantSplit/>
-                <w:trHeight w:val="440" w:hRule="atLeast"/>
-              </w:trPr>
-              <w:tc>
-                <w:tcPr>
-                  <w:tcW w:type="dxa" w:w="4783"/>
-                  <w:tcBorders>
-                    <w:top w:val="none" w:color="FFFFFF" w:sz="0"/>
-                    <w:left w:val="none" w:color="FFFFFF" w:sz="0"/>
-                    <w:bottom w:val="single" w:color="9AA6C4" w:sz="4"/>
-                    <w:right w:val="none" w:color="FFFFFF" w:sz="0"/>
-                  </w:tcBorders>
-                  <w:tcMar>
-                    <w:top w:type="dxa" w:w="0"/>
-                    <w:left w:type="dxa" w:w="0"/>
-                    <w:bottom w:type="dxa" w:w="0"/>
-                    <w:right w:type="dxa" w:w="0"/>
-                  </w:tcMar>
-                  <w:vAlign w:val="top"/>
-                </w:tcPr>
-                <w:p>
-                  <w:pPr>
-                    <w:spacing w:after="0" w:before="0"/>
-                  </w:pPr>
-                  <w:r>
-                    <w:rPr>
-                      <w:rFonts w:ascii="Calibri" w:cs="Calibri" w:eastAsia="Calibri" w:hAnsi="Calibri"/>
-                      <w:color w:val="000000"/>
-                      <w:sz w:val="22"/>
-                      <w:szCs w:val="22"/>
-                    </w:rPr>
-                    <w:t xml:space="preserve"/>
-                  </w:r>
-                </w:p>
-              </w:tc>
-            </w:tr>
-            <w:tr>
-              <w:trPr>
-                <w:cantSplit/>
-                <w:trHeight w:val="440" w:hRule="atLeast"/>
-              </w:trPr>
-              <w:tc>
-                <w:tcPr>
-                  <w:tcW w:type="dxa" w:w="4783"/>
-                  <w:tcBorders>
-                    <w:top w:val="none" w:color="FFFFFF" w:sz="0"/>
-                    <w:left w:val="none" w:color="FFFFFF" w:sz="0"/>
-                    <w:bottom w:val="single" w:color="9AA6C4" w:sz="4"/>
-                    <w:right w:val="none" w:color="FFFFFF" w:sz="0"/>
-                  </w:tcBorders>
-                  <w:tcMar>
-                    <w:top w:type="dxa" w:w="0"/>
-                    <w:left w:type="dxa" w:w="0"/>
-                    <w:bottom w:type="dxa" w:w="0"/>
-                    <w:right w:type="dxa" w:w="0"/>
-                  </w:tcMar>
-                  <w:vAlign w:val="top"/>
-                </w:tcPr>
-                <w:p>
-                  <w:pPr>
-                    <w:spacing w:after="0" w:before="0"/>
-                  </w:pPr>
-                  <w:r>
-                    <w:rPr>
-                      <w:rFonts w:ascii="Calibri" w:cs="Calibri" w:eastAsia="Calibri" w:hAnsi="Calibri"/>
-                      <w:color w:val="000000"/>
-                      <w:sz w:val="22"/>
-                      <w:szCs w:val="22"/>
-                    </w:rPr>
-                    <w:t xml:space="preserve"/>
-                  </w:r>
-                </w:p>
-              </w:tc>
-            </w:tr>
-          </w:tbl>
-          <w:p>
-            <w:pPr>
-              <w:spacing w:after="0" w:before="0"/>
-            </w:pPr>
-            <w:r>
-              <w:rPr>
-                <w:rFonts w:ascii="Calibri" w:cs="Calibri" w:eastAsia="Calibri" w:hAnsi="Calibri"/>
-                <w:color w:val="000000"/>
-                <w:sz w:val="22"/>
-                <w:szCs w:val="22"/>
-              </w:rPr>
-              <w:t xml:space="preserve"/>
-            </w:r>
-          </w:p>
-        </w:tc>
       </w:tr>
     </w:tbl>
     <w:p>
       <w:pPr>
         <w:keepNext/>
-        <w:spacing w:after="50" w:before="160"/>
+        <w:spacing w:after="40" w:before="100"/>
       </w:pPr>
       <w:r>
         <w:rPr>
@@ -2754,7 +3084,7 @@
     <w:p>
       <w:pPr>
         <w:keepNext/>
-        <w:spacing w:after="50" w:before="160"/>
+        <w:spacing w:after="40" w:before="100"/>
       </w:pPr>
       <w:r>
         <w:rPr>
@@ -2831,17 +3161,8 @@
     </w:p>
     <w:p>
       <w:pPr>
-        <w:spacing w:after="40" w:before="0"/>
-      </w:pPr>
-      <w:r>
-        <w:rPr>
-          <w:rFonts w:ascii="Calibri" w:cs="Calibri" w:eastAsia="Calibri" w:hAnsi="Calibri"/>
-          <w:color w:val="1E2761"/>
-          <w:sz w:val="21"/>
-          <w:szCs w:val="21"/>
-        </w:rPr>
-        <w:t xml:space="preserve">•  </w:t>
-      </w:r>
+        <w:spacing w:after="0" w:before="0" w:line="280"/>
+      </w:pPr>
       <w:r>
         <w:rPr>
           <w:rFonts w:ascii="Calibri" w:cs="Calibri" w:eastAsia="Calibri" w:hAnsi="Calibri"/>
@@ -2851,150 +3172,105 @@
           <w:sz w:val="20"/>
           <w:szCs w:val="20"/>
         </w:rPr>
-        <w:t xml:space="preserve">Anrede: </w:t>
-      </w:r>
-      <w:r>
-        <w:rPr>
-          <w:rFonts w:ascii="Calibri" w:cs="Calibri" w:eastAsia="Calibri" w:hAnsi="Calibri"/>
-          <w:color w:val="000000"/>
-          <w:sz w:val="20"/>
-          <w:szCs w:val="20"/>
-        </w:rPr>
-        <w:t xml:space="preserve">„Vater, …“</w:t>
-      </w:r>
-    </w:p>
-    <w:p>
-      <w:pPr>
-        <w:spacing w:after="40" w:before="0"/>
-      </w:pPr>
-      <w:r>
-        <w:rPr>
-          <w:rFonts w:ascii="Calibri" w:cs="Calibri" w:eastAsia="Calibri" w:hAnsi="Calibri"/>
-          <w:color w:val="1E2761"/>
-          <w:sz w:val="21"/>
-          <w:szCs w:val="21"/>
-        </w:rPr>
-        <w:t xml:space="preserve">•  </w:t>
+        <w:t xml:space="preserve">Kriterien: </w:t>
       </w:r>
       <w:r>
         <w:rPr>
           <w:rFonts w:ascii="Calibri" w:cs="Calibri" w:eastAsia="Calibri" w:hAnsi="Calibri"/>
           <w:b/>
           <w:bCs/>
+          <w:color w:val="1E2761"/>
+          <w:sz w:val="19"/>
+          <w:szCs w:val="19"/>
+        </w:rPr>
+        <w:t xml:space="preserve">Anrede: </w:t>
+      </w:r>
+      <w:r>
+        <w:rPr>
+          <w:rFonts w:ascii="Calibri" w:cs="Calibri" w:eastAsia="Calibri" w:hAnsi="Calibri"/>
           <w:color w:val="000000"/>
-          <w:sz w:val="20"/>
-          <w:szCs w:val="20"/>
-        </w:rPr>
-        <w:t xml:space="preserve">Ich-Botschaften: </w:t>
-      </w:r>
-      <w:r>
-        <w:rPr>
-          <w:rFonts w:ascii="Calibri" w:cs="Calibri" w:eastAsia="Calibri" w:hAnsi="Calibri"/>
-          <w:color w:val="000000"/>
-          <w:sz w:val="20"/>
-          <w:szCs w:val="20"/>
-        </w:rPr>
-        <w:t xml:space="preserve">mindestens zwei: Gefühl + Wirkung</w:t>
-      </w:r>
-    </w:p>
-    <w:p>
-      <w:pPr>
-        <w:spacing w:after="40" w:before="0"/>
-      </w:pPr>
-      <w:r>
-        <w:rPr>
-          <w:rFonts w:ascii="Calibri" w:cs="Calibri" w:eastAsia="Calibri" w:hAnsi="Calibri"/>
-          <w:color w:val="1E2761"/>
-          <w:sz w:val="21"/>
-          <w:szCs w:val="21"/>
-        </w:rPr>
-        <w:t xml:space="preserve">•  </w:t>
+          <w:sz w:val="19"/>
+          <w:szCs w:val="19"/>
+        </w:rPr>
+        <w:t xml:space="preserve">„Vater, …“</w:t>
       </w:r>
       <w:r>
         <w:rPr>
           <w:rFonts w:ascii="Calibri" w:cs="Calibri" w:eastAsia="Calibri" w:hAnsi="Calibri"/>
           <w:b/>
           <w:bCs/>
+          <w:color w:val="1E2761"/>
+          <w:sz w:val="19"/>
+          <w:szCs w:val="19"/>
+        </w:rPr>
+        <w:t xml:space="preserve">  ·  Ich-Botschaften: </w:t>
+      </w:r>
+      <w:r>
+        <w:rPr>
+          <w:rFonts w:ascii="Calibri" w:cs="Calibri" w:eastAsia="Calibri" w:hAnsi="Calibri"/>
           <w:color w:val="000000"/>
-          <w:sz w:val="20"/>
-          <w:szCs w:val="20"/>
-        </w:rPr>
-        <w:t xml:space="preserve">Offener Appell: </w:t>
-      </w:r>
-      <w:r>
-        <w:rPr>
-          <w:rFonts w:ascii="Calibri" w:cs="Calibri" w:eastAsia="Calibri" w:hAnsi="Calibri"/>
-          <w:color w:val="000000"/>
-          <w:sz w:val="20"/>
-          <w:szCs w:val="20"/>
-        </w:rPr>
-        <w:t xml:space="preserve">mindestens eine klare Bitte</w:t>
-      </w:r>
-    </w:p>
-    <w:p>
-      <w:pPr>
-        <w:spacing w:after="40" w:before="0"/>
-      </w:pPr>
-      <w:r>
-        <w:rPr>
-          <w:rFonts w:ascii="Calibri" w:cs="Calibri" w:eastAsia="Calibri" w:hAnsi="Calibri"/>
-          <w:color w:val="1E2761"/>
-          <w:sz w:val="21"/>
-          <w:szCs w:val="21"/>
-        </w:rPr>
-        <w:t xml:space="preserve">•  </w:t>
+          <w:sz w:val="19"/>
+          <w:szCs w:val="19"/>
+        </w:rPr>
+        <w:t xml:space="preserve">mindestens zwei: Gefühl + Wirkung</w:t>
       </w:r>
       <w:r>
         <w:rPr>
           <w:rFonts w:ascii="Calibri" w:cs="Calibri" w:eastAsia="Calibri" w:hAnsi="Calibri"/>
           <w:b/>
           <w:bCs/>
+          <w:color w:val="1E2761"/>
+          <w:sz w:val="19"/>
+          <w:szCs w:val="19"/>
+        </w:rPr>
+        <w:t xml:space="preserve">  ·  Offener Appell: </w:t>
+      </w:r>
+      <w:r>
+        <w:rPr>
+          <w:rFonts w:ascii="Calibri" w:cs="Calibri" w:eastAsia="Calibri" w:hAnsi="Calibri"/>
           <w:color w:val="000000"/>
-          <w:sz w:val="20"/>
-          <w:szCs w:val="20"/>
-        </w:rPr>
-        <w:t xml:space="preserve">Bezug zum Text: </w:t>
-      </w:r>
-      <w:r>
-        <w:rPr>
-          <w:rFonts w:ascii="Calibri" w:cs="Calibri" w:eastAsia="Calibri" w:hAnsi="Calibri"/>
-          <w:color w:val="000000"/>
-          <w:sz w:val="20"/>
-          <w:szCs w:val="20"/>
-        </w:rPr>
-        <w:t xml:space="preserve">Kafkas Wünsche: Wort, Hand, Blick</w:t>
-      </w:r>
-    </w:p>
-    <w:p>
-      <w:pPr>
-        <w:spacing w:after="40" w:before="0"/>
-      </w:pPr>
-      <w:r>
-        <w:rPr>
-          <w:rFonts w:ascii="Calibri" w:cs="Calibri" w:eastAsia="Calibri" w:hAnsi="Calibri"/>
-          <w:color w:val="1E2761"/>
-          <w:sz w:val="21"/>
-          <w:szCs w:val="21"/>
-        </w:rPr>
-        <w:t xml:space="preserve">•  </w:t>
+          <w:sz w:val="19"/>
+          <w:szCs w:val="19"/>
+        </w:rPr>
+        <w:t xml:space="preserve">mindestens eine klare Bitte</w:t>
       </w:r>
       <w:r>
         <w:rPr>
           <w:rFonts w:ascii="Calibri" w:cs="Calibri" w:eastAsia="Calibri" w:hAnsi="Calibri"/>
           <w:b/>
           <w:bCs/>
+          <w:color w:val="1E2761"/>
+          <w:sz w:val="19"/>
+          <w:szCs w:val="19"/>
+        </w:rPr>
+        <w:t xml:space="preserve">  ·  Bezug zum Text: </w:t>
+      </w:r>
+      <w:r>
+        <w:rPr>
+          <w:rFonts w:ascii="Calibri" w:cs="Calibri" w:eastAsia="Calibri" w:hAnsi="Calibri"/>
           <w:color w:val="000000"/>
-          <w:sz w:val="20"/>
-          <w:szCs w:val="20"/>
-        </w:rPr>
-        <w:t xml:space="preserve">Ton: </w:t>
+          <w:sz w:val="19"/>
+          <w:szCs w:val="19"/>
+        </w:rPr>
+        <w:t xml:space="preserve">Kafkas Wünsche: Wort, Hand, Blick</w:t>
+      </w:r>
+      <w:r>
+        <w:rPr>
+          <w:rFonts w:ascii="Calibri" w:cs="Calibri" w:eastAsia="Calibri" w:hAnsi="Calibri"/>
+          <w:b/>
+          <w:bCs/>
+          <w:color w:val="1E2761"/>
+          <w:sz w:val="19"/>
+          <w:szCs w:val="19"/>
+        </w:rPr>
+        <w:t xml:space="preserve">  ·  Ton: </w:t>
       </w:r>
       <w:r>
         <w:rPr>
           <w:rFonts w:ascii="Calibri" w:cs="Calibri" w:eastAsia="Calibri" w:hAnsi="Calibri"/>
           <w:color w:val="000000"/>
-          <w:sz w:val="20"/>
-          <w:szCs w:val="20"/>
+          <w:sz w:val="19"/>
+          <w:szCs w:val="19"/>
         </w:rPr>
         <w:t xml:space="preserve">ehrlich, mutig, respektvoll – keine Vorwürfe</w:t>
       </w:r>

</xml_diff>

<commit_message>
Kafka-Appell: Arbeitsblatt ohne Fußnoten und Schlusszitat, mehr Platz für Aufgabe 1
Co-Authored-By: Claude Opus 5.5 <noreply@anthropic.com>
Claude-Session: https://claude.ai/code/session_01Kzh1oWiqhC6W8oSNq8mKnj
</commit_message>
<xml_diff>
--- a/Deutsch_11/Kafka_Appell/Arbeitsblatt_Kafkas_Appell.docx
+++ b/Deutsch_11/Kafka_Appell/Arbeitsblatt_Kafkas_Appell.docx
@@ -143,7 +143,7 @@
           </w:p>
           <w:p>
             <w:pPr>
-              <w:spacing w:after="80" w:before="0" w:line="290"/>
+              <w:spacing w:after="0" w:before="0" w:line="290"/>
             </w:pPr>
             <w:r>
               <w:rPr>
@@ -152,37 +152,7 @@
                 <w:sz w:val="21"/>
                 <w:szCs w:val="21"/>
               </w:rPr>
-              <w:t xml:space="preserve">Franz Kafka (1883–1924) schrieb 1919 mit 36 Jahren einen über 100 Seiten langen Brief an seinen Vater Hermann, einen erfolgreichen, lauten und bestimmenden Kaufmann. Vor ihm fühlte sich der Sohn klein und verstummte oft. Kafka wollte mit dem Brief erreichen, dass sich die Beziehung bessert. Den Brief gab er seiner Mutter – sie reichte ihn nie weiter.</w:t>
-            </w:r>
-          </w:p>
-          <w:p>
-            <w:pPr>
-              <w:spacing w:after="10" w:before="0"/>
-            </w:pPr>
-            <w:r>
-              <w:rPr>
-                <w:rFonts w:ascii="Cambria" w:cs="Cambria" w:eastAsia="Cambria" w:hAnsi="Cambria"/>
-                <w:i/>
-                <w:iCs/>
-                <w:color w:val="000000"/>
-                <w:sz w:val="21"/>
-                <w:szCs w:val="21"/>
-              </w:rPr>
-              <w:t xml:space="preserve">„… daß es uns beide ein wenig beruhigen und Leben und Sterben leichter machen kann.“</w:t>
-            </w:r>
-          </w:p>
-          <w:p>
-            <w:pPr>
-              <w:spacing w:after="0" w:before="0"/>
-            </w:pPr>
-            <w:r>
-              <w:rPr>
-                <w:rFonts w:ascii="Calibri" w:cs="Calibri" w:eastAsia="Calibri" w:hAnsi="Calibri"/>
-                <w:color w:val="5B6B8C"/>
-                <w:sz w:val="18"/>
-                <w:szCs w:val="18"/>
-              </w:rPr>
-              <w:t xml:space="preserve">– Franz Kafka, letzter Satz des Briefs (S. 20)</w:t>
+              <w:t xml:space="preserve">Franz Kafka (1883–1924) schrieb 1919 mit 36 Jahren einen über 100 Seiten langen Brief an seinen Vater Hermann, einen erfolgreichen, lauten und bestimmenden Kaufmann. Vor ihm fühlte sich der Sohn klein und verstummte oft. Kafka wollte mit dem Brief erreichen, dass sich die Beziehung bessert.</w:t>
             </w:r>
           </w:p>
         </w:tc>
@@ -302,28 +272,7 @@
                 <w:sz w:val="24"/>
                 <w:szCs w:val="24"/>
               </w:rPr>
-              <w:t xml:space="preserve">Wobei ich Dich aber immerfort</w:t>
-            </w:r>
-            <w:r>
-              <w:rPr>
-                <w:rFonts w:ascii="Calibri" w:cs="Calibri" w:eastAsia="Calibri" w:hAnsi="Calibri"/>
-                <w:b/>
-                <w:bCs/>
-                <w:color w:val="3F7CC4"/>
-                <w:sz w:val="24"/>
-                <w:szCs w:val="24"/>
-                <w:vertAlign w:val="superscript"/>
-              </w:rPr>
-              <w:t xml:space="preserve">1</w:t>
-            </w:r>
-            <w:r>
-              <w:rPr>
-                <w:rFonts w:ascii="Cambria" w:cs="Cambria" w:eastAsia="Cambria" w:hAnsi="Cambria"/>
-                <w:color w:val="000000"/>
-                <w:sz w:val="24"/>
-                <w:szCs w:val="24"/>
-              </w:rPr>
-              <w:t xml:space="preserve"> bitte, nicht zu vergessen, daß ich</w:t>
+              <w:t xml:space="preserve">Wobei ich Dich aber immerfort bitte, nicht zu vergessen, daß ich</w:t>
             </w:r>
           </w:p>
         </w:tc>
@@ -393,28 +342,7 @@
                 <w:sz w:val="24"/>
                 <w:szCs w:val="24"/>
               </w:rPr>
-              <w:t xml:space="preserve">niemals im entferntesten an eine Schuld Deinerseits</w:t>
-            </w:r>
-            <w:r>
-              <w:rPr>
-                <w:rFonts w:ascii="Calibri" w:cs="Calibri" w:eastAsia="Calibri" w:hAnsi="Calibri"/>
-                <w:b/>
-                <w:bCs/>
-                <w:color w:val="3F7CC4"/>
-                <w:sz w:val="24"/>
-                <w:szCs w:val="24"/>
-                <w:vertAlign w:val="superscript"/>
-              </w:rPr>
-              <w:t xml:space="preserve">2</w:t>
-            </w:r>
-            <w:r>
-              <w:rPr>
-                <w:rFonts w:ascii="Cambria" w:cs="Cambria" w:eastAsia="Cambria" w:hAnsi="Cambria"/>
-                <w:color w:val="000000"/>
-                <w:sz w:val="24"/>
-                <w:szCs w:val="24"/>
-              </w:rPr>
-              <w:t xml:space="preserve"> glaube. Du</w:t>
+              <w:t xml:space="preserve">niemals im entferntesten an eine Schuld Deinerseits glaube. Du</w:t>
             </w:r>
           </w:p>
         </w:tc>
@@ -554,28 +482,7 @@
                 <w:sz w:val="24"/>
                 <w:szCs w:val="24"/>
               </w:rPr>
-              <w:t xml:space="preserve">es für eine besondere Bosheit</w:t>
-            </w:r>
-            <w:r>
-              <w:rPr>
-                <w:rFonts w:ascii="Calibri" w:cs="Calibri" w:eastAsia="Calibri" w:hAnsi="Calibri"/>
-                <w:b/>
-                <w:bCs/>
-                <w:color w:val="3F7CC4"/>
-                <w:sz w:val="24"/>
-                <w:szCs w:val="24"/>
-                <w:vertAlign w:val="superscript"/>
-              </w:rPr>
-              <w:t xml:space="preserve">3</w:t>
-            </w:r>
-            <w:r>
-              <w:rPr>
-                <w:rFonts w:ascii="Cambria" w:cs="Cambria" w:eastAsia="Cambria" w:hAnsi="Cambria"/>
-                <w:color w:val="000000"/>
-                <w:sz w:val="24"/>
-                <w:szCs w:val="24"/>
-              </w:rPr>
-              <w:t xml:space="preserve"> meinerseits zu halten, daß ich dieser</w:t>
+              <w:t xml:space="preserve">es für eine besondere Bosheit meinerseits zu halten, daß ich dieser</w:t>
             </w:r>
           </w:p>
         </w:tc>
@@ -645,28 +552,7 @@
                 <w:sz w:val="24"/>
                 <w:szCs w:val="24"/>
               </w:rPr>
-              <w:t xml:space="preserve">Wirkung erlegen</w:t>
-            </w:r>
-            <w:r>
-              <w:rPr>
-                <w:rFonts w:ascii="Calibri" w:cs="Calibri" w:eastAsia="Calibri" w:hAnsi="Calibri"/>
-                <w:b/>
-                <w:bCs/>
-                <w:color w:val="3F7CC4"/>
-                <w:sz w:val="24"/>
-                <w:szCs w:val="24"/>
-                <w:vertAlign w:val="superscript"/>
-              </w:rPr>
-              <w:t xml:space="preserve">4</w:t>
-            </w:r>
-            <w:r>
-              <w:rPr>
-                <w:rFonts w:ascii="Cambria" w:cs="Cambria" w:eastAsia="Cambria" w:hAnsi="Cambria"/>
-                <w:color w:val="000000"/>
-                <w:sz w:val="24"/>
-                <w:szCs w:val="24"/>
-              </w:rPr>
-              <w:t xml:space="preserve"> bin. […] ich kann nicht glauben, daß ein freundliches</w:t>
+              <w:t xml:space="preserve">Wirkung erlegen bin. […] ich kann nicht glauben, daß ein freundliches</w:t>
             </w:r>
           </w:p>
         </w:tc>
@@ -806,333 +692,7 @@
                 <w:sz w:val="24"/>
                 <w:szCs w:val="24"/>
               </w:rPr>
-              <w:t xml:space="preserve">hätten abfordern</w:t>
-            </w:r>
-            <w:r>
-              <w:rPr>
-                <w:rFonts w:ascii="Calibri" w:cs="Calibri" w:eastAsia="Calibri" w:hAnsi="Calibri"/>
-                <w:b/>
-                <w:bCs/>
-                <w:color w:val="3F7CC4"/>
-                <w:sz w:val="24"/>
-                <w:szCs w:val="24"/>
-                <w:vertAlign w:val="superscript"/>
-              </w:rPr>
-              <w:t xml:space="preserve">5</w:t>
-            </w:r>
-            <w:r>
-              <w:rPr>
-                <w:rFonts w:ascii="Cambria" w:cs="Cambria" w:eastAsia="Cambria" w:hAnsi="Cambria"/>
-                <w:color w:val="000000"/>
-                <w:sz w:val="24"/>
-                <w:szCs w:val="24"/>
-              </w:rPr>
-              <w:t xml:space="preserve"> können, was man wollte.</w:t>
-            </w:r>
-          </w:p>
-        </w:tc>
-      </w:tr>
-      <w:tr>
-        <w:trPr>
-          <w:cantSplit/>
-        </w:trPr>
-        <w:tc>
-          <w:tcPr>
-            <w:tcW w:type="dxa" w:w="10206"/>
-            <w:gridSpan w:val="2"/>
-            <w:tcBorders>
-              <w:top w:val="single" w:color="D5DCEC" w:sz="6"/>
-              <w:left w:val="none" w:color="FFFFFF" w:sz="0"/>
-              <w:bottom w:val="none" w:color="FFFFFF" w:sz="0"/>
-              <w:right w:val="none" w:color="FFFFFF" w:sz="0"/>
-            </w:tcBorders>
-            <w:tcMar>
-              <w:top w:type="dxa" w:w="50"/>
-              <w:left w:type="dxa" w:w="140"/>
-              <w:bottom w:type="dxa" w:w="50"/>
-              <w:right w:type="dxa" w:w="140"/>
-            </w:tcMar>
-            <w:vAlign w:val="top"/>
-          </w:tcPr>
-          <w:p>
-            <w:pPr>
-              <w:spacing w:after="0" w:before="0"/>
-            </w:pPr>
-            <w:r>
-              <w:rPr>
-                <w:rFonts w:ascii="Calibri" w:cs="Calibri" w:eastAsia="Calibri" w:hAnsi="Calibri"/>
-                <w:b/>
-                <w:bCs/>
-                <w:color w:val="3F7CC4"/>
-                <w:sz w:val="19"/>
-                <w:szCs w:val="19"/>
-                <w:vertAlign w:val="superscript"/>
-              </w:rPr>
-              <w:t xml:space="preserve">1</w:t>
-            </w:r>
-            <w:r>
-              <w:rPr>
-                <w:rFonts w:ascii="Calibri" w:cs="Calibri" w:eastAsia="Calibri" w:hAnsi="Calibri"/>
-                <w:b/>
-                <w:bCs/>
-                <w:color w:val="3F7CC4"/>
-                <w:sz w:val="19"/>
-                <w:szCs w:val="19"/>
-              </w:rPr>
-              <w:t xml:space="preserve"> immerfort </w:t>
-            </w:r>
-            <w:r>
-              <w:rPr>
-                <w:rFonts w:ascii="Calibri" w:cs="Calibri" w:eastAsia="Calibri" w:hAnsi="Calibri"/>
-                <w:color w:val="5B6B8C"/>
-                <w:sz w:val="19"/>
-                <w:szCs w:val="19"/>
-              </w:rPr>
-              <w:t xml:space="preserve">= immer wieder, ständig</w:t>
-            </w:r>
-          </w:p>
-        </w:tc>
-      </w:tr>
-      <w:tr>
-        <w:trPr>
-          <w:cantSplit/>
-        </w:trPr>
-        <w:tc>
-          <w:tcPr>
-            <w:tcW w:type="dxa" w:w="10206"/>
-            <w:gridSpan w:val="2"/>
-            <w:tcBorders>
-              <w:top w:val="none" w:color="FFFFFF" w:sz="0"/>
-              <w:left w:val="none" w:color="FFFFFF" w:sz="0"/>
-              <w:bottom w:val="none" w:color="FFFFFF" w:sz="0"/>
-              <w:right w:val="none" w:color="FFFFFF" w:sz="0"/>
-            </w:tcBorders>
-            <w:tcMar>
-              <w:top w:type="dxa" w:w="0"/>
-              <w:left w:type="dxa" w:w="140"/>
-              <w:bottom w:type="dxa" w:w="0"/>
-              <w:right w:type="dxa" w:w="140"/>
-            </w:tcMar>
-            <w:vAlign w:val="top"/>
-          </w:tcPr>
-          <w:p>
-            <w:pPr>
-              <w:spacing w:after="0" w:before="0"/>
-            </w:pPr>
-            <w:r>
-              <w:rPr>
-                <w:rFonts w:ascii="Calibri" w:cs="Calibri" w:eastAsia="Calibri" w:hAnsi="Calibri"/>
-                <w:b/>
-                <w:bCs/>
-                <w:color w:val="3F7CC4"/>
-                <w:sz w:val="19"/>
-                <w:szCs w:val="19"/>
-                <w:vertAlign w:val="superscript"/>
-              </w:rPr>
-              <w:t xml:space="preserve">2</w:t>
-            </w:r>
-            <w:r>
-              <w:rPr>
-                <w:rFonts w:ascii="Calibri" w:cs="Calibri" w:eastAsia="Calibri" w:hAnsi="Calibri"/>
-                <w:b/>
-                <w:bCs/>
-                <w:color w:val="3F7CC4"/>
-                <w:sz w:val="19"/>
-                <w:szCs w:val="19"/>
-              </w:rPr>
-              <w:t xml:space="preserve"> Deinerseits </w:t>
-            </w:r>
-            <w:r>
-              <w:rPr>
-                <w:rFonts w:ascii="Calibri" w:cs="Calibri" w:eastAsia="Calibri" w:hAnsi="Calibri"/>
-                <w:color w:val="5B6B8C"/>
-                <w:sz w:val="19"/>
-                <w:szCs w:val="19"/>
-              </w:rPr>
-              <w:t xml:space="preserve">= von Deiner Seite</w:t>
-            </w:r>
-          </w:p>
-        </w:tc>
-      </w:tr>
-      <w:tr>
-        <w:trPr>
-          <w:cantSplit/>
-        </w:trPr>
-        <w:tc>
-          <w:tcPr>
-            <w:tcW w:type="dxa" w:w="10206"/>
-            <w:gridSpan w:val="2"/>
-            <w:tcBorders>
-              <w:top w:val="none" w:color="FFFFFF" w:sz="0"/>
-              <w:left w:val="none" w:color="FFFFFF" w:sz="0"/>
-              <w:bottom w:val="none" w:color="FFFFFF" w:sz="0"/>
-              <w:right w:val="none" w:color="FFFFFF" w:sz="0"/>
-            </w:tcBorders>
-            <w:tcMar>
-              <w:top w:type="dxa" w:w="0"/>
-              <w:left w:type="dxa" w:w="140"/>
-              <w:bottom w:type="dxa" w:w="0"/>
-              <w:right w:type="dxa" w:w="140"/>
-            </w:tcMar>
-            <w:vAlign w:val="top"/>
-          </w:tcPr>
-          <w:p>
-            <w:pPr>
-              <w:spacing w:after="0" w:before="0"/>
-            </w:pPr>
-            <w:r>
-              <w:rPr>
-                <w:rFonts w:ascii="Calibri" w:cs="Calibri" w:eastAsia="Calibri" w:hAnsi="Calibri"/>
-                <w:b/>
-                <w:bCs/>
-                <w:color w:val="3F7CC4"/>
-                <w:sz w:val="19"/>
-                <w:szCs w:val="19"/>
-                <w:vertAlign w:val="superscript"/>
-              </w:rPr>
-              <w:t xml:space="preserve">3</w:t>
-            </w:r>
-            <w:r>
-              <w:rPr>
-                <w:rFonts w:ascii="Calibri" w:cs="Calibri" w:eastAsia="Calibri" w:hAnsi="Calibri"/>
-                <w:b/>
-                <w:bCs/>
-                <w:color w:val="3F7CC4"/>
-                <w:sz w:val="19"/>
-                <w:szCs w:val="19"/>
-              </w:rPr>
-              <w:t xml:space="preserve"> Bosheit </w:t>
-            </w:r>
-            <w:r>
-              <w:rPr>
-                <w:rFonts w:ascii="Calibri" w:cs="Calibri" w:eastAsia="Calibri" w:hAnsi="Calibri"/>
-                <w:color w:val="5B6B8C"/>
-                <w:sz w:val="19"/>
-                <w:szCs w:val="19"/>
-              </w:rPr>
-              <w:t xml:space="preserve">= böse Absicht</w:t>
-            </w:r>
-          </w:p>
-        </w:tc>
-      </w:tr>
-      <w:tr>
-        <w:trPr>
-          <w:cantSplit/>
-        </w:trPr>
-        <w:tc>
-          <w:tcPr>
-            <w:tcW w:type="dxa" w:w="10206"/>
-            <w:gridSpan w:val="2"/>
-            <w:tcBorders>
-              <w:top w:val="none" w:color="FFFFFF" w:sz="0"/>
-              <w:left w:val="none" w:color="FFFFFF" w:sz="0"/>
-              <w:bottom w:val="none" w:color="FFFFFF" w:sz="0"/>
-              <w:right w:val="none" w:color="FFFFFF" w:sz="0"/>
-            </w:tcBorders>
-            <w:tcMar>
-              <w:top w:type="dxa" w:w="0"/>
-              <w:left w:type="dxa" w:w="140"/>
-              <w:bottom w:type="dxa" w:w="0"/>
-              <w:right w:type="dxa" w:w="140"/>
-            </w:tcMar>
-            <w:vAlign w:val="top"/>
-          </w:tcPr>
-          <w:p>
-            <w:pPr>
-              <w:spacing w:after="0" w:before="0"/>
-            </w:pPr>
-            <w:r>
-              <w:rPr>
-                <w:rFonts w:ascii="Calibri" w:cs="Calibri" w:eastAsia="Calibri" w:hAnsi="Calibri"/>
-                <w:b/>
-                <w:bCs/>
-                <w:color w:val="3F7CC4"/>
-                <w:sz w:val="19"/>
-                <w:szCs w:val="19"/>
-                <w:vertAlign w:val="superscript"/>
-              </w:rPr>
-              <w:t xml:space="preserve">4</w:t>
-            </w:r>
-            <w:r>
-              <w:rPr>
-                <w:rFonts w:ascii="Calibri" w:cs="Calibri" w:eastAsia="Calibri" w:hAnsi="Calibri"/>
-                <w:b/>
-                <w:bCs/>
-                <w:color w:val="3F7CC4"/>
-                <w:sz w:val="19"/>
-                <w:szCs w:val="19"/>
-              </w:rPr>
-              <w:t xml:space="preserve"> erlegen </w:t>
-            </w:r>
-            <w:r>
-              <w:rPr>
-                <w:rFonts w:ascii="Calibri" w:cs="Calibri" w:eastAsia="Calibri" w:hAnsi="Calibri"/>
-                <w:color w:val="5B6B8C"/>
-                <w:sz w:val="19"/>
-                <w:szCs w:val="19"/>
-              </w:rPr>
-              <w:t xml:space="preserve">= nicht widerstehen können</w:t>
-            </w:r>
-          </w:p>
-        </w:tc>
-      </w:tr>
-      <w:tr>
-        <w:trPr>
-          <w:cantSplit/>
-        </w:trPr>
-        <w:tc>
-          <w:tcPr>
-            <w:tcW w:type="dxa" w:w="10206"/>
-            <w:gridSpan w:val="2"/>
-            <w:tcBorders>
-              <w:top w:val="none" w:color="FFFFFF" w:sz="0"/>
-              <w:left w:val="none" w:color="FFFFFF" w:sz="0"/>
-              <w:bottom w:val="none" w:color="FFFFFF" w:sz="0"/>
-              <w:right w:val="none" w:color="FFFFFF" w:sz="0"/>
-            </w:tcBorders>
-            <w:tcMar>
-              <w:top w:type="dxa" w:w="0"/>
-              <w:left w:type="dxa" w:w="140"/>
-              <w:bottom w:type="dxa" w:w="0"/>
-              <w:right w:type="dxa" w:w="140"/>
-            </w:tcMar>
-            <w:vAlign w:val="top"/>
-          </w:tcPr>
-          <w:p>
-            <w:pPr>
-              <w:spacing w:after="0" w:before="0"/>
-            </w:pPr>
-            <w:r>
-              <w:rPr>
-                <w:rFonts w:ascii="Calibri" w:cs="Calibri" w:eastAsia="Calibri" w:hAnsi="Calibri"/>
-                <w:b/>
-                <w:bCs/>
-                <w:color w:val="3F7CC4"/>
-                <w:sz w:val="19"/>
-                <w:szCs w:val="19"/>
-                <w:vertAlign w:val="superscript"/>
-              </w:rPr>
-              <w:t xml:space="preserve">5</w:t>
-            </w:r>
-            <w:r>
-              <w:rPr>
-                <w:rFonts w:ascii="Calibri" w:cs="Calibri" w:eastAsia="Calibri" w:hAnsi="Calibri"/>
-                <w:b/>
-                <w:bCs/>
-                <w:color w:val="3F7CC4"/>
-                <w:sz w:val="19"/>
-                <w:szCs w:val="19"/>
-              </w:rPr>
-              <w:t xml:space="preserve"> abfordern </w:t>
-            </w:r>
-            <w:r>
-              <w:rPr>
-                <w:rFonts w:ascii="Calibri" w:cs="Calibri" w:eastAsia="Calibri" w:hAnsi="Calibri"/>
-                <w:color w:val="5B6B8C"/>
-                <w:sz w:val="19"/>
-                <w:szCs w:val="19"/>
-              </w:rPr>
-              <w:t xml:space="preserve">= abverlangen</w:t>
+              <w:t xml:space="preserve">hätten abfordern können, was man wollte.</w:t>
             </w:r>
           </w:p>
         </w:tc>
@@ -1435,6 +995,44 @@
       <w:tblGrid>
         <w:gridCol w:w="10206"/>
       </w:tblGrid>
+      <w:tr>
+        <w:trPr>
+          <w:cantSplit/>
+          <w:trHeight w:val="420" w:hRule="atLeast"/>
+        </w:trPr>
+        <w:tc>
+          <w:tcPr>
+            <w:tcW w:type="dxa" w:w="10206"/>
+            <w:tcBorders>
+              <w:top w:val="none" w:color="FFFFFF" w:sz="0"/>
+              <w:left w:val="none" w:color="FFFFFF" w:sz="0"/>
+              <w:bottom w:val="single" w:color="9AA6C4" w:sz="4"/>
+              <w:right w:val="none" w:color="FFFFFF" w:sz="0"/>
+            </w:tcBorders>
+            <w:tcMar>
+              <w:top w:type="dxa" w:w="0"/>
+              <w:left w:type="dxa" w:w="0"/>
+              <w:bottom w:type="dxa" w:w="0"/>
+              <w:right w:type="dxa" w:w="0"/>
+            </w:tcMar>
+            <w:vAlign w:val="top"/>
+          </w:tcPr>
+          <w:p>
+            <w:pPr>
+              <w:spacing w:after="0" w:before="0"/>
+            </w:pPr>
+            <w:r>
+              <w:rPr>
+                <w:rFonts w:ascii="Calibri" w:cs="Calibri" w:eastAsia="Calibri" w:hAnsi="Calibri"/>
+                <w:color w:val="000000"/>
+                <w:sz w:val="22"/>
+                <w:szCs w:val="22"/>
+              </w:rPr>
+              <w:t xml:space="preserve"/>
+            </w:r>
+          </w:p>
+        </w:tc>
+      </w:tr>
       <w:tr>
         <w:trPr>
           <w:cantSplit/>

</xml_diff>

<commit_message>
Kafka-Appell: Reflexionsfrage eindeutig formuliert (angenommen, der Vater hätte den Brief gelesen)
Co-Authored-By: Claude Opus 5.5 <noreply@anthropic.com>
Claude-Session: https://claude.ai/code/session_01Kzh1oWiqhC6W8oSNq8mKnj
</commit_message>
<xml_diff>
--- a/Deutsch_11/Kafka_Appell/Arbeitsblatt_Kafkas_Appell.docx
+++ b/Deutsch_11/Kafka_Appell/Arbeitsblatt_Kafkas_Appell.docx
@@ -2676,7 +2676,7 @@
           <w:sz w:val="21"/>
           <w:szCs w:val="21"/>
         </w:rPr>
-        <w:t xml:space="preserve">Kafka hat den Brief seinem Vater nie übergeben. Warum appelliert er so vorsichtig und versteckt? Hätte der Vater die Bitte verstanden?</w:t>
+        <w:t xml:space="preserve">Kafka hat den Brief nie übergeben. Warum appelliert er so vorsichtig und versteckt? Angenommen, der Vater hätte den Brief gelesen: Hätte er verstanden, worum Kafka ihn bittet? Begründe.</w:t>
       </w:r>
     </w:p>
     <w:p>
@@ -2759,7 +2759,7 @@
     </w:p>
     <w:p>
       <w:pPr>
-        <w:spacing w:after="0" w:before="0" w:line="280"/>
+        <w:spacing w:after="0" w:before="0"/>
       </w:pPr>
       <w:r>
         <w:rPr>
@@ -2775,102 +2775,11 @@
       <w:r>
         <w:rPr>
           <w:rFonts w:ascii="Calibri" w:cs="Calibri" w:eastAsia="Calibri" w:hAnsi="Calibri"/>
-          <w:b/>
-          <w:bCs/>
-          <w:color w:val="1E2761"/>
-          <w:sz w:val="19"/>
-          <w:szCs w:val="19"/>
-        </w:rPr>
-        <w:t xml:space="preserve">Anrede: </w:t>
-      </w:r>
-      <w:r>
-        <w:rPr>
-          <w:rFonts w:ascii="Calibri" w:cs="Calibri" w:eastAsia="Calibri" w:hAnsi="Calibri"/>
           <w:color w:val="000000"/>
-          <w:sz w:val="19"/>
-          <w:szCs w:val="19"/>
-        </w:rPr>
-        <w:t xml:space="preserve">„Vater, …“</w:t>
-      </w:r>
-      <w:r>
-        <w:rPr>
-          <w:rFonts w:ascii="Calibri" w:cs="Calibri" w:eastAsia="Calibri" w:hAnsi="Calibri"/>
-          <w:b/>
-          <w:bCs/>
-          <w:color w:val="1E2761"/>
-          <w:sz w:val="19"/>
-          <w:szCs w:val="19"/>
-        </w:rPr>
-        <w:t xml:space="preserve">  ·  Ich-Botschaften: </w:t>
-      </w:r>
-      <w:r>
-        <w:rPr>
-          <w:rFonts w:ascii="Calibri" w:cs="Calibri" w:eastAsia="Calibri" w:hAnsi="Calibri"/>
-          <w:color w:val="000000"/>
-          <w:sz w:val="19"/>
-          <w:szCs w:val="19"/>
-        </w:rPr>
-        <w:t xml:space="preserve">mindestens zwei: Gefühl + Wirkung</w:t>
-      </w:r>
-      <w:r>
-        <w:rPr>
-          <w:rFonts w:ascii="Calibri" w:cs="Calibri" w:eastAsia="Calibri" w:hAnsi="Calibri"/>
-          <w:b/>
-          <w:bCs/>
-          <w:color w:val="1E2761"/>
-          <w:sz w:val="19"/>
-          <w:szCs w:val="19"/>
-        </w:rPr>
-        <w:t xml:space="preserve">  ·  Offener Appell: </w:t>
-      </w:r>
-      <w:r>
-        <w:rPr>
-          <w:rFonts w:ascii="Calibri" w:cs="Calibri" w:eastAsia="Calibri" w:hAnsi="Calibri"/>
-          <w:color w:val="000000"/>
-          <w:sz w:val="19"/>
-          <w:szCs w:val="19"/>
-        </w:rPr>
-        <w:t xml:space="preserve">mindestens eine klare Bitte</w:t>
-      </w:r>
-      <w:r>
-        <w:rPr>
-          <w:rFonts w:ascii="Calibri" w:cs="Calibri" w:eastAsia="Calibri" w:hAnsi="Calibri"/>
-          <w:b/>
-          <w:bCs/>
-          <w:color w:val="1E2761"/>
-          <w:sz w:val="19"/>
-          <w:szCs w:val="19"/>
-        </w:rPr>
-        <w:t xml:space="preserve">  ·  Bezug zum Text: </w:t>
-      </w:r>
-      <w:r>
-        <w:rPr>
-          <w:rFonts w:ascii="Calibri" w:cs="Calibri" w:eastAsia="Calibri" w:hAnsi="Calibri"/>
-          <w:color w:val="000000"/>
-          <w:sz w:val="19"/>
-          <w:szCs w:val="19"/>
-        </w:rPr>
-        <w:t xml:space="preserve">Kafkas Wünsche: Wort, Hand, Blick</w:t>
-      </w:r>
-      <w:r>
-        <w:rPr>
-          <w:rFonts w:ascii="Calibri" w:cs="Calibri" w:eastAsia="Calibri" w:hAnsi="Calibri"/>
-          <w:b/>
-          <w:bCs/>
-          <w:color w:val="1E2761"/>
-          <w:sz w:val="19"/>
-          <w:szCs w:val="19"/>
-        </w:rPr>
-        <w:t xml:space="preserve">  ·  Ton: </w:t>
-      </w:r>
-      <w:r>
-        <w:rPr>
-          <w:rFonts w:ascii="Calibri" w:cs="Calibri" w:eastAsia="Calibri" w:hAnsi="Calibri"/>
-          <w:color w:val="000000"/>
-          <w:sz w:val="19"/>
-          <w:szCs w:val="19"/>
-        </w:rPr>
-        <w:t xml:space="preserve">ehrlich, mutig, respektvoll – keine Vorwürfe</w:t>
+          <w:sz w:val="20"/>
+          <w:szCs w:val="20"/>
+        </w:rPr>
+        <w:t xml:space="preserve">Anrede · zwei Ich-Botschaften · offener Appell · Bezug zum Text (Wort, Hand, Blick) · respektvoller Ton</w:t>
       </w:r>
     </w:p>
     <w:sectPr>

</xml_diff>